<commit_message>
before generalization f1 second attempt, fixed optimizer and dagger training improvement
</commit_message>
<xml_diff>
--- a/documentation/thesis notes.docx
+++ b/documentation/thesis notes.docx
@@ -4,17 +4,73 @@
   <w:body>
     <w:p>
       <w:r>
-        <w:t xml:space="preserve">The optimizer produces λ_i(t) = A(t)·cos(ξ(t)·t + φ_i) — a sinusoid in absolute time. </w:t>
-      </w:r>
-    </w:p>
-    <w:p>
-      <w:r>
-        <w:t xml:space="preserve">But the observation (load state + drone state) doesn't contain t, ξ, A, or the phase. </w:t>
-      </w:r>
-    </w:p>
-    <w:p>
-      <w:r>
-        <w:t>So in principle the same observed state at two different times wants two different λ's → regressing obs → λ could be ill-posed.</w:t>
+        <w:t xml:space="preserve">The optimizer produces </w:t>
+      </w:r>
+      <w:proofErr w:type="spellStart"/>
+      <w:r>
+        <w:t>λ_</w:t>
+      </w:r>
+      <w:proofErr w:type="gramStart"/>
+      <w:r>
+        <w:t>i</w:t>
+      </w:r>
+      <w:proofErr w:type="spellEnd"/>
+      <w:r>
+        <w:t>(</w:t>
+      </w:r>
+      <w:proofErr w:type="gramEnd"/>
+      <w:r>
+        <w:t>t) = A(t)·</w:t>
+      </w:r>
+      <w:proofErr w:type="spellStart"/>
+      <w:r>
+        <w:t>cos</w:t>
+      </w:r>
+      <w:proofErr w:type="spellEnd"/>
+      <w:r>
+        <w:t xml:space="preserve">(ξ(t)·t + </w:t>
+      </w:r>
+      <w:proofErr w:type="spellStart"/>
+      <w:r>
+        <w:t>φ_i</w:t>
+      </w:r>
+      <w:proofErr w:type="spellEnd"/>
+      <w:r>
+        <w:t xml:space="preserve">) — a sinusoid in absolute time. </w:t>
+      </w:r>
+    </w:p>
+    <w:p>
+      <w:r>
+        <w:t xml:space="preserve">But the observation (load state + drone state) doesn't contain t, ξ, </w:t>
+      </w:r>
+      <w:proofErr w:type="gramStart"/>
+      <w:r>
+        <w:t>A</w:t>
+      </w:r>
+      <w:proofErr w:type="gramEnd"/>
+      <w:r>
+        <w:t xml:space="preserve">, or the phase. </w:t>
+      </w:r>
+    </w:p>
+    <w:p>
+      <w:r>
+        <w:t xml:space="preserve">So in principle the same observed state at two different times wants two different </w:t>
+      </w:r>
+      <w:proofErr w:type="spellStart"/>
+      <w:r>
+        <w:t>λ's</w:t>
+      </w:r>
+      <w:proofErr w:type="spellEnd"/>
+      <w:r>
+        <w:t xml:space="preserve"> → regressing </w:t>
+      </w:r>
+      <w:proofErr w:type="spellStart"/>
+      <w:r>
+        <w:t>obs</w:t>
+      </w:r>
+      <w:proofErr w:type="spellEnd"/>
+      <w:r>
+        <w:t xml:space="preserve"> → λ could be ill-posed.</w:t>
       </w:r>
     </w:p>
     <w:p/>
@@ -24,8 +80,29 @@
       </w:r>
     </w:p>
     <w:p>
-      <w:r>
-        <w:t xml:space="preserve">so its own position+velocity encodes where it is in the cycle (the phase). If so, obs → λ is recoverable. </w:t>
+      <w:proofErr w:type="gramStart"/>
+      <w:r>
+        <w:t>so</w:t>
+      </w:r>
+      <w:proofErr w:type="gramEnd"/>
+      <w:r>
+        <w:t xml:space="preserve"> its own </w:t>
+      </w:r>
+      <w:proofErr w:type="spellStart"/>
+      <w:r>
+        <w:t>position+velocity</w:t>
+      </w:r>
+      <w:proofErr w:type="spellEnd"/>
+      <w:r>
+        <w:t xml:space="preserve"> encodes where it is in the cycle (the phase). If so, </w:t>
+      </w:r>
+      <w:proofErr w:type="spellStart"/>
+      <w:r>
+        <w:t>obs</w:t>
+      </w:r>
+      <w:proofErr w:type="spellEnd"/>
+      <w:r>
+        <w:t xml:space="preserve"> → λ is recoverable. </w:t>
       </w:r>
     </w:p>
     <w:p>
@@ -40,13 +117,26 @@
       </w:r>
     </w:p>
     <w:p>
-      <w:r>
-        <w:t xml:space="preserve">where you are on the orbit (position + velocity) is the phase. So the same motion can be produced by a law that says </w:t>
-      </w:r>
-    </w:p>
-    <w:p>
-      <w:r>
-        <w:t>"given where I am on my ellipse right now, here's the λ that continues it" — no clock required.</w:t>
+      <w:proofErr w:type="gramStart"/>
+      <w:r>
+        <w:t>where</w:t>
+      </w:r>
+      <w:proofErr w:type="gramEnd"/>
+      <w:r>
+        <w:t xml:space="preserve"> you are on the orbit (position + velocity) is the phase. So the same motion can be produced by a law that says </w:t>
+      </w:r>
+    </w:p>
+    <w:p>
+      <w:r>
+        <w:t>"</w:t>
+      </w:r>
+      <w:proofErr w:type="gramStart"/>
+      <w:r>
+        <w:t>given</w:t>
+      </w:r>
+      <w:proofErr w:type="gramEnd"/>
+      <w:r>
+        <w:t xml:space="preserve"> where I am on my ellipse right now, here's the λ that continues it" — no clock required.</w:t>
       </w:r>
     </w:p>
     <w:p/>
@@ -67,19 +157,42 @@
       </w:r>
     </w:p>
     <w:p>
-      <w:r>
-        <w:t xml:space="preserve">and that coordinate is in the observation. So the "external clock" isn't really external once you look at the plant state: </w:t>
-      </w:r>
-    </w:p>
-    <w:p>
-      <w:r>
-        <w:t>it's been integrated into an observable orbital position.</w:t>
-      </w:r>
-    </w:p>
-    <w:p/>
-    <w:p>
-      <w:r>
-        <w:t>can we feed a history of the drone state as the observation? instead of just the current state?</w:t>
+      <w:proofErr w:type="gramStart"/>
+      <w:r>
+        <w:t>and</w:t>
+      </w:r>
+      <w:proofErr w:type="gramEnd"/>
+      <w:r>
+        <w:t xml:space="preserve"> that coordinate is in the observation. So the "external clock" isn't really external once you look at the plant state: </w:t>
+      </w:r>
+    </w:p>
+    <w:p>
+      <w:proofErr w:type="gramStart"/>
+      <w:r>
+        <w:t>it's</w:t>
+      </w:r>
+      <w:proofErr w:type="gramEnd"/>
+      <w:r>
+        <w:t xml:space="preserve"> been integrated into an observable orbital position.</w:t>
+      </w:r>
+    </w:p>
+    <w:p/>
+    <w:p>
+      <w:proofErr w:type="gramStart"/>
+      <w:r>
+        <w:t>can</w:t>
+      </w:r>
+      <w:proofErr w:type="gramEnd"/>
+      <w:r>
+        <w:t xml:space="preserve"> we feed a history of the drone state as the observation? </w:t>
+      </w:r>
+      <w:proofErr w:type="gramStart"/>
+      <w:r>
+        <w:t>instead</w:t>
+      </w:r>
+      <w:proofErr w:type="gramEnd"/>
+      <w:r>
+        <w:t xml:space="preserve"> of just the current state?</w:t>
       </w:r>
     </w:p>
     <w:p/>
@@ -89,20 +202,35 @@
       </w:r>
     </w:p>
     <w:p>
-      <w:r>
-        <w:t xml:space="preserve">ignore the observation, always output the average λ. Its MSE is exactly the variance of λ, </w:t>
-      </w:r>
-    </w:p>
-    <w:p>
-      <w:r>
-        <w:t>which here is std² ≈ 0.95² ≈ 0.90.</w:t>
-      </w:r>
-    </w:p>
-    <w:p/>
-    <w:p>
+      <w:proofErr w:type="gramStart"/>
+      <w:r>
+        <w:t>ignore</w:t>
+      </w:r>
+      <w:proofErr w:type="gramEnd"/>
+      <w:r>
+        <w:t xml:space="preserve"> the observation, always output the average λ. Its MSE is exactly the variance of λ, </w:t>
+      </w:r>
+    </w:p>
+    <w:p>
+      <w:proofErr w:type="gramStart"/>
+      <w:r>
+        <w:t>which</w:t>
+      </w:r>
+      <w:proofErr w:type="gramEnd"/>
+      <w:r>
+        <w:t xml:space="preserve"> here is std² ≈ 0.95² ≈ 0.90.</w:t>
+      </w:r>
+    </w:p>
+    <w:p/>
+    <w:p>
+      <w:proofErr w:type="gramStart"/>
       <w:r>
         <w:lastRenderedPageBreak/>
-        <w:t>line 2226 in chat transcript</w:t>
+        <w:t>line</w:t>
+      </w:r>
+      <w:proofErr w:type="gramEnd"/>
+      <w:r>
+        <w:t xml:space="preserve"> 2226 in chat transcript</w:t>
       </w:r>
     </w:p>
     <w:p/>
@@ -114,22 +242,80 @@
     </w:p>
     <w:p>
       <w:r>
-        <w:t xml:space="preserve"> so a naive rollout collects only deep-in-the-buzz garbage states, not the "slightly off the orbit, </w:t>
-      </w:r>
-    </w:p>
-    <w:p>
-      <w:r>
-        <w:t>needs to recover" states that actually teach recovery. Standard fix: act with λ = β·λ_expert + (1−β)·λ_policy,</w:t>
-      </w:r>
-    </w:p>
-    <w:p>
-      <w:r>
-        <w:t xml:space="preserve"> β starting near 1 and decaying each iteration. Normally mixing controllers is risky, </w:t>
-      </w:r>
-    </w:p>
-    <w:p>
-      <w:r>
-        <w:t xml:space="preserve">but G·N=0 makes it risk-free here — both λs only touch the nullspace, so any blend leaves the load tracking untouched. </w:t>
+        <w:t xml:space="preserve"> </w:t>
+      </w:r>
+      <w:proofErr w:type="gramStart"/>
+      <w:r>
+        <w:t>so</w:t>
+      </w:r>
+      <w:proofErr w:type="gramEnd"/>
+      <w:r>
+        <w:t xml:space="preserve"> a naive rollout collects only deep-in-the-buzz garbage states, not the "slightly off the orbit, </w:t>
+      </w:r>
+    </w:p>
+    <w:p>
+      <w:proofErr w:type="gramStart"/>
+      <w:r>
+        <w:t>needs</w:t>
+      </w:r>
+      <w:proofErr w:type="gramEnd"/>
+      <w:r>
+        <w:t xml:space="preserve"> to recover" states that actually teach recovery. Standard fix: act with λ = β·</w:t>
+      </w:r>
+      <w:proofErr w:type="spellStart"/>
+      <w:r>
+        <w:t>λ_expert</w:t>
+      </w:r>
+      <w:proofErr w:type="spellEnd"/>
+      <w:r>
+        <w:t xml:space="preserve"> + (1−β</w:t>
+      </w:r>
+      <w:proofErr w:type="gramStart"/>
+      <w:r>
+        <w:t>)·</w:t>
+      </w:r>
+      <w:proofErr w:type="spellStart"/>
+      <w:proofErr w:type="gramEnd"/>
+      <w:r>
+        <w:t>λ_policy</w:t>
+      </w:r>
+      <w:proofErr w:type="spellEnd"/>
+      <w:r>
+        <w:t>,</w:t>
+      </w:r>
+    </w:p>
+    <w:p>
+      <w:r>
+        <w:t xml:space="preserve"> </w:t>
+      </w:r>
+      <w:proofErr w:type="gramStart"/>
+      <w:r>
+        <w:t>β</w:t>
+      </w:r>
+      <w:proofErr w:type="gramEnd"/>
+      <w:r>
+        <w:t xml:space="preserve"> starting near 1 and decaying each iteration. Normally mixing controllers is risky, </w:t>
+      </w:r>
+    </w:p>
+    <w:p>
+      <w:r>
+        <w:t xml:space="preserve">but G·N=0 makes it risk-free here — both </w:t>
+      </w:r>
+      <w:proofErr w:type="spellStart"/>
+      <w:r>
+        <w:t>λs</w:t>
+      </w:r>
+      <w:proofErr w:type="spellEnd"/>
+      <w:r>
+        <w:t xml:space="preserve"> only touch the </w:t>
+      </w:r>
+      <w:proofErr w:type="spellStart"/>
+      <w:r>
+        <w:t>nullspace</w:t>
+      </w:r>
+      <w:proofErr w:type="spellEnd"/>
+      <w:r>
+        <w:t xml:space="preserve">, so any blend leaves the load tracking untouched. </w:t>
       </w:r>
     </w:p>
     <w:p>
@@ -144,33 +330,114 @@
       </w:r>
     </w:p>
     <w:p>
-      <w:r>
-        <w:t xml:space="preserve">its λ = A·cos(ξt + φ) is driven by the clock, not by drone position. It's phase-feedforward — </w:t>
-      </w:r>
-    </w:p>
-    <w:p>
-      <w:r>
-        <w:t xml:space="preserve">it literally can't drift because time can't drift. The policy replaced the clock with position-inference, </w:t>
-      </w:r>
-    </w:p>
-    <w:p>
-      <w:r>
-        <w:t>i.e. phase-feedback, and that's the unstable path. Now, when DAgger queries the expert at an off-orbit state at time t,</w:t>
-      </w:r>
-    </w:p>
-    <w:p>
-      <w:r>
-        <w:t xml:space="preserve"> the label it returns is the clock value λ(t) — which may not be a consistent function of the observed position off-orbit</w:t>
-      </w:r>
-    </w:p>
-    <w:p>
-      <w:r>
-        <w:t>(same-ish position, different time → different label). If phase genuinely isn't recoverable from the off-orbit observation,</w:t>
-      </w:r>
-    </w:p>
-    <w:p>
-      <w:r>
-        <w:t xml:space="preserve"> DAgger's regression floor is Var(λ) and it won't fully converge. It might still improve a lot;</w:t>
+      <w:proofErr w:type="gramStart"/>
+      <w:r>
+        <w:t>its</w:t>
+      </w:r>
+      <w:proofErr w:type="gramEnd"/>
+      <w:r>
+        <w:t xml:space="preserve"> λ = </w:t>
+      </w:r>
+      <w:proofErr w:type="spellStart"/>
+      <w:r>
+        <w:t>A·cos</w:t>
+      </w:r>
+      <w:proofErr w:type="spellEnd"/>
+      <w:r>
+        <w:t>(</w:t>
+      </w:r>
+      <w:proofErr w:type="spellStart"/>
+      <w:r>
+        <w:t>ξt</w:t>
+      </w:r>
+      <w:proofErr w:type="spellEnd"/>
+      <w:r>
+        <w:t xml:space="preserve"> + φ) is driven by the clock, not by drone position. It's phase-</w:t>
+      </w:r>
+      <w:proofErr w:type="spellStart"/>
+      <w:r>
+        <w:t>feedforward</w:t>
+      </w:r>
+      <w:proofErr w:type="spellEnd"/>
+      <w:r>
+        <w:t xml:space="preserve"> — </w:t>
+      </w:r>
+    </w:p>
+    <w:p>
+      <w:proofErr w:type="gramStart"/>
+      <w:r>
+        <w:t>it</w:t>
+      </w:r>
+      <w:proofErr w:type="gramEnd"/>
+      <w:r>
+        <w:t xml:space="preserve"> literally can't drift because time can't drift. The policy replaced the clock with position-inference, </w:t>
+      </w:r>
+    </w:p>
+    <w:p>
+      <w:proofErr w:type="gramStart"/>
+      <w:r>
+        <w:t>i.e</w:t>
+      </w:r>
+      <w:proofErr w:type="gramEnd"/>
+      <w:r>
+        <w:t>. phase-feedback, and that's the unstable path. Now, when DAgger queries the expert at an off-orbit state at time t,</w:t>
+      </w:r>
+    </w:p>
+    <w:p>
+      <w:r>
+        <w:t xml:space="preserve"> </w:t>
+      </w:r>
+      <w:proofErr w:type="gramStart"/>
+      <w:r>
+        <w:t>the</w:t>
+      </w:r>
+      <w:proofErr w:type="gramEnd"/>
+      <w:r>
+        <w:t xml:space="preserve"> label it returns is the clock value λ(t) — which may not be a consistent function of the observed position off-orbit</w:t>
+      </w:r>
+    </w:p>
+    <w:p>
+      <w:r>
+        <w:t>(</w:t>
+      </w:r>
+      <w:proofErr w:type="gramStart"/>
+      <w:r>
+        <w:t>same-</w:t>
+      </w:r>
+      <w:proofErr w:type="spellStart"/>
+      <w:r>
+        <w:t>ish</w:t>
+      </w:r>
+      <w:proofErr w:type="spellEnd"/>
+      <w:proofErr w:type="gramEnd"/>
+      <w:r>
+        <w:t xml:space="preserve"> position, different time → different label). If phase genuinely isn't recoverable from the off-orbit observation,</w:t>
+      </w:r>
+    </w:p>
+    <w:p>
+      <w:r>
+        <w:t xml:space="preserve"> </w:t>
+      </w:r>
+      <w:proofErr w:type="spellStart"/>
+      <w:r>
+        <w:t>DAgger's</w:t>
+      </w:r>
+      <w:proofErr w:type="spellEnd"/>
+      <w:r>
+        <w:t xml:space="preserve"> regression floor is </w:t>
+      </w:r>
+      <w:proofErr w:type="spellStart"/>
+      <w:proofErr w:type="gramStart"/>
+      <w:r>
+        <w:t>Var</w:t>
+      </w:r>
+      <w:proofErr w:type="spellEnd"/>
+      <w:r>
+        <w:t>(</w:t>
+      </w:r>
+      <w:proofErr w:type="gramEnd"/>
+      <w:r>
+        <w:t>λ) and it won't fully converge. It might still improve a lot;</w:t>
       </w:r>
     </w:p>
     <w:p>
@@ -183,55 +450,178 @@
     <w:p/>
     <w:p>
       <w:r>
-        <w:t xml:space="preserve">- if the network learnt to mimic optimizer, which part exactly? can it only get its inputs. it was only trained to produce </w:t>
-      </w:r>
-    </w:p>
-    <w:p>
-      <w:r>
-        <w:t>one lambda from its observations, not all of them, but they are homogenous, but it doesn't matter because it just outputs</w:t>
-      </w:r>
-    </w:p>
-    <w:p>
-      <w:r>
-        <w:t xml:space="preserve"> its own lambda. </w:t>
+        <w:t xml:space="preserve">- </w:t>
+      </w:r>
+      <w:proofErr w:type="gramStart"/>
+      <w:r>
+        <w:t>if</w:t>
+      </w:r>
+      <w:proofErr w:type="gramEnd"/>
+      <w:r>
+        <w:t xml:space="preserve"> the network learnt to mimic optimizer, which part exactly? </w:t>
+      </w:r>
+      <w:proofErr w:type="gramStart"/>
+      <w:r>
+        <w:t>can</w:t>
+      </w:r>
+      <w:proofErr w:type="gramEnd"/>
+      <w:r>
+        <w:t xml:space="preserve"> it only get its inputs. </w:t>
+      </w:r>
+      <w:proofErr w:type="gramStart"/>
+      <w:r>
+        <w:t>it</w:t>
+      </w:r>
+      <w:proofErr w:type="gramEnd"/>
+      <w:r>
+        <w:t xml:space="preserve"> was only trained to produce </w:t>
+      </w:r>
+    </w:p>
+    <w:p>
+      <w:proofErr w:type="gramStart"/>
+      <w:r>
+        <w:t>one</w:t>
+      </w:r>
+      <w:proofErr w:type="gramEnd"/>
+      <w:r>
+        <w:t xml:space="preserve"> lambda from its observations, not all of them, but they are homogenous, but it doesn't matter because it just outputs</w:t>
+      </w:r>
+    </w:p>
+    <w:p>
+      <w:r>
+        <w:t xml:space="preserve"> </w:t>
+      </w:r>
+      <w:proofErr w:type="gramStart"/>
+      <w:r>
+        <w:t>its</w:t>
+      </w:r>
+      <w:proofErr w:type="gramEnd"/>
+      <w:r>
+        <w:t xml:space="preserve"> own lambda. </w:t>
       </w:r>
     </w:p>
     <w:p>
       <w:r>
         <w:lastRenderedPageBreak/>
-        <w:t xml:space="preserve">&gt;&gt;&gt;&gt;  the network was trained to only produce its own lambda, but it should train to produce the whole vector, </w:t>
-      </w:r>
-    </w:p>
-    <w:p>
-      <w:r>
-        <w:t>that's what the optimizer does with just the load state, attachment points, and phases , we should be able to do the same</w:t>
-      </w:r>
-    </w:p>
-    <w:p/>
-    <w:p/>
-    <w:p>
-      <w:r>
-        <w:t xml:space="preserve">- problem: residual rl changes the force, changes the drone state, estimate no longer valid, so f1 part will get messed up </w:t>
-      </w:r>
-    </w:p>
-    <w:p>
-      <w:r>
-        <w:t>and f2 will have to learn to fix it as well. i mean that's also the what would've happened to the  classical controller and</w:t>
-      </w:r>
-    </w:p>
-    <w:p>
-      <w:r>
-        <w:t xml:space="preserve"> optimizer because the q they rely on to calculate prdot would be wrong, making the optimizer kinda obselete because it </w:t>
-      </w:r>
-    </w:p>
-    <w:p>
-      <w:r>
-        <w:t xml:space="preserve">doesn't even see its own correct velocity , i think the reward function will have to change to account for this, </w:t>
-      </w:r>
-    </w:p>
-    <w:p>
-      <w:r>
-        <w:t xml:space="preserve">because not just the load tracking will fail, also the loitering </w:t>
+        <w:t>&gt;&gt;&gt;</w:t>
+      </w:r>
+      <w:proofErr w:type="gramStart"/>
+      <w:r>
+        <w:t>&gt;  the</w:t>
+      </w:r>
+      <w:proofErr w:type="gramEnd"/>
+      <w:r>
+        <w:t xml:space="preserve"> network was trained to only produce its own lambda, but it should train to produce the whole vector, </w:t>
+      </w:r>
+    </w:p>
+    <w:p>
+      <w:proofErr w:type="gramStart"/>
+      <w:r>
+        <w:t>that's</w:t>
+      </w:r>
+      <w:proofErr w:type="gramEnd"/>
+      <w:r>
+        <w:t xml:space="preserve"> what the optimizer does with just the load state, attachment points, and phases , we should be able to do the same</w:t>
+      </w:r>
+    </w:p>
+    <w:p/>
+    <w:p/>
+    <w:p>
+      <w:r>
+        <w:t xml:space="preserve">- problem: residual </w:t>
+      </w:r>
+      <w:proofErr w:type="spellStart"/>
+      <w:r>
+        <w:t>rl</w:t>
+      </w:r>
+      <w:proofErr w:type="spellEnd"/>
+      <w:r>
+        <w:t xml:space="preserve"> changes the force, changes the drone state, estimate no longer valid, so f1 part will get messed up </w:t>
+      </w:r>
+    </w:p>
+    <w:p>
+      <w:proofErr w:type="gramStart"/>
+      <w:r>
+        <w:t>and</w:t>
+      </w:r>
+      <w:proofErr w:type="gramEnd"/>
+      <w:r>
+        <w:t xml:space="preserve"> f2 will have to learn to fix it as well. </w:t>
+      </w:r>
+      <w:proofErr w:type="spellStart"/>
+      <w:proofErr w:type="gramStart"/>
+      <w:r>
+        <w:t>i</w:t>
+      </w:r>
+      <w:proofErr w:type="spellEnd"/>
+      <w:proofErr w:type="gramEnd"/>
+      <w:r>
+        <w:t xml:space="preserve"> mean that's also the what would've happened to the  classical controller and</w:t>
+      </w:r>
+    </w:p>
+    <w:p>
+      <w:r>
+        <w:t xml:space="preserve"> </w:t>
+      </w:r>
+      <w:proofErr w:type="gramStart"/>
+      <w:r>
+        <w:t>optimizer</w:t>
+      </w:r>
+      <w:proofErr w:type="gramEnd"/>
+      <w:r>
+        <w:t xml:space="preserve"> because the q they rely on to calculate </w:t>
+      </w:r>
+      <w:proofErr w:type="spellStart"/>
+      <w:r>
+        <w:t>prdot</w:t>
+      </w:r>
+      <w:proofErr w:type="spellEnd"/>
+      <w:r>
+        <w:t xml:space="preserve"> would be wrong, making the optimizer </w:t>
+      </w:r>
+      <w:proofErr w:type="spellStart"/>
+      <w:r>
+        <w:t>kinda</w:t>
+      </w:r>
+      <w:proofErr w:type="spellEnd"/>
+      <w:r>
+        <w:t xml:space="preserve"> </w:t>
+      </w:r>
+      <w:proofErr w:type="spellStart"/>
+      <w:r>
+        <w:t>obselete</w:t>
+      </w:r>
+      <w:proofErr w:type="spellEnd"/>
+      <w:r>
+        <w:t xml:space="preserve"> because it </w:t>
+      </w:r>
+    </w:p>
+    <w:p>
+      <w:proofErr w:type="gramStart"/>
+      <w:r>
+        <w:t>doesn't</w:t>
+      </w:r>
+      <w:proofErr w:type="gramEnd"/>
+      <w:r>
+        <w:t xml:space="preserve"> even see its own correct velocity , </w:t>
+      </w:r>
+      <w:proofErr w:type="spellStart"/>
+      <w:r>
+        <w:t>i</w:t>
+      </w:r>
+      <w:proofErr w:type="spellEnd"/>
+      <w:r>
+        <w:t xml:space="preserve"> think the reward function will have to change to account for this, </w:t>
+      </w:r>
+    </w:p>
+    <w:p>
+      <w:proofErr w:type="gramStart"/>
+      <w:r>
+        <w:t>because</w:t>
+      </w:r>
+      <w:proofErr w:type="gramEnd"/>
+      <w:r>
+        <w:t xml:space="preserve"> not just the load tracking will fail, also the loitering </w:t>
       </w:r>
     </w:p>
     <w:p>
@@ -242,42 +632,128 @@
     <w:p/>
     <w:p>
       <w:r>
-        <w:t>-so i'm convinced this is recoverable from the kinematics alone because this is what the optimizer does, it does not look</w:t>
-      </w:r>
-    </w:p>
-    <w:p>
-      <w:r>
-        <w:t>at the drone measurements from the fmu, it just recalculates it, and therefore its lambda comes from the same guess and</w:t>
-      </w:r>
-    </w:p>
-    <w:p>
-      <w:r>
-        <w:t>the same propagation of q(kinda), the only thing the optimizer takes from the fmu is the load state, actually by looking</w:t>
-      </w:r>
-    </w:p>
-    <w:p>
-      <w:r>
-        <w:t xml:space="preserve"> at the optimizer, the force it uses is even wrong because it doesn't go throught the filter, and yet it doesn't diverge. </w:t>
-      </w:r>
-    </w:p>
-    <w:p>
-      <w:r>
-        <w:t xml:space="preserve">in fact, by looking at the optimizer it uses a lot of math to determine lambda and lambda , recalculates everything </w:t>
-      </w:r>
-    </w:p>
-    <w:p>
-      <w:r>
-        <w:t xml:space="preserve">analytically unlike what we did when we take f and fdot directly </w:t>
-      </w:r>
-    </w:p>
-    <w:p>
-      <w:r>
-        <w:t>also you're saying at the reconstruct function explanation that this is what blows up, and it's also what's different</w:t>
-      </w:r>
-    </w:p>
-    <w:p>
-      <w:r>
-        <w:t>so maybe it's worth to look at it more closely</w:t>
+        <w:t xml:space="preserve">-so </w:t>
+      </w:r>
+      <w:proofErr w:type="spellStart"/>
+      <w:r>
+        <w:t>i'm</w:t>
+      </w:r>
+      <w:proofErr w:type="spellEnd"/>
+      <w:r>
+        <w:t xml:space="preserve"> convinced this is recoverable from the kinematics alone because this is what the optimizer does, it does not look</w:t>
+      </w:r>
+    </w:p>
+    <w:p>
+      <w:proofErr w:type="gramStart"/>
+      <w:r>
+        <w:t>at</w:t>
+      </w:r>
+      <w:proofErr w:type="gramEnd"/>
+      <w:r>
+        <w:t xml:space="preserve"> the drone measurements from the </w:t>
+      </w:r>
+      <w:proofErr w:type="spellStart"/>
+      <w:r>
+        <w:t>fmu</w:t>
+      </w:r>
+      <w:proofErr w:type="spellEnd"/>
+      <w:r>
+        <w:t>, it just recalculates it, and therefore its lambda comes from the same guess and</w:t>
+      </w:r>
+    </w:p>
+    <w:p>
+      <w:proofErr w:type="gramStart"/>
+      <w:r>
+        <w:t>the</w:t>
+      </w:r>
+      <w:proofErr w:type="gramEnd"/>
+      <w:r>
+        <w:t xml:space="preserve"> same propagation of q(</w:t>
+      </w:r>
+      <w:proofErr w:type="spellStart"/>
+      <w:r>
+        <w:t>kinda</w:t>
+      </w:r>
+      <w:proofErr w:type="spellEnd"/>
+      <w:r>
+        <w:t xml:space="preserve">), the only thing the optimizer takes from the </w:t>
+      </w:r>
+      <w:proofErr w:type="spellStart"/>
+      <w:r>
+        <w:t>fmu</w:t>
+      </w:r>
+      <w:proofErr w:type="spellEnd"/>
+      <w:r>
+        <w:t xml:space="preserve"> is the load state, actually by looking</w:t>
+      </w:r>
+    </w:p>
+    <w:p>
+      <w:r>
+        <w:t xml:space="preserve"> </w:t>
+      </w:r>
+      <w:proofErr w:type="gramStart"/>
+      <w:r>
+        <w:t>at</w:t>
+      </w:r>
+      <w:proofErr w:type="gramEnd"/>
+      <w:r>
+        <w:t xml:space="preserve"> the optimizer, the force it uses is even wrong because it doesn't go </w:t>
+      </w:r>
+      <w:proofErr w:type="spellStart"/>
+      <w:r>
+        <w:t>throught</w:t>
+      </w:r>
+      <w:proofErr w:type="spellEnd"/>
+      <w:r>
+        <w:t xml:space="preserve"> the filter, and yet it doesn't diverge. </w:t>
+      </w:r>
+    </w:p>
+    <w:p>
+      <w:proofErr w:type="gramStart"/>
+      <w:r>
+        <w:t>in</w:t>
+      </w:r>
+      <w:proofErr w:type="gramEnd"/>
+      <w:r>
+        <w:t xml:space="preserve"> fact, by looking at the optimizer it uses a lot of math to determine lambda and lambda , recalculates everything </w:t>
+      </w:r>
+    </w:p>
+    <w:p>
+      <w:proofErr w:type="gramStart"/>
+      <w:r>
+        <w:t>analytically</w:t>
+      </w:r>
+      <w:proofErr w:type="gramEnd"/>
+      <w:r>
+        <w:t xml:space="preserve"> unlike what we did when we take f and </w:t>
+      </w:r>
+      <w:proofErr w:type="spellStart"/>
+      <w:r>
+        <w:t>fdot</w:t>
+      </w:r>
+      <w:proofErr w:type="spellEnd"/>
+      <w:r>
+        <w:t xml:space="preserve"> directly </w:t>
+      </w:r>
+    </w:p>
+    <w:p>
+      <w:proofErr w:type="gramStart"/>
+      <w:r>
+        <w:t>also</w:t>
+      </w:r>
+      <w:proofErr w:type="gramEnd"/>
+      <w:r>
+        <w:t xml:space="preserve"> you're saying at the reconstruct function explanation that this is what blows up, and it's also what's different</w:t>
+      </w:r>
+    </w:p>
+    <w:p>
+      <w:proofErr w:type="gramStart"/>
+      <w:r>
+        <w:t>so</w:t>
+      </w:r>
+      <w:proofErr w:type="gramEnd"/>
+      <w:r>
+        <w:t xml:space="preserve"> maybe it's worth to look at it more closely</w:t>
       </w:r>
     </w:p>
     <w:p/>
@@ -285,47 +761,178 @@
     <w:p>
       <w:r>
         <w:lastRenderedPageBreak/>
-        <w:t xml:space="preserve">- learn the error from myself? the difference should only be the low level controller , in my model i just have a unit </w:t>
-      </w:r>
-    </w:p>
-    <w:p>
-      <w:r>
-        <w:t>delay , but i don't want to hardcode this into the code because irl it will be different</w:t>
-      </w:r>
-    </w:p>
-    <w:p>
-      <w:r>
-        <w:t>-where does the 1 cm error come from? probably the unit delay</w:t>
-      </w:r>
-    </w:p>
-    <w:p>
-      <w:r>
-        <w:t xml:space="preserve">-i want to see matrix N </w:t>
-      </w:r>
-    </w:p>
-    <w:p>
-      <w:r>
-        <w:t xml:space="preserve">- The belief filter still computes all n forces; the own slot's belief just goes unused now (harmless). why? </w:t>
-      </w:r>
-    </w:p>
-    <w:p>
-      <w:r>
-        <w:t xml:space="preserve">i thought the lambdas are the beliefs? but my lambda is known for certain because i know my position and vel ? </w:t>
-      </w:r>
-    </w:p>
-    <w:p>
-      <w:r>
-        <w:t xml:space="preserve">the force is then calculated and it the applied force, my segment of the vector at least, and the other part of the </w:t>
-      </w:r>
-    </w:p>
-    <w:p>
-      <w:r>
-        <w:t xml:space="preserve">vector for the other drone force is not needed, also i don't even see in the code where does this happen, what happens in </w:t>
-      </w:r>
-    </w:p>
-    <w:p>
-      <w:r>
-        <w:t>the code is i estimate all the positions and velocities but i throw away my belief about my state, not the force</w:t>
+        <w:t xml:space="preserve">- learn the error from myself? </w:t>
+      </w:r>
+      <w:proofErr w:type="gramStart"/>
+      <w:r>
+        <w:t>the</w:t>
+      </w:r>
+      <w:proofErr w:type="gramEnd"/>
+      <w:r>
+        <w:t xml:space="preserve"> difference should only be the low level controller , in my model </w:t>
+      </w:r>
+      <w:proofErr w:type="spellStart"/>
+      <w:r>
+        <w:t>i</w:t>
+      </w:r>
+      <w:proofErr w:type="spellEnd"/>
+      <w:r>
+        <w:t xml:space="preserve"> just have a unit </w:t>
+      </w:r>
+    </w:p>
+    <w:p>
+      <w:proofErr w:type="gramStart"/>
+      <w:r>
+        <w:t>delay ,</w:t>
+      </w:r>
+      <w:proofErr w:type="gramEnd"/>
+      <w:r>
+        <w:t xml:space="preserve"> but </w:t>
+      </w:r>
+      <w:proofErr w:type="spellStart"/>
+      <w:r>
+        <w:t>i</w:t>
+      </w:r>
+      <w:proofErr w:type="spellEnd"/>
+      <w:r>
+        <w:t xml:space="preserve"> don't want to hardcode this into the code because </w:t>
+      </w:r>
+      <w:proofErr w:type="spellStart"/>
+      <w:r>
+        <w:t>irl</w:t>
+      </w:r>
+      <w:proofErr w:type="spellEnd"/>
+      <w:r>
+        <w:t xml:space="preserve"> it will be different</w:t>
+      </w:r>
+    </w:p>
+    <w:p>
+      <w:r>
+        <w:t xml:space="preserve">-where does the 1 cm error come from? </w:t>
+      </w:r>
+      <w:proofErr w:type="gramStart"/>
+      <w:r>
+        <w:t>probably</w:t>
+      </w:r>
+      <w:proofErr w:type="gramEnd"/>
+      <w:r>
+        <w:t xml:space="preserve"> the unit delay</w:t>
+      </w:r>
+    </w:p>
+    <w:p>
+      <w:r>
+        <w:t>-</w:t>
+      </w:r>
+      <w:proofErr w:type="spellStart"/>
+      <w:r>
+        <w:t>i</w:t>
+      </w:r>
+      <w:proofErr w:type="spellEnd"/>
+      <w:r>
+        <w:t xml:space="preserve"> want to see matrix N </w:t>
+      </w:r>
+    </w:p>
+    <w:p>
+      <w:r>
+        <w:t xml:space="preserve">- The belief filter still computes all n forces; the own slot's belief just goes unused now (harmless). </w:t>
+      </w:r>
+      <w:proofErr w:type="gramStart"/>
+      <w:r>
+        <w:t>why</w:t>
+      </w:r>
+      <w:proofErr w:type="gramEnd"/>
+      <w:r>
+        <w:t xml:space="preserve">? </w:t>
+      </w:r>
+    </w:p>
+    <w:p>
+      <w:proofErr w:type="spellStart"/>
+      <w:proofErr w:type="gramStart"/>
+      <w:r>
+        <w:t>i</w:t>
+      </w:r>
+      <w:proofErr w:type="spellEnd"/>
+      <w:proofErr w:type="gramEnd"/>
+      <w:r>
+        <w:t xml:space="preserve"> thought the lambdas are the beliefs? </w:t>
+      </w:r>
+      <w:proofErr w:type="gramStart"/>
+      <w:r>
+        <w:t>but</w:t>
+      </w:r>
+      <w:proofErr w:type="gramEnd"/>
+      <w:r>
+        <w:t xml:space="preserve"> my lambda is known for certain because </w:t>
+      </w:r>
+      <w:proofErr w:type="spellStart"/>
+      <w:r>
+        <w:t>i</w:t>
+      </w:r>
+      <w:proofErr w:type="spellEnd"/>
+      <w:r>
+        <w:t xml:space="preserve"> know my position and </w:t>
+      </w:r>
+      <w:proofErr w:type="spellStart"/>
+      <w:r>
+        <w:t>vel</w:t>
+      </w:r>
+      <w:proofErr w:type="spellEnd"/>
+      <w:r>
+        <w:t xml:space="preserve"> ? </w:t>
+      </w:r>
+    </w:p>
+    <w:p>
+      <w:proofErr w:type="gramStart"/>
+      <w:r>
+        <w:t>the</w:t>
+      </w:r>
+      <w:proofErr w:type="gramEnd"/>
+      <w:r>
+        <w:t xml:space="preserve"> force is then calculated and it the applied force, my segment of the vector at least, and the other part of the </w:t>
+      </w:r>
+    </w:p>
+    <w:p>
+      <w:proofErr w:type="gramStart"/>
+      <w:r>
+        <w:t>vector</w:t>
+      </w:r>
+      <w:proofErr w:type="gramEnd"/>
+      <w:r>
+        <w:t xml:space="preserve"> for the other drone force is not needed, also </w:t>
+      </w:r>
+      <w:proofErr w:type="spellStart"/>
+      <w:r>
+        <w:t>i</w:t>
+      </w:r>
+      <w:proofErr w:type="spellEnd"/>
+      <w:r>
+        <w:t xml:space="preserve"> don't even see in the code where does this happen, what happens in </w:t>
+      </w:r>
+    </w:p>
+    <w:p>
+      <w:proofErr w:type="gramStart"/>
+      <w:r>
+        <w:t>the</w:t>
+      </w:r>
+      <w:proofErr w:type="gramEnd"/>
+      <w:r>
+        <w:t xml:space="preserve"> code is </w:t>
+      </w:r>
+      <w:proofErr w:type="spellStart"/>
+      <w:r>
+        <w:t>i</w:t>
+      </w:r>
+      <w:proofErr w:type="spellEnd"/>
+      <w:r>
+        <w:t xml:space="preserve"> estimate all the positions and velocities but </w:t>
+      </w:r>
+      <w:proofErr w:type="spellStart"/>
+      <w:r>
+        <w:t>i</w:t>
+      </w:r>
+      <w:proofErr w:type="spellEnd"/>
+      <w:r>
+        <w:t xml:space="preserve"> throw away my belief about my state, not the force</w:t>
       </w:r>
     </w:p>
     <w:p/>
@@ -337,211 +944,799 @@
     </w:p>
     <w:p>
       <w:r>
-        <w:t xml:space="preserve"> noise, train on that , so the residual learns to resist noise/desync , then do RL on top . basically the residual will</w:t>
-      </w:r>
-    </w:p>
-    <w:p>
-      <w:r>
-        <w:t xml:space="preserve"> learn to correct the wrong calculated force to match the correct force coming from the centralized expert</w:t>
-      </w:r>
-    </w:p>
-    <w:p/>
-    <w:p>
-      <w:r>
-        <w:t xml:space="preserve">-in verify reconstruction : N, DT, T_END, EPS, PHASES, LLC_ALPHA, FZ, and BYPASS_OPT=True (drive with the fast </w:t>
-      </w:r>
-    </w:p>
-    <w:p>
-      <w:r>
-        <w:t xml:space="preserve">fixed-sinusoid controller — reconstruction is controller-independent, pure kinematics). i kinda disagree, the optimizer </w:t>
-      </w:r>
-    </w:p>
-    <w:p>
-      <w:r>
-        <w:t xml:space="preserve">affect the velocity, so we would want to know if our estimate is still good when the optimizer is active, i understand </w:t>
-      </w:r>
-    </w:p>
-    <w:p>
-      <w:r>
-        <w:t xml:space="preserve">it's a force to velocity relationship, but since we have an error we don't know which forces exagerate it? also since the </w:t>
-      </w:r>
-    </w:p>
-    <w:p>
-      <w:r>
-        <w:t>thing explodes around 6.5s which is when the optimizer is alive, maybe worth looking into</w:t>
+        <w:t xml:space="preserve"> </w:t>
+      </w:r>
+      <w:proofErr w:type="gramStart"/>
+      <w:r>
+        <w:t>noise</w:t>
+      </w:r>
+      <w:proofErr w:type="gramEnd"/>
+      <w:r>
+        <w:t>, train on that , so the residual learns to resist noise/</w:t>
+      </w:r>
+      <w:proofErr w:type="spellStart"/>
+      <w:r>
+        <w:t>desync</w:t>
+      </w:r>
+      <w:proofErr w:type="spellEnd"/>
+      <w:r>
+        <w:t xml:space="preserve"> , then do RL on top . </w:t>
+      </w:r>
+      <w:proofErr w:type="gramStart"/>
+      <w:r>
+        <w:t>basically</w:t>
+      </w:r>
+      <w:proofErr w:type="gramEnd"/>
+      <w:r>
+        <w:t xml:space="preserve"> the residual will</w:t>
+      </w:r>
+    </w:p>
+    <w:p>
+      <w:r>
+        <w:t xml:space="preserve"> </w:t>
+      </w:r>
+      <w:proofErr w:type="gramStart"/>
+      <w:r>
+        <w:t>learn</w:t>
+      </w:r>
+      <w:proofErr w:type="gramEnd"/>
+      <w:r>
+        <w:t xml:space="preserve"> to correct the wrong calculated force to match the correct force coming from the centralized expert</w:t>
+      </w:r>
+    </w:p>
+    <w:p/>
+    <w:p>
+      <w:r>
+        <w:t xml:space="preserve">-in verify </w:t>
+      </w:r>
+      <w:proofErr w:type="gramStart"/>
+      <w:r>
+        <w:t>reconstruction :</w:t>
+      </w:r>
+      <w:proofErr w:type="gramEnd"/>
+      <w:r>
+        <w:t xml:space="preserve"> N, DT, T_END, EPS, PHASES, LLC_ALPHA, FZ, and BYPASS_OPT=True (drive with the fast </w:t>
+      </w:r>
+    </w:p>
+    <w:p>
+      <w:proofErr w:type="gramStart"/>
+      <w:r>
+        <w:t>fixed-sinusoid</w:t>
+      </w:r>
+      <w:proofErr w:type="gramEnd"/>
+      <w:r>
+        <w:t xml:space="preserve"> controller — reconstruction is controller-independent, pure kinematics). </w:t>
+      </w:r>
+      <w:proofErr w:type="spellStart"/>
+      <w:proofErr w:type="gramStart"/>
+      <w:r>
+        <w:t>i</w:t>
+      </w:r>
+      <w:proofErr w:type="spellEnd"/>
+      <w:proofErr w:type="gramEnd"/>
+      <w:r>
+        <w:t xml:space="preserve"> </w:t>
+      </w:r>
+      <w:proofErr w:type="spellStart"/>
+      <w:r>
+        <w:t>kinda</w:t>
+      </w:r>
+      <w:proofErr w:type="spellEnd"/>
+      <w:r>
+        <w:t xml:space="preserve"> disagree, the optimizer </w:t>
+      </w:r>
+    </w:p>
+    <w:p>
+      <w:proofErr w:type="gramStart"/>
+      <w:r>
+        <w:t>affect</w:t>
+      </w:r>
+      <w:proofErr w:type="gramEnd"/>
+      <w:r>
+        <w:t xml:space="preserve"> the velocity, so we would want to know if our estimate is still good when the optimizer is active, </w:t>
+      </w:r>
+      <w:proofErr w:type="spellStart"/>
+      <w:r>
+        <w:t>i</w:t>
+      </w:r>
+      <w:proofErr w:type="spellEnd"/>
+      <w:r>
+        <w:t xml:space="preserve"> understand </w:t>
+      </w:r>
+    </w:p>
+    <w:p>
+      <w:proofErr w:type="gramStart"/>
+      <w:r>
+        <w:t>it's</w:t>
+      </w:r>
+      <w:proofErr w:type="gramEnd"/>
+      <w:r>
+        <w:t xml:space="preserve"> a force to velocity relationship, but since we have an error we don't know which forces </w:t>
+      </w:r>
+      <w:proofErr w:type="spellStart"/>
+      <w:r>
+        <w:t>exagerate</w:t>
+      </w:r>
+      <w:proofErr w:type="spellEnd"/>
+      <w:r>
+        <w:t xml:space="preserve"> it? </w:t>
+      </w:r>
+      <w:proofErr w:type="gramStart"/>
+      <w:r>
+        <w:t>also</w:t>
+      </w:r>
+      <w:proofErr w:type="gramEnd"/>
+      <w:r>
+        <w:t xml:space="preserve"> since the </w:t>
+      </w:r>
+    </w:p>
+    <w:p>
+      <w:proofErr w:type="gramStart"/>
+      <w:r>
+        <w:t>thing</w:t>
+      </w:r>
+      <w:proofErr w:type="gramEnd"/>
+      <w:r>
+        <w:t xml:space="preserve"> explodes around 6.5s which is when the optimizer is alive, maybe worth looking into</w:t>
       </w:r>
     </w:p>
     <w:p/>
     <w:p>
       <w:r>
         <w:lastRenderedPageBreak/>
-        <w:t>&gt;&gt;&gt;&gt;&gt;&gt;&gt; the last couple of points can be completely overcame by just raw dogging the whole lambda vector(not really,</w:t>
-      </w:r>
-    </w:p>
-    <w:p>
-      <w:r>
-        <w:t>still might be useful)</w:t>
-      </w:r>
-    </w:p>
-    <w:p/>
-    <w:p/>
-    <w:p>
-      <w:r>
-        <w:t xml:space="preserve"> how does the network know just from the load state that it needs to speed up? feels very convoluted to understand this.</w:t>
-      </w:r>
-    </w:p>
-    <w:p>
-      <w:r>
-        <w:t xml:space="preserve"> also i think dagger will still be needed once we generalize to multiple trajectories and so, because currently i think it </w:t>
-      </w:r>
-    </w:p>
-    <w:p>
-      <w:r>
-        <w:t>just memorized a mapping and didn't learn truly a control law</w:t>
-      </w:r>
-    </w:p>
-    <w:p>
-      <w:r>
-        <w:t xml:space="preserve">i think this is a problem, the network just memorized what the optimizer did, i think this is fundamentally ill posed, </w:t>
-      </w:r>
-    </w:p>
-    <w:p>
-      <w:r>
-        <w:t xml:space="preserve">it cannot know when to increase/decrease A and ksi (implicitly by increasing lambda amplitude and frequency)  just by </w:t>
-      </w:r>
-    </w:p>
-    <w:p>
-      <w:r>
-        <w:t>looking at the load state, either that or it will maybe just learn to loiter in a way that guarantees the vel norm never</w:t>
-      </w:r>
-    </w:p>
-    <w:p>
-      <w:r>
-        <w:t xml:space="preserve"> reaches a certain value, but even then, i don't think it does that. but again, i don't see how the load state even matters? </w:t>
-      </w:r>
-    </w:p>
-    <w:p>
-      <w:r>
-        <w:t>it's just a number it uses to memorize probably(in this load state you increase A , in this one you increase ksi,</w:t>
-      </w:r>
-    </w:p>
-    <w:p>
-      <w:r>
-        <w:t xml:space="preserve"> not a control law), the optimizer gets w_d as input too btw(and it's extremely crucial), which we ignored</w:t>
-      </w:r>
-    </w:p>
-    <w:p/>
-    <w:p>
-      <w:r>
-        <w:t>if we think conceptually, what does the optimizer do:</w:t>
-      </w:r>
-    </w:p>
-    <w:p>
-      <w:r>
-        <w:t xml:space="preserve">it takes: the load state + problem geometry(let's start with easy case when this is just a constant), builds vLi, </w:t>
-      </w:r>
-    </w:p>
-    <w:p>
-      <w:r>
-        <w:t>builds G and N</w:t>
-      </w:r>
-    </w:p>
-    <w:p>
-      <w:r>
-        <w:t xml:space="preserve">then takes G and N + has a memory of old G and N (idk how to replicate that in an NN) builds Gdot and Ndot, </w:t>
-      </w:r>
-    </w:p>
-    <w:p>
-      <w:r>
-        <w:t>then takes w_d + has memory of old w_d, builds w_d dot, and then uses all that to Ti and f_perp_dot (aka qdot)</w:t>
-      </w:r>
-    </w:p>
-    <w:p/>
-    <w:p>
-      <w:r>
-        <w:t>then uses vLi and qdot to reconstruct the drones vel norm and uses the phases to build the lambdas , changes the A and ksi</w:t>
-      </w:r>
+        <w:t xml:space="preserve">&gt;&gt;&gt;&gt;&gt;&gt;&gt; </w:t>
+      </w:r>
+      <w:proofErr w:type="gramStart"/>
+      <w:r>
+        <w:t>the</w:t>
+      </w:r>
+      <w:proofErr w:type="gramEnd"/>
+      <w:r>
+        <w:t xml:space="preserve"> last couple of points can be completely overcame by just raw dogging the whole lambda vector(not really,</w:t>
+      </w:r>
+    </w:p>
+    <w:p>
+      <w:proofErr w:type="gramStart"/>
+      <w:r>
+        <w:t>still</w:t>
+      </w:r>
+      <w:proofErr w:type="gramEnd"/>
+      <w:r>
+        <w:t xml:space="preserve"> might be useful)</w:t>
+      </w:r>
+    </w:p>
+    <w:p/>
+    <w:p/>
+    <w:p>
+      <w:r>
+        <w:t xml:space="preserve"> </w:t>
+      </w:r>
+      <w:proofErr w:type="gramStart"/>
+      <w:r>
+        <w:t>how</w:t>
+      </w:r>
+      <w:proofErr w:type="gramEnd"/>
+      <w:r>
+        <w:t xml:space="preserve"> does the network know just from the load state that it needs to speed up? </w:t>
+      </w:r>
+      <w:proofErr w:type="gramStart"/>
+      <w:r>
+        <w:t>feels</w:t>
+      </w:r>
+      <w:proofErr w:type="gramEnd"/>
+      <w:r>
+        <w:t xml:space="preserve"> very convoluted to understand this.</w:t>
+      </w:r>
+    </w:p>
+    <w:p>
+      <w:r>
+        <w:t xml:space="preserve"> </w:t>
+      </w:r>
+      <w:proofErr w:type="gramStart"/>
+      <w:r>
+        <w:t>also</w:t>
+      </w:r>
+      <w:proofErr w:type="gramEnd"/>
+      <w:r>
+        <w:t xml:space="preserve"> </w:t>
+      </w:r>
+      <w:proofErr w:type="spellStart"/>
+      <w:r>
+        <w:t>i</w:t>
+      </w:r>
+      <w:proofErr w:type="spellEnd"/>
+      <w:r>
+        <w:t xml:space="preserve"> think dagger will still be needed once we generalize to multiple trajectories and so, because currently </w:t>
+      </w:r>
+      <w:proofErr w:type="spellStart"/>
+      <w:r>
+        <w:t>i</w:t>
+      </w:r>
+      <w:proofErr w:type="spellEnd"/>
+      <w:r>
+        <w:t xml:space="preserve"> think it </w:t>
+      </w:r>
+    </w:p>
+    <w:p>
+      <w:proofErr w:type="gramStart"/>
+      <w:r>
+        <w:t>just</w:t>
+      </w:r>
+      <w:proofErr w:type="gramEnd"/>
+      <w:r>
+        <w:t xml:space="preserve"> memorized a mapping and didn't learn truly a control law</w:t>
+      </w:r>
+    </w:p>
+    <w:p>
+      <w:proofErr w:type="spellStart"/>
+      <w:proofErr w:type="gramStart"/>
+      <w:r>
+        <w:t>i</w:t>
+      </w:r>
+      <w:proofErr w:type="spellEnd"/>
+      <w:proofErr w:type="gramEnd"/>
+      <w:r>
+        <w:t xml:space="preserve"> think this is a problem, the network just memorized what the optimizer did, </w:t>
+      </w:r>
+      <w:proofErr w:type="spellStart"/>
+      <w:r>
+        <w:t>i</w:t>
+      </w:r>
+      <w:proofErr w:type="spellEnd"/>
+      <w:r>
+        <w:t xml:space="preserve"> think this is fundamentally ill posed, </w:t>
+      </w:r>
+    </w:p>
+    <w:p>
+      <w:proofErr w:type="gramStart"/>
+      <w:r>
+        <w:t>it</w:t>
+      </w:r>
+      <w:proofErr w:type="gramEnd"/>
+      <w:r>
+        <w:t xml:space="preserve"> cannot know when to increase/decrease A and </w:t>
+      </w:r>
+      <w:proofErr w:type="spellStart"/>
+      <w:r>
+        <w:t>ksi</w:t>
+      </w:r>
+      <w:proofErr w:type="spellEnd"/>
+      <w:r>
+        <w:t xml:space="preserve"> (implicitly by increasing lambda amplitude and frequency)  just by </w:t>
+      </w:r>
+    </w:p>
+    <w:p>
+      <w:proofErr w:type="gramStart"/>
+      <w:r>
+        <w:t>looking</w:t>
+      </w:r>
+      <w:proofErr w:type="gramEnd"/>
+      <w:r>
+        <w:t xml:space="preserve"> at the load state, either that or it will maybe just learn to loiter in a way that guarantees the </w:t>
+      </w:r>
+      <w:proofErr w:type="spellStart"/>
+      <w:r>
+        <w:t>vel</w:t>
+      </w:r>
+      <w:proofErr w:type="spellEnd"/>
+      <w:r>
+        <w:t xml:space="preserve"> norm never</w:t>
+      </w:r>
+    </w:p>
+    <w:p>
+      <w:r>
+        <w:t xml:space="preserve"> </w:t>
+      </w:r>
+      <w:proofErr w:type="gramStart"/>
+      <w:r>
+        <w:t>reaches</w:t>
+      </w:r>
+      <w:proofErr w:type="gramEnd"/>
+      <w:r>
+        <w:t xml:space="preserve"> a certain value, but even then, </w:t>
+      </w:r>
+      <w:proofErr w:type="spellStart"/>
+      <w:r>
+        <w:t>i</w:t>
+      </w:r>
+      <w:proofErr w:type="spellEnd"/>
+      <w:r>
+        <w:t xml:space="preserve"> don't think it does that. </w:t>
+      </w:r>
+      <w:proofErr w:type="gramStart"/>
+      <w:r>
+        <w:t>but</w:t>
+      </w:r>
+      <w:proofErr w:type="gramEnd"/>
+      <w:r>
+        <w:t xml:space="preserve"> again, </w:t>
+      </w:r>
+      <w:proofErr w:type="spellStart"/>
+      <w:r>
+        <w:t>i</w:t>
+      </w:r>
+      <w:proofErr w:type="spellEnd"/>
+      <w:r>
+        <w:t xml:space="preserve"> don't see how the load state even matters? </w:t>
+      </w:r>
+    </w:p>
+    <w:p>
+      <w:proofErr w:type="gramStart"/>
+      <w:r>
+        <w:t>it's</w:t>
+      </w:r>
+      <w:proofErr w:type="gramEnd"/>
+      <w:r>
+        <w:t xml:space="preserve"> just a number it uses to memorize probably(in this load state you increase A , in this one you increase </w:t>
+      </w:r>
+      <w:proofErr w:type="spellStart"/>
+      <w:r>
+        <w:t>ksi</w:t>
+      </w:r>
+      <w:proofErr w:type="spellEnd"/>
+      <w:r>
+        <w:t>,</w:t>
+      </w:r>
+    </w:p>
+    <w:p>
+      <w:r>
+        <w:t xml:space="preserve"> </w:t>
+      </w:r>
+      <w:proofErr w:type="gramStart"/>
+      <w:r>
+        <w:t>not</w:t>
+      </w:r>
+      <w:proofErr w:type="gramEnd"/>
+      <w:r>
+        <w:t xml:space="preserve"> a control law), the optimizer gets </w:t>
+      </w:r>
+      <w:proofErr w:type="spellStart"/>
+      <w:r>
+        <w:t>w_d</w:t>
+      </w:r>
+      <w:proofErr w:type="spellEnd"/>
+      <w:r>
+        <w:t xml:space="preserve"> as input too btw(and it's extremely crucial), which we ignored</w:t>
+      </w:r>
+    </w:p>
+    <w:p/>
+    <w:p>
+      <w:proofErr w:type="gramStart"/>
+      <w:r>
+        <w:t>if</w:t>
+      </w:r>
+      <w:proofErr w:type="gramEnd"/>
+      <w:r>
+        <w:t xml:space="preserve"> we think conceptually, what does the optimizer do:</w:t>
+      </w:r>
+    </w:p>
+    <w:p>
+      <w:proofErr w:type="gramStart"/>
+      <w:r>
+        <w:t>it</w:t>
+      </w:r>
+      <w:proofErr w:type="gramEnd"/>
+      <w:r>
+        <w:t xml:space="preserve"> takes: the load state + problem geometry(let's start with easy case when this is just a constant), builds </w:t>
+      </w:r>
+      <w:proofErr w:type="spellStart"/>
+      <w:r>
+        <w:t>vLi</w:t>
+      </w:r>
+      <w:proofErr w:type="spellEnd"/>
+      <w:r>
+        <w:t xml:space="preserve">, </w:t>
+      </w:r>
+    </w:p>
+    <w:p>
+      <w:proofErr w:type="gramStart"/>
+      <w:r>
+        <w:t>builds</w:t>
+      </w:r>
+      <w:proofErr w:type="gramEnd"/>
+      <w:r>
+        <w:t xml:space="preserve"> G and N</w:t>
+      </w:r>
+    </w:p>
+    <w:p>
+      <w:proofErr w:type="gramStart"/>
+      <w:r>
+        <w:t>then</w:t>
+      </w:r>
+      <w:proofErr w:type="gramEnd"/>
+      <w:r>
+        <w:t xml:space="preserve"> takes G and N + has a memory of old G and N (</w:t>
+      </w:r>
+      <w:proofErr w:type="spellStart"/>
+      <w:r>
+        <w:t>idk</w:t>
+      </w:r>
+      <w:proofErr w:type="spellEnd"/>
+      <w:r>
+        <w:t xml:space="preserve"> how to replicate that in an NN) builds </w:t>
+      </w:r>
+      <w:proofErr w:type="spellStart"/>
+      <w:r>
+        <w:t>Gdot</w:t>
+      </w:r>
+      <w:proofErr w:type="spellEnd"/>
+      <w:r>
+        <w:t xml:space="preserve"> and </w:t>
+      </w:r>
+      <w:proofErr w:type="spellStart"/>
+      <w:r>
+        <w:t>Ndot</w:t>
+      </w:r>
+      <w:proofErr w:type="spellEnd"/>
+      <w:r>
+        <w:t xml:space="preserve">, </w:t>
+      </w:r>
+    </w:p>
+    <w:p>
+      <w:proofErr w:type="gramStart"/>
+      <w:r>
+        <w:t>then</w:t>
+      </w:r>
+      <w:proofErr w:type="gramEnd"/>
+      <w:r>
+        <w:t xml:space="preserve"> takes </w:t>
+      </w:r>
+      <w:proofErr w:type="spellStart"/>
+      <w:r>
+        <w:t>w_d</w:t>
+      </w:r>
+      <w:proofErr w:type="spellEnd"/>
+      <w:r>
+        <w:t xml:space="preserve"> + has memory of old </w:t>
+      </w:r>
+      <w:proofErr w:type="spellStart"/>
+      <w:r>
+        <w:t>w_d</w:t>
+      </w:r>
+      <w:proofErr w:type="spellEnd"/>
+      <w:r>
+        <w:t xml:space="preserve">, builds </w:t>
+      </w:r>
+      <w:proofErr w:type="spellStart"/>
+      <w:r>
+        <w:t>w_d</w:t>
+      </w:r>
+      <w:proofErr w:type="spellEnd"/>
+      <w:r>
+        <w:t xml:space="preserve"> dot, and then uses all that to Ti and </w:t>
+      </w:r>
+      <w:proofErr w:type="spellStart"/>
+      <w:r>
+        <w:t>f_perp_dot</w:t>
+      </w:r>
+      <w:proofErr w:type="spellEnd"/>
+      <w:r>
+        <w:t xml:space="preserve"> (aka </w:t>
+      </w:r>
+      <w:proofErr w:type="spellStart"/>
+      <w:r>
+        <w:t>qdot</w:t>
+      </w:r>
+      <w:proofErr w:type="spellEnd"/>
+      <w:r>
+        <w:t>)</w:t>
+      </w:r>
+    </w:p>
+    <w:p/>
+    <w:p>
+      <w:proofErr w:type="gramStart"/>
+      <w:r>
+        <w:t>then</w:t>
+      </w:r>
+      <w:proofErr w:type="gramEnd"/>
+      <w:r>
+        <w:t xml:space="preserve"> uses </w:t>
+      </w:r>
+      <w:proofErr w:type="spellStart"/>
+      <w:r>
+        <w:t>vLi</w:t>
+      </w:r>
+      <w:proofErr w:type="spellEnd"/>
+      <w:r>
+        <w:t xml:space="preserve"> and </w:t>
+      </w:r>
+      <w:proofErr w:type="spellStart"/>
+      <w:r>
+        <w:t>qdot</w:t>
+      </w:r>
+      <w:proofErr w:type="spellEnd"/>
+      <w:r>
+        <w:t xml:space="preserve"> to reconstruct the drones </w:t>
+      </w:r>
+      <w:proofErr w:type="spellStart"/>
+      <w:r>
+        <w:t>vel</w:t>
+      </w:r>
+      <w:proofErr w:type="spellEnd"/>
+      <w:r>
+        <w:t xml:space="preserve"> norm and uses the phases to build the lambdas , changes the A and </w:t>
+      </w:r>
+      <w:proofErr w:type="spellStart"/>
+      <w:r>
+        <w:t>ksi</w:t>
+      </w:r>
+      <w:proofErr w:type="spellEnd"/>
     </w:p>
     <w:p>
       <w:r>
         <w:lastRenderedPageBreak/>
-        <w:t xml:space="preserve"> of the lambdas based on the drones vel norm</w:t>
-      </w:r>
-    </w:p>
-    <w:p/>
-    <w:p>
-      <w:r>
-        <w:t xml:space="preserve">to sum upp, we need to at least add w_d, and the memory thing to calculate the derivates, idk how to encode that? </w:t>
-      </w:r>
-    </w:p>
-    <w:p>
-      <w:r>
-        <w:t>optionally we add the epsilon and the attachment points for more generalization but that's a next step</w:t>
-      </w:r>
-    </w:p>
-    <w:p/>
-    <w:p>
-      <w:r>
-        <w:t>we probably need heavy handed feature engineering here, calculate all these derivatives outside the net and provide them as</w:t>
-      </w:r>
-    </w:p>
-    <w:p>
-      <w:r>
-        <w:t xml:space="preserve"> inputs, i mean it's a waste anyway to force the NN to learn all this math that can be done outside super easy</w:t>
-      </w:r>
-    </w:p>
-    <w:p/>
-    <w:p>
-      <w:r>
-        <w:t>The prdot DAgger has the same skeleton but three adaptations: (1) it's whole-vector — one 30-D input row and one λ[4] label</w:t>
-      </w:r>
-    </w:p>
-    <w:p>
-      <w:r>
-        <w:t>per step, not 4 per-drone rows; (2) the rollout must reconstruct ṗ_R from the applied (mixed) λ history, since that's the</w:t>
-      </w:r>
-    </w:p>
-    <w:p>
-      <w:r>
-        <w:t xml:space="preserve"> state the policy actually visits — this is the exact covariate-shift the deploy buzz exposed; (3) λ̇_{t-1} from the </w:t>
-      </w:r>
-    </w:p>
-    <w:p>
-      <w:r>
-        <w:t>applied-λ history. β-mixing is still safe (G·N=0).</w:t>
-      </w:r>
-    </w:p>
-    <w:p/>
-    <w:p>
-      <w:r>
-        <w:t>-how does the noise survive the filter : the λ self-feedback loop (λ_{t-1} → ṗ_R → λ_t) — the exact loop that buzzed</w:t>
-      </w:r>
-    </w:p>
-    <w:p>
-      <w:r>
-        <w:t xml:space="preserve"> before DAgger — is getting re-excited by the noise. DAgger cured the covariate-shift trigger, but sensing noise is a</w:t>
-      </w:r>
-    </w:p>
-    <w:p>
-      <w:r>
-        <w:t xml:space="preserve"> different trigger for the same latent instability. That would explain why it survives the LLC low-pass: </w:t>
-      </w:r>
-    </w:p>
-    <w:p>
-      <w:r>
-        <w:t>a sustained limit-cycle in λ (a few Hz) passes the filter partially, whereas pure one-off noise would get smoothed.</w:t>
-      </w:r>
-    </w:p>
-    <w:p>
-      <w:r>
-        <w:t>(might be bs)</w:t>
-      </w:r>
-    </w:p>
-    <w:p/>
-    <w:p/>
-    <w:p>
-      <w:r>
-        <w:t>clock features are a 14-D Fourier oscillator bank,</w:t>
+        <w:t xml:space="preserve"> </w:t>
+      </w:r>
+      <w:proofErr w:type="gramStart"/>
+      <w:r>
+        <w:t>of</w:t>
+      </w:r>
+      <w:proofErr w:type="gramEnd"/>
+      <w:r>
+        <w:t xml:space="preserve"> the lambdas based on the drones </w:t>
+      </w:r>
+      <w:proofErr w:type="spellStart"/>
+      <w:r>
+        <w:t>vel</w:t>
+      </w:r>
+      <w:proofErr w:type="spellEnd"/>
+      <w:r>
+        <w:t xml:space="preserve"> norm</w:t>
+      </w:r>
+    </w:p>
+    <w:p/>
+    <w:p>
+      <w:proofErr w:type="gramStart"/>
+      <w:r>
+        <w:t>to</w:t>
+      </w:r>
+      <w:proofErr w:type="gramEnd"/>
+      <w:r>
+        <w:t xml:space="preserve"> sum </w:t>
+      </w:r>
+      <w:proofErr w:type="spellStart"/>
+      <w:r>
+        <w:t>upp</w:t>
+      </w:r>
+      <w:proofErr w:type="spellEnd"/>
+      <w:r>
+        <w:t xml:space="preserve">, we need to at least add </w:t>
+      </w:r>
+      <w:proofErr w:type="spellStart"/>
+      <w:r>
+        <w:t>w_d</w:t>
+      </w:r>
+      <w:proofErr w:type="spellEnd"/>
+      <w:r>
+        <w:t xml:space="preserve">, and the memory thing to calculate the </w:t>
+      </w:r>
+      <w:proofErr w:type="spellStart"/>
+      <w:r>
+        <w:t>derivates</w:t>
+      </w:r>
+      <w:proofErr w:type="spellEnd"/>
+      <w:r>
+        <w:t xml:space="preserve">, </w:t>
+      </w:r>
+      <w:proofErr w:type="spellStart"/>
+      <w:r>
+        <w:t>idk</w:t>
+      </w:r>
+      <w:proofErr w:type="spellEnd"/>
+      <w:r>
+        <w:t xml:space="preserve"> how to encode that? </w:t>
+      </w:r>
+    </w:p>
+    <w:p>
+      <w:proofErr w:type="gramStart"/>
+      <w:r>
+        <w:t>optionally</w:t>
+      </w:r>
+      <w:proofErr w:type="gramEnd"/>
+      <w:r>
+        <w:t xml:space="preserve"> we add the epsilon and the attachment points for more generalization but that's a next step</w:t>
+      </w:r>
+    </w:p>
+    <w:p/>
+    <w:p>
+      <w:proofErr w:type="gramStart"/>
+      <w:r>
+        <w:t>we</w:t>
+      </w:r>
+      <w:proofErr w:type="gramEnd"/>
+      <w:r>
+        <w:t xml:space="preserve"> probably need heavy handed feature engineering here, calculate all these derivatives outside the net and provide them as</w:t>
+      </w:r>
+    </w:p>
+    <w:p>
+      <w:r>
+        <w:t xml:space="preserve"> </w:t>
+      </w:r>
+      <w:proofErr w:type="gramStart"/>
+      <w:r>
+        <w:t>inputs</w:t>
+      </w:r>
+      <w:proofErr w:type="gramEnd"/>
+      <w:r>
+        <w:t xml:space="preserve">, </w:t>
+      </w:r>
+      <w:proofErr w:type="spellStart"/>
+      <w:r>
+        <w:t>i</w:t>
+      </w:r>
+      <w:proofErr w:type="spellEnd"/>
+      <w:r>
+        <w:t xml:space="preserve"> mean it's a waste anyway to force the NN to learn all this math that can be done outside super easy</w:t>
+      </w:r>
+    </w:p>
+    <w:p/>
+    <w:p>
+      <w:r>
+        <w:t xml:space="preserve">The </w:t>
+      </w:r>
+      <w:proofErr w:type="spellStart"/>
+      <w:r>
+        <w:t>prdot</w:t>
+      </w:r>
+      <w:proofErr w:type="spellEnd"/>
+      <w:r>
+        <w:t xml:space="preserve"> DAgger has the same skeleton but three adaptations: (1) it's whole-vector — one 30-D input row and one </w:t>
+      </w:r>
+      <w:proofErr w:type="gramStart"/>
+      <w:r>
+        <w:t>λ[</w:t>
+      </w:r>
+      <w:proofErr w:type="gramEnd"/>
+      <w:r>
+        <w:t>4] label</w:t>
+      </w:r>
+    </w:p>
+    <w:p>
+      <w:proofErr w:type="gramStart"/>
+      <w:r>
+        <w:t>per</w:t>
+      </w:r>
+      <w:proofErr w:type="gramEnd"/>
+      <w:r>
+        <w:t xml:space="preserve"> step, not 4 per-drone rows; (2) the rollout must reconstruct </w:t>
+      </w:r>
+      <w:proofErr w:type="spellStart"/>
+      <w:r>
+        <w:t>ṗ_R</w:t>
+      </w:r>
+      <w:proofErr w:type="spellEnd"/>
+      <w:r>
+        <w:t xml:space="preserve"> from the applied (mixed) λ history, since that's the</w:t>
+      </w:r>
+    </w:p>
+    <w:p>
+      <w:r>
+        <w:t xml:space="preserve"> </w:t>
+      </w:r>
+      <w:proofErr w:type="gramStart"/>
+      <w:r>
+        <w:t>state</w:t>
+      </w:r>
+      <w:proofErr w:type="gramEnd"/>
+      <w:r>
+        <w:t xml:space="preserve"> the policy actually visits — this is the exact covariate-shift the deploy buzz exposed; (3) λ̇_{t-1} from the </w:t>
+      </w:r>
+    </w:p>
+    <w:p>
+      <w:proofErr w:type="gramStart"/>
+      <w:r>
+        <w:t>applied-λ</w:t>
+      </w:r>
+      <w:proofErr w:type="gramEnd"/>
+      <w:r>
+        <w:t xml:space="preserve"> history. </w:t>
+      </w:r>
+      <w:proofErr w:type="gramStart"/>
+      <w:r>
+        <w:t>β-mixing</w:t>
+      </w:r>
+      <w:proofErr w:type="gramEnd"/>
+      <w:r>
+        <w:t xml:space="preserve"> is still safe (G·N=0).</w:t>
+      </w:r>
+    </w:p>
+    <w:p/>
+    <w:p>
+      <w:r>
+        <w:t xml:space="preserve">-how does the noise survive the </w:t>
+      </w:r>
+      <w:proofErr w:type="gramStart"/>
+      <w:r>
+        <w:t>filter :</w:t>
+      </w:r>
+      <w:proofErr w:type="gramEnd"/>
+      <w:r>
+        <w:t xml:space="preserve"> the λ self-feedback loop (λ_{t-1} → </w:t>
+      </w:r>
+      <w:proofErr w:type="spellStart"/>
+      <w:r>
+        <w:t>ṗ_R</w:t>
+      </w:r>
+      <w:proofErr w:type="spellEnd"/>
+      <w:r>
+        <w:t xml:space="preserve"> → </w:t>
+      </w:r>
+      <w:proofErr w:type="spellStart"/>
+      <w:r>
+        <w:t>λ_t</w:t>
+      </w:r>
+      <w:proofErr w:type="spellEnd"/>
+      <w:r>
+        <w:t>) — the exact loop that buzzed</w:t>
+      </w:r>
+    </w:p>
+    <w:p>
+      <w:r>
+        <w:t xml:space="preserve"> </w:t>
+      </w:r>
+      <w:proofErr w:type="gramStart"/>
+      <w:r>
+        <w:t>before</w:t>
+      </w:r>
+      <w:proofErr w:type="gramEnd"/>
+      <w:r>
+        <w:t xml:space="preserve"> DAgger — is getting re-excited by the noise. DAgger cured the covariate-shift trigger, but sensing noise is a</w:t>
+      </w:r>
+    </w:p>
+    <w:p>
+      <w:r>
+        <w:t xml:space="preserve"> </w:t>
+      </w:r>
+      <w:proofErr w:type="gramStart"/>
+      <w:r>
+        <w:t>different</w:t>
+      </w:r>
+      <w:proofErr w:type="gramEnd"/>
+      <w:r>
+        <w:t xml:space="preserve"> trigger for the same latent instability. That would explain why it survives the LLC low-pass: </w:t>
+      </w:r>
+    </w:p>
+    <w:p>
+      <w:proofErr w:type="gramStart"/>
+      <w:r>
+        <w:t>a</w:t>
+      </w:r>
+      <w:proofErr w:type="gramEnd"/>
+      <w:r>
+        <w:t xml:space="preserve"> sustained limit-cycle in λ (a few Hz) passes the filter partially, whereas pure one-off noise would get smoothed.</w:t>
+      </w:r>
+    </w:p>
+    <w:p>
+      <w:r>
+        <w:t>(</w:t>
+      </w:r>
+      <w:proofErr w:type="gramStart"/>
+      <w:r>
+        <w:t>might</w:t>
+      </w:r>
+      <w:proofErr w:type="gramEnd"/>
+      <w:r>
+        <w:t xml:space="preserve"> be </w:t>
+      </w:r>
+      <w:proofErr w:type="spellStart"/>
+      <w:r>
+        <w:t>bs</w:t>
+      </w:r>
+      <w:proofErr w:type="spellEnd"/>
+      <w:r>
+        <w:t>)</w:t>
+      </w:r>
+    </w:p>
+    <w:p/>
+    <w:p/>
+    <w:p>
+      <w:proofErr w:type="gramStart"/>
+      <w:r>
+        <w:t>clock</w:t>
+      </w:r>
+      <w:proofErr w:type="gramEnd"/>
+      <w:r>
+        <w:t xml:space="preserve"> features are a 14-D Fourier oscillator bank,</w:t>
       </w:r>
     </w:p>
     <w:p/>
@@ -549,25 +1744,51 @@
     <w:p>
       <w:r>
         <w:lastRenderedPageBreak/>
-        <w:t>- F2 : while the load doesn't swing too much, it seems like the drones loitering is what suffers the most</w:t>
-      </w:r>
-    </w:p>
-    <w:p/>
-    <w:p>
-      <w:r>
-        <w:t xml:space="preserve">- filter is supposed to be like the drone low level controller dynamics, so we shouldn't have access to its exact value </w:t>
-      </w:r>
-    </w:p>
-    <w:p>
-      <w:r>
-        <w:t>but a close estimate maybe</w:t>
-      </w:r>
-    </w:p>
-    <w:p/>
-    <w:p/>
-    <w:p>
-      <w:r>
-        <w:t>how to do RL on top of a learned policy from IL:</w:t>
+        <w:t xml:space="preserve">- </w:t>
+      </w:r>
+      <w:proofErr w:type="gramStart"/>
+      <w:r>
+        <w:t>F2 :</w:t>
+      </w:r>
+      <w:proofErr w:type="gramEnd"/>
+      <w:r>
+        <w:t xml:space="preserve"> while the load doesn't swing too much, it seems like the drones loitering is what suffers the most</w:t>
+      </w:r>
+    </w:p>
+    <w:p/>
+    <w:p>
+      <w:r>
+        <w:t xml:space="preserve">- </w:t>
+      </w:r>
+      <w:proofErr w:type="gramStart"/>
+      <w:r>
+        <w:t>filter</w:t>
+      </w:r>
+      <w:proofErr w:type="gramEnd"/>
+      <w:r>
+        <w:t xml:space="preserve"> is supposed to be like the drone low level controller dynamics, so we shouldn't have access to its exact value </w:t>
+      </w:r>
+    </w:p>
+    <w:p>
+      <w:proofErr w:type="gramStart"/>
+      <w:r>
+        <w:t>but</w:t>
+      </w:r>
+      <w:proofErr w:type="gramEnd"/>
+      <w:r>
+        <w:t xml:space="preserve"> a close estimate maybe</w:t>
+      </w:r>
+    </w:p>
+    <w:p/>
+    <w:p/>
+    <w:p>
+      <w:proofErr w:type="gramStart"/>
+      <w:r>
+        <w:t>how</w:t>
+      </w:r>
+      <w:proofErr w:type="gramEnd"/>
+      <w:r>
+        <w:t xml:space="preserve"> to do RL on top of a learned policy from IL:</w:t>
       </w:r>
     </w:p>
     <w:p/>
@@ -577,35 +1798,114 @@
       </w:r>
     </w:p>
     <w:p>
-      <w:r>
-        <w:t>and add to the reward: r_total = r_task − β · KL(π_θ(·|s) ‖ π_ref(·|s))</w:t>
-      </w:r>
-    </w:p>
-    <w:p>
-      <w:r>
-        <w:t xml:space="preserve">For Gaussian policies the KL is analytic. β is the leash length — high β = stay glued to the warm-start, </w:t>
-      </w:r>
-    </w:p>
-    <w:p>
-      <w:r>
-        <w:t>low β = free to roam. Very common to anneal it (tight early, loosen as it proves stable).</w:t>
-      </w:r>
-    </w:p>
-    <w:p/>
-    <w:p/>
-    <w:p>
-      <w:r>
-        <w:t xml:space="preserve">2 -  Behavior-cloning auxiliary loss. Add a supervised anchor to the policy-update loss: </w:t>
-      </w:r>
-    </w:p>
-    <w:p>
-      <w:r>
-        <w:t>L = L_PPO  +  λ_BC · E_s ‖ π_θ(s) − a_ref(s) ‖²</w:t>
-      </w:r>
-    </w:p>
-    <w:p>
-      <w:r>
-        <w:t>where a_ref is the warm-start's action (or the demonstrations). This pulls the mean back toward the warm-start each update.</w:t>
+      <w:proofErr w:type="gramStart"/>
+      <w:r>
+        <w:t>and</w:t>
+      </w:r>
+      <w:proofErr w:type="gramEnd"/>
+      <w:r>
+        <w:t xml:space="preserve"> add to the reward: </w:t>
+      </w:r>
+      <w:proofErr w:type="spellStart"/>
+      <w:r>
+        <w:t>r_total</w:t>
+      </w:r>
+      <w:proofErr w:type="spellEnd"/>
+      <w:r>
+        <w:t xml:space="preserve"> = </w:t>
+      </w:r>
+      <w:proofErr w:type="spellStart"/>
+      <w:r>
+        <w:t>r_task</w:t>
+      </w:r>
+      <w:proofErr w:type="spellEnd"/>
+      <w:r>
+        <w:t xml:space="preserve"> − β · KL(π_θ(·|s) ‖ π_ref(·|s))</w:t>
+      </w:r>
+    </w:p>
+    <w:p>
+      <w:r>
+        <w:t xml:space="preserve">For Gaussian policies the KL is analytic. </w:t>
+      </w:r>
+      <w:proofErr w:type="gramStart"/>
+      <w:r>
+        <w:t>β</w:t>
+      </w:r>
+      <w:proofErr w:type="gramEnd"/>
+      <w:r>
+        <w:t xml:space="preserve"> is the leash length — high β = stay glued to the warm-start, </w:t>
+      </w:r>
+    </w:p>
+    <w:p>
+      <w:proofErr w:type="gramStart"/>
+      <w:r>
+        <w:t>low</w:t>
+      </w:r>
+      <w:proofErr w:type="gramEnd"/>
+      <w:r>
+        <w:t xml:space="preserve"> β = free to roam. Very common to anneal it (tight early, loosen as it proves stable).</w:t>
+      </w:r>
+    </w:p>
+    <w:p/>
+    <w:p/>
+    <w:p>
+      <w:r>
+        <w:t xml:space="preserve">2 </w:t>
+      </w:r>
+      <w:proofErr w:type="gramStart"/>
+      <w:r>
+        <w:t>-  Behavior</w:t>
+      </w:r>
+      <w:proofErr w:type="gramEnd"/>
+      <w:r>
+        <w:t xml:space="preserve">-cloning auxiliary loss. Add a supervised anchor to the policy-update loss: </w:t>
+      </w:r>
+    </w:p>
+    <w:p>
+      <w:r>
+        <w:t>L = L_</w:t>
+      </w:r>
+      <w:proofErr w:type="gramStart"/>
+      <w:r>
+        <w:t>PPO  +</w:t>
+      </w:r>
+      <w:proofErr w:type="gramEnd"/>
+      <w:r>
+        <w:t xml:space="preserve">  </w:t>
+      </w:r>
+      <w:proofErr w:type="spellStart"/>
+      <w:r>
+        <w:t>λ_BC</w:t>
+      </w:r>
+      <w:proofErr w:type="spellEnd"/>
+      <w:r>
+        <w:t xml:space="preserve"> · E_s ‖ π_θ(s) − </w:t>
+      </w:r>
+      <w:proofErr w:type="spellStart"/>
+      <w:r>
+        <w:t>a_ref</w:t>
+      </w:r>
+      <w:proofErr w:type="spellEnd"/>
+      <w:r>
+        <w:t>(s) ‖²</w:t>
+      </w:r>
+    </w:p>
+    <w:p>
+      <w:proofErr w:type="gramStart"/>
+      <w:r>
+        <w:t>where</w:t>
+      </w:r>
+      <w:proofErr w:type="gramEnd"/>
+      <w:r>
+        <w:t xml:space="preserve"> </w:t>
+      </w:r>
+      <w:proofErr w:type="spellStart"/>
+      <w:r>
+        <w:t>a_ref</w:t>
+      </w:r>
+      <w:proofErr w:type="spellEnd"/>
+      <w:r>
+        <w:t xml:space="preserve"> is the warm-start's action (or the demonstrations). This pulls the mean back toward the warm-start each update.</w:t>
       </w:r>
     </w:p>
     <w:p>
@@ -615,14 +1915,24 @@
     </w:p>
     <w:p/>
     <w:p>
-      <w:r>
-        <w:t xml:space="preserve">plan: </w:t>
-      </w:r>
-    </w:p>
-    <w:p/>
-    <w:p>
-      <w:r>
-        <w:t>supervised (DAgger-style) warm-start → residual imitates the centralized force-correction.</w:t>
+      <w:proofErr w:type="gramStart"/>
+      <w:r>
+        <w:t>plan</w:t>
+      </w:r>
+      <w:proofErr w:type="gramEnd"/>
+      <w:r>
+        <w:t xml:space="preserve">: </w:t>
+      </w:r>
+    </w:p>
+    <w:p/>
+    <w:p>
+      <w:proofErr w:type="gramStart"/>
+      <w:r>
+        <w:t>supervised</w:t>
+      </w:r>
+      <w:proofErr w:type="gramEnd"/>
+      <w:r>
+        <w:t xml:space="preserve"> (DAgger-style) warm-start → residual imitates the centralized force-correction.</w:t>
       </w:r>
     </w:p>
     <w:p>
@@ -633,17 +1943,77 @@
     <w:p/>
     <w:p>
       <w:r>
-        <w:t>-include wd and f local or no? in f2 observation space</w:t>
-      </w:r>
-    </w:p>
-    <w:p>
-      <w:r>
-        <w:t xml:space="preserve">should we give wd and flocal or G*wd and N*lambda? which would be easier for the network? </w:t>
-      </w:r>
-    </w:p>
-    <w:p>
-      <w:r>
-        <w:t>or is it too difficult to tell what is useful to it</w:t>
+        <w:t xml:space="preserve">-include </w:t>
+      </w:r>
+      <w:proofErr w:type="spellStart"/>
+      <w:proofErr w:type="gramStart"/>
+      <w:r>
+        <w:t>wd</w:t>
+      </w:r>
+      <w:proofErr w:type="spellEnd"/>
+      <w:proofErr w:type="gramEnd"/>
+      <w:r>
+        <w:t xml:space="preserve"> and f local or no? </w:t>
+      </w:r>
+      <w:proofErr w:type="gramStart"/>
+      <w:r>
+        <w:t>in</w:t>
+      </w:r>
+      <w:proofErr w:type="gramEnd"/>
+      <w:r>
+        <w:t xml:space="preserve"> f2 observation space</w:t>
+      </w:r>
+    </w:p>
+    <w:p>
+      <w:proofErr w:type="gramStart"/>
+      <w:r>
+        <w:t>should</w:t>
+      </w:r>
+      <w:proofErr w:type="gramEnd"/>
+      <w:r>
+        <w:t xml:space="preserve"> we give </w:t>
+      </w:r>
+      <w:proofErr w:type="spellStart"/>
+      <w:r>
+        <w:t>wd</w:t>
+      </w:r>
+      <w:proofErr w:type="spellEnd"/>
+      <w:r>
+        <w:t xml:space="preserve"> and </w:t>
+      </w:r>
+      <w:proofErr w:type="spellStart"/>
+      <w:r>
+        <w:t>flocal</w:t>
+      </w:r>
+      <w:proofErr w:type="spellEnd"/>
+      <w:r>
+        <w:t xml:space="preserve"> or G*</w:t>
+      </w:r>
+      <w:proofErr w:type="spellStart"/>
+      <w:r>
+        <w:t>wd</w:t>
+      </w:r>
+      <w:proofErr w:type="spellEnd"/>
+      <w:r>
+        <w:t xml:space="preserve"> and N*lambda? </w:t>
+      </w:r>
+      <w:proofErr w:type="gramStart"/>
+      <w:r>
+        <w:t>which</w:t>
+      </w:r>
+      <w:proofErr w:type="gramEnd"/>
+      <w:r>
+        <w:t xml:space="preserve"> would be easier for the network? </w:t>
+      </w:r>
+    </w:p>
+    <w:p>
+      <w:proofErr w:type="gramStart"/>
+      <w:r>
+        <w:t>or</w:t>
+      </w:r>
+      <w:proofErr w:type="gramEnd"/>
+      <w:r>
+        <w:t xml:space="preserve"> is it too difficult to tell what is useful to it</w:t>
       </w:r>
     </w:p>
     <w:p/>
@@ -654,24 +2024,74 @@
     </w:p>
     <w:p/>
     <w:p>
-      <w:r>
-        <w:t xml:space="preserve">arithmetic: 18 (load) + 6 (own) + 3 (f_g) + 3 (f_λ) = 30, not 33. I mislabeled it 33 all along. </w:t>
-      </w:r>
-    </w:p>
-    <w:p>
-      <w:r>
-        <w:t>The obs is 30-D. (Amusingly the base net is also 30-D, but a different 30: clock14+ṗ_R12+λ4.)</w:t>
-      </w:r>
-    </w:p>
-    <w:p/>
-    <w:p>
-      <w:r>
-        <w:t xml:space="preserve">-in f2 warm start dagger : The DAgger aggregation is walking the system into ever-worse states and training the net on </w:t>
-      </w:r>
-    </w:p>
-    <w:p>
-      <w:r>
-        <w:t xml:space="preserve">ever-more-explosive, mostly-un-achievable targets (δf* max ~5 N, but the cap only permits ~1–2 N). </w:t>
+      <w:proofErr w:type="gramStart"/>
+      <w:r>
+        <w:t>arithmetic</w:t>
+      </w:r>
+      <w:proofErr w:type="gramEnd"/>
+      <w:r>
+        <w:t>: 18 (load) + 6 (own) + 3 (</w:t>
+      </w:r>
+      <w:proofErr w:type="spellStart"/>
+      <w:r>
+        <w:t>f_g</w:t>
+      </w:r>
+      <w:proofErr w:type="spellEnd"/>
+      <w:r>
+        <w:t>) + 3 (</w:t>
+      </w:r>
+      <w:proofErr w:type="spellStart"/>
+      <w:r>
+        <w:t>f_λ</w:t>
+      </w:r>
+      <w:proofErr w:type="spellEnd"/>
+      <w:r>
+        <w:t xml:space="preserve">) = 30, not 33. I mislabeled it 33 all along. </w:t>
+      </w:r>
+    </w:p>
+    <w:p>
+      <w:r>
+        <w:t xml:space="preserve">The </w:t>
+      </w:r>
+      <w:proofErr w:type="spellStart"/>
+      <w:r>
+        <w:t>obs</w:t>
+      </w:r>
+      <w:proofErr w:type="spellEnd"/>
+      <w:r>
+        <w:t xml:space="preserve"> is 30-D. (Amusingly the base net is also 30-D, but a different 30: clock14+ṗ_R12+λ4.)</w:t>
+      </w:r>
+    </w:p>
+    <w:p/>
+    <w:p>
+      <w:r>
+        <w:t xml:space="preserve">-in f2 warm start </w:t>
+      </w:r>
+      <w:proofErr w:type="gramStart"/>
+      <w:r>
+        <w:t>dagger :</w:t>
+      </w:r>
+      <w:proofErr w:type="gramEnd"/>
+      <w:r>
+        <w:t xml:space="preserve"> The DAgger aggregation is walking the system into ever-worse states and training the net on </w:t>
+      </w:r>
+    </w:p>
+    <w:p>
+      <w:proofErr w:type="gramStart"/>
+      <w:r>
+        <w:t>ever-more-explosive</w:t>
+      </w:r>
+      <w:proofErr w:type="gramEnd"/>
+      <w:r>
+        <w:t>, mostly-un-achievable targets (</w:t>
+      </w:r>
+      <w:proofErr w:type="spellStart"/>
+      <w:r>
+        <w:t>δf</w:t>
+      </w:r>
+      <w:proofErr w:type="spellEnd"/>
+      <w:r>
+        <w:t xml:space="preserve">* max ~5 N, but the cap only permits ~1–2 N). </w:t>
       </w:r>
     </w:p>
     <w:p>
@@ -681,41 +2101,101 @@
     </w:p>
     <w:p/>
     <w:p>
-      <w:r>
-        <w:t>what is  AR(1) Gaussian?</w:t>
-      </w:r>
-    </w:p>
-    <w:p>
-      <w:r>
-        <w:t>do we output mean only? or mean with std?</w:t>
-      </w:r>
-    </w:p>
-    <w:p/>
-    <w:p>
-      <w:r>
-        <w:t>I'm worried that the decoupling of the drones states from the laod state is making learning harder because the load is</w:t>
-      </w:r>
-    </w:p>
-    <w:p>
-      <w:r>
-        <w:t>stable even when the drones are struggling</w:t>
-      </w:r>
-    </w:p>
-    <w:p/>
-    <w:p>
-      <w:r>
-        <w:t>-understand failure mode of the desync and build the reward around it</w:t>
-      </w:r>
-    </w:p>
-    <w:p/>
-    <w:p>
-      <w:r>
-        <w:t xml:space="preserve">let me retry to rephrase this in my thinking </w:t>
-      </w:r>
-    </w:p>
-    <w:p>
-      <w:r>
-        <w:t xml:space="preserve">the problem with feeding noise and desynching , it causes the force to be noisy a bit and a bit "off" from what it's </w:t>
+      <w:proofErr w:type="gramStart"/>
+      <w:r>
+        <w:t>what</w:t>
+      </w:r>
+      <w:proofErr w:type="gramEnd"/>
+      <w:r>
+        <w:t xml:space="preserve"> is  AR(1) Gaussian?</w:t>
+      </w:r>
+    </w:p>
+    <w:p>
+      <w:proofErr w:type="gramStart"/>
+      <w:r>
+        <w:t>do</w:t>
+      </w:r>
+      <w:proofErr w:type="gramEnd"/>
+      <w:r>
+        <w:t xml:space="preserve"> we output mean only? </w:t>
+      </w:r>
+      <w:proofErr w:type="gramStart"/>
+      <w:r>
+        <w:t>or</w:t>
+      </w:r>
+      <w:proofErr w:type="gramEnd"/>
+      <w:r>
+        <w:t xml:space="preserve"> mean with </w:t>
+      </w:r>
+      <w:proofErr w:type="spellStart"/>
+      <w:r>
+        <w:t>std</w:t>
+      </w:r>
+      <w:proofErr w:type="spellEnd"/>
+      <w:r>
+        <w:t>?</w:t>
+      </w:r>
+    </w:p>
+    <w:p/>
+    <w:p>
+      <w:r>
+        <w:t xml:space="preserve">I'm worried that the decoupling of the drones states from the </w:t>
+      </w:r>
+      <w:proofErr w:type="spellStart"/>
+      <w:r>
+        <w:t>laod</w:t>
+      </w:r>
+      <w:proofErr w:type="spellEnd"/>
+      <w:r>
+        <w:t xml:space="preserve"> state is making learning harder because the load is</w:t>
+      </w:r>
+    </w:p>
+    <w:p>
+      <w:proofErr w:type="gramStart"/>
+      <w:r>
+        <w:t>stable</w:t>
+      </w:r>
+      <w:proofErr w:type="gramEnd"/>
+      <w:r>
+        <w:t xml:space="preserve"> even when the drones are struggling</w:t>
+      </w:r>
+    </w:p>
+    <w:p/>
+    <w:p>
+      <w:r>
+        <w:t xml:space="preserve">-understand failure mode of the </w:t>
+      </w:r>
+      <w:proofErr w:type="spellStart"/>
+      <w:r>
+        <w:t>desync</w:t>
+      </w:r>
+      <w:proofErr w:type="spellEnd"/>
+      <w:r>
+        <w:t xml:space="preserve"> and build the reward around it</w:t>
+      </w:r>
+    </w:p>
+    <w:p/>
+    <w:p>
+      <w:proofErr w:type="gramStart"/>
+      <w:r>
+        <w:t>let</w:t>
+      </w:r>
+      <w:proofErr w:type="gramEnd"/>
+      <w:r>
+        <w:t xml:space="preserve"> me retry to rephrase this in my thinking </w:t>
+      </w:r>
+    </w:p>
+    <w:p>
+      <w:r>
+        <w:t xml:space="preserve">the problem with feeding noise and </w:t>
+      </w:r>
+      <w:proofErr w:type="spellStart"/>
+      <w:r>
+        <w:t>desynching</w:t>
+      </w:r>
+      <w:proofErr w:type="spellEnd"/>
+      <w:r>
+        <w:t xml:space="preserve"> , it causes the force to be noisy a bit and a bit "off" from what it's </w:t>
       </w:r>
     </w:p>
     <w:p>
@@ -741,7 +2221,15 @@
     <w:p>
       <w:r>
         <w:lastRenderedPageBreak/>
-        <w:t xml:space="preserve">adding up and causing it to devaite and explode (basically you can't regress noise) , the only way to deal with this </w:t>
+        <w:t xml:space="preserve">adding up and causing it to </w:t>
+      </w:r>
+      <w:proofErr w:type="spellStart"/>
+      <w:r>
+        <w:t>devaite</w:t>
+      </w:r>
+      <w:proofErr w:type="spellEnd"/>
+      <w:r>
+        <w:t xml:space="preserve"> and explode (basically you can't regress noise) , the only way to deal with this </w:t>
       </w:r>
     </w:p>
     <w:p>
@@ -773,7 +2261,15 @@
     <w:p/>
     <w:p>
       <w:r>
-        <w:t xml:space="preserve">That's the thing regression can't express — it's a static input→output map with no closed-loop objective — </w:t>
+        <w:t xml:space="preserve">That's the thing regression can't express — it's a static </w:t>
+      </w:r>
+      <w:proofErr w:type="spellStart"/>
+      <w:r>
+        <w:t>input→output</w:t>
+      </w:r>
+      <w:proofErr w:type="spellEnd"/>
+      <w:r>
+        <w:t xml:space="preserve"> map with no closed-loop objective — </w:t>
       </w:r>
     </w:p>
     <w:p>
@@ -793,22 +2289,43 @@
     </w:p>
     <w:p/>
     <w:p>
-      <w:r>
-        <w:t xml:space="preserve">i don't know if warm starting helps or not in f2 </w:t>
-      </w:r>
-    </w:p>
-    <w:p/>
-    <w:p/>
-    <w:p>
-      <w:r>
-        <w:t>split the residual delta force to two components, one next to w and one in the nullspace(internal forces)</w:t>
-      </w:r>
-    </w:p>
-    <w:p/>
-    <w:p/>
-    <w:p>
-      <w:r>
-        <w:t xml:space="preserve">At stall_w=300, a v=0.1 dip costs 300·(0.25−0.1)² = 6.75/step — already way bigger than tracking (~0.05). </w:t>
+      <w:proofErr w:type="spellStart"/>
+      <w:r>
+        <w:t>i</w:t>
+      </w:r>
+      <w:proofErr w:type="spellEnd"/>
+      <w:r>
+        <w:t xml:space="preserve"> don't know if warm starting helps or not in f2 </w:t>
+      </w:r>
+    </w:p>
+    <w:p/>
+    <w:p/>
+    <w:p>
+      <w:r>
+        <w:t xml:space="preserve">split the residual delta force to two components, one next to w and one in the </w:t>
+      </w:r>
+      <w:proofErr w:type="spellStart"/>
+      <w:r>
+        <w:t>nullspace</w:t>
+      </w:r>
+      <w:proofErr w:type="spellEnd"/>
+      <w:r>
+        <w:t>(internal forces)</w:t>
+      </w:r>
+    </w:p>
+    <w:p/>
+    <w:p/>
+    <w:p>
+      <w:r>
+        <w:t xml:space="preserve">At </w:t>
+      </w:r>
+      <w:proofErr w:type="spellStart"/>
+      <w:r>
+        <w:t>stall_w</w:t>
+      </w:r>
+      <w:proofErr w:type="spellEnd"/>
+      <w:r>
+        <w:t xml:space="preserve">=300, a v=0.1 dip costs 300·(0.25−0.1)² = 6.75/step — already way bigger than tracking (~0.05). </w:t>
       </w:r>
     </w:p>
     <w:p>
@@ -862,34 +2379,138 @@
     <w:p/>
     <w:p>
       <w:r>
-        <w:t>Stall penalty is now stall_w·(d² + d) with d = relu(ε−v) — the linear term defends a margin above ε instead of only reacting</w:t>
-      </w:r>
-    </w:p>
-    <w:p>
-      <w:r>
-        <w:t xml:space="preserve">once deep. stall_w 300 → 400, and the first 20 steps are graced (spin-up from rest isn't a controllable stall, </w:t>
-      </w:r>
-    </w:p>
-    <w:p>
-      <w:r>
-        <w:t>so it's no longer penalized — that also lets the big weight not wreck team_ep_R). swing_w stays 0.</w:t>
-      </w:r>
-    </w:p>
-    <w:p/>
-    <w:p/>
-    <w:p>
-      <w:r>
-        <w:t xml:space="preserve">Foundation (the architecture that made any of it work): two-head residual [δλ nullspace + δw range], </w:t>
-      </w:r>
-    </w:p>
-    <w:p>
-      <w:r>
-        <w:t xml:space="preserve">clock in obs (44-D), time-indexed expert tracking, per-drone GAE, batch 10k→20k, deterministic held-out eval, </w:t>
-      </w:r>
-    </w:p>
-    <w:p>
-      <w:r>
-        <w:t>blowup guard, warm-start+resume. This broke the tracking-vs-load Pareto see-saw → fixed-scenario DET_loop 0.18, load calm.</w:t>
+        <w:t xml:space="preserve">Stall penalty is now </w:t>
+      </w:r>
+      <w:proofErr w:type="spellStart"/>
+      <w:r>
+        <w:t>stall_w</w:t>
+      </w:r>
+      <w:proofErr w:type="spellEnd"/>
+      <w:r>
+        <w:t xml:space="preserve">·(d² + d) with d = </w:t>
+      </w:r>
+      <w:proofErr w:type="spellStart"/>
+      <w:r>
+        <w:t>relu</w:t>
+      </w:r>
+      <w:proofErr w:type="spellEnd"/>
+      <w:r>
+        <w:t>(ε−v) — the linear term defends a margin above ε instead of only reacting</w:t>
+      </w:r>
+    </w:p>
+    <w:p>
+      <w:r>
+        <w:t xml:space="preserve">once deep. </w:t>
+      </w:r>
+      <w:proofErr w:type="spellStart"/>
+      <w:r>
+        <w:t>stall_w</w:t>
+      </w:r>
+      <w:proofErr w:type="spellEnd"/>
+      <w:r>
+        <w:t xml:space="preserve"> 300 → 400, and the first 20 steps are graced (spin-up from rest isn't a controllable stall, </w:t>
+      </w:r>
+    </w:p>
+    <w:p>
+      <w:r>
+        <w:t xml:space="preserve">so it's no longer penalized — that also lets the big weight not wreck </w:t>
+      </w:r>
+      <w:proofErr w:type="spellStart"/>
+      <w:r>
+        <w:t>team_ep_R</w:t>
+      </w:r>
+      <w:proofErr w:type="spellEnd"/>
+      <w:r>
+        <w:t xml:space="preserve">). </w:t>
+      </w:r>
+      <w:proofErr w:type="spellStart"/>
+      <w:r>
+        <w:t>swing_w</w:t>
+      </w:r>
+      <w:proofErr w:type="spellEnd"/>
+      <w:r>
+        <w:t xml:space="preserve"> stays 0.</w:t>
+      </w:r>
+    </w:p>
+    <w:p/>
+    <w:p/>
+    <w:p>
+      <w:r>
+        <w:t>Foundation (the architecture that made any of it work): two-head residual [</w:t>
+      </w:r>
+      <w:proofErr w:type="spellStart"/>
+      <w:r>
+        <w:t>δλ</w:t>
+      </w:r>
+      <w:proofErr w:type="spellEnd"/>
+      <w:r>
+        <w:t xml:space="preserve"> </w:t>
+      </w:r>
+      <w:proofErr w:type="spellStart"/>
+      <w:r>
+        <w:t>nullspace</w:t>
+      </w:r>
+      <w:proofErr w:type="spellEnd"/>
+      <w:r>
+        <w:t xml:space="preserve"> + </w:t>
+      </w:r>
+      <w:proofErr w:type="spellStart"/>
+      <w:r>
+        <w:t>δw</w:t>
+      </w:r>
+      <w:proofErr w:type="spellEnd"/>
+      <w:r>
+        <w:t xml:space="preserve"> range], </w:t>
+      </w:r>
+    </w:p>
+    <w:p>
+      <w:r>
+        <w:t xml:space="preserve">clock in </w:t>
+      </w:r>
+      <w:proofErr w:type="spellStart"/>
+      <w:r>
+        <w:t>obs</w:t>
+      </w:r>
+      <w:proofErr w:type="spellEnd"/>
+      <w:r>
+        <w:t xml:space="preserve"> (44-D), time-indexed expert tracking, per-drone GAE, batch 10k→20k, deterministic held-out </w:t>
+      </w:r>
+      <w:proofErr w:type="spellStart"/>
+      <w:r>
+        <w:t>eval</w:t>
+      </w:r>
+      <w:proofErr w:type="spellEnd"/>
+      <w:r>
+        <w:t xml:space="preserve">, </w:t>
+      </w:r>
+    </w:p>
+    <w:p>
+      <w:r>
+        <w:t xml:space="preserve">blowup guard, </w:t>
+      </w:r>
+      <w:proofErr w:type="spellStart"/>
+      <w:r>
+        <w:t>warm-start+resume</w:t>
+      </w:r>
+      <w:proofErr w:type="spellEnd"/>
+      <w:r>
+        <w:t>. This broke the tracking-</w:t>
+      </w:r>
+      <w:proofErr w:type="spellStart"/>
+      <w:r>
+        <w:t>vs</w:t>
+      </w:r>
+      <w:proofErr w:type="spellEnd"/>
+      <w:r>
+        <w:t xml:space="preserve">-load Pareto see-saw → fixed-scenario </w:t>
+      </w:r>
+      <w:proofErr w:type="spellStart"/>
+      <w:r>
+        <w:t>DET_loop</w:t>
+      </w:r>
+      <w:proofErr w:type="spellEnd"/>
+      <w:r>
+        <w:t xml:space="preserve"> 0.18, load calm.</w:t>
       </w:r>
     </w:p>
     <w:p/>
@@ -912,7 +2533,15 @@
     </w:p>
     <w:p>
       <w:r>
-        <w:t>the policy into slowing down → drones stalled, so we removed it, swing_w=0). Deep stalls mostly gone → better.</w:t>
+        <w:t xml:space="preserve">the policy into slowing down → drones stalled, so we removed it, </w:t>
+      </w:r>
+      <w:proofErr w:type="spellStart"/>
+      <w:r>
+        <w:t>swing_w</w:t>
+      </w:r>
+      <w:proofErr w:type="spellEnd"/>
+      <w:r>
+        <w:t>=0). Deep stalls mostly gone → better.</w:t>
       </w:r>
     </w:p>
     <w:p>
@@ -923,7 +2552,15 @@
     </w:p>
     <w:p>
       <w:r>
-        <w:t>(planned) + jerk smoothness (state-based) + ‖Σfᵢ</w:t>
+        <w:t>(planned) + jerk smoothness (state-based) + ‖</w:t>
+      </w:r>
+      <w:proofErr w:type="spellStart"/>
+      <w:r>
+        <w:t>Σf</w:t>
+      </w:r>
+      <w:proofErr w:type="spellEnd"/>
+      <w:r>
+        <w:t>ᵢ</w:t>
       </w:r>
       <w:r>
         <w:rPr>
@@ -938,7 +2575,15 @@
         <w:t>‖</w:t>
       </w:r>
       <w:r>
-        <w:t>² coordination/load-neutrality term; tune down manifold_w to a</w:t>
+        <w:t xml:space="preserve">² coordination/load-neutrality term; tune down </w:t>
+      </w:r>
+      <w:proofErr w:type="spellStart"/>
+      <w:r>
+        <w:t>manifold_w</w:t>
+      </w:r>
+      <w:proofErr w:type="spellEnd"/>
+      <w:r>
+        <w:t xml:space="preserve"> to a</w:t>
       </w:r>
     </w:p>
     <w:p>
@@ -986,7 +2631,15 @@
     </w:p>
     <w:p>
       <w:r>
-        <w:t>4 planned: jerk + ‖Σfᵢ</w:t>
+        <w:t>4 planned: jerk + ‖</w:t>
+      </w:r>
+      <w:proofErr w:type="spellStart"/>
+      <w:r>
+        <w:t>Σf</w:t>
+      </w:r>
+      <w:proofErr w:type="spellEnd"/>
+      <w:r>
+        <w:t>ᵢ</w:t>
       </w:r>
       <w:r>
         <w:rPr>
@@ -1001,7 +2654,15 @@
         <w:t>‖</w:t>
       </w:r>
       <w:r>
-        <w:t>² + tune down manifold_w. -&gt; didn't work</w:t>
+        <w:t xml:space="preserve">² + tune down </w:t>
+      </w:r>
+      <w:proofErr w:type="spellStart"/>
+      <w:r>
+        <w:t>manifold_w</w:t>
+      </w:r>
+      <w:proofErr w:type="spellEnd"/>
+      <w:r>
+        <w:t>. -&gt; didn't work</w:t>
       </w:r>
     </w:p>
     <w:p/>
@@ -1019,17 +2680,70 @@
     <w:p/>
     <w:p>
       <w:r>
-        <w:t>    The policy input (pR_dot + lambda_{t-1}) is reconstructed from the APPLIED</w:t>
-      </w:r>
-    </w:p>
-    <w:p>
-      <w:r>
-        <w:t>    (mixed) lambda history — the state distribution the policy actually visits.</w:t>
-      </w:r>
-    </w:p>
-    <w:p>
-      <w:r>
-        <w:t>i understand the idea of reconstructing prdot using the mixed lambda, but feeding the last mixed lambda in the lambda t-1 input feels kinda wrong idk why, it's supposed to know its own output no?</w:t>
+        <w:t>    The policy input (</w:t>
+      </w:r>
+      <w:proofErr w:type="spellStart"/>
+      <w:r>
+        <w:t>pR_dot</w:t>
+      </w:r>
+      <w:proofErr w:type="spellEnd"/>
+      <w:r>
+        <w:t xml:space="preserve"> + lambda</w:t>
+      </w:r>
+      <w:proofErr w:type="gramStart"/>
+      <w:r>
+        <w:t>_{</w:t>
+      </w:r>
+      <w:proofErr w:type="gramEnd"/>
+      <w:r>
+        <w:t>t-1}) is reconstructed from the APPLIED</w:t>
+      </w:r>
+    </w:p>
+    <w:p>
+      <w:r>
+        <w:t>    (</w:t>
+      </w:r>
+      <w:proofErr w:type="gramStart"/>
+      <w:r>
+        <w:t>mixed</w:t>
+      </w:r>
+      <w:proofErr w:type="gramEnd"/>
+      <w:r>
+        <w:t>) lambda history — the state distribution the policy actually visits.</w:t>
+      </w:r>
+    </w:p>
+    <w:p>
+      <w:proofErr w:type="spellStart"/>
+      <w:r>
+        <w:t>i</w:t>
+      </w:r>
+      <w:proofErr w:type="spellEnd"/>
+      <w:r>
+        <w:t xml:space="preserve"> understand the idea of reconstructing </w:t>
+      </w:r>
+      <w:proofErr w:type="spellStart"/>
+      <w:r>
+        <w:t>prdot</w:t>
+      </w:r>
+      <w:proofErr w:type="spellEnd"/>
+      <w:r>
+        <w:t xml:space="preserve"> using the mixed lambda, but feeding the last mixed lambda in the lambda t-1 input feels </w:t>
+      </w:r>
+      <w:proofErr w:type="spellStart"/>
+      <w:r>
+        <w:t>kinda</w:t>
+      </w:r>
+      <w:proofErr w:type="spellEnd"/>
+      <w:r>
+        <w:t xml:space="preserve"> wrong </w:t>
+      </w:r>
+      <w:proofErr w:type="spellStart"/>
+      <w:r>
+        <w:t>idk</w:t>
+      </w:r>
+      <w:proofErr w:type="spellEnd"/>
+      <w:r>
+        <w:t xml:space="preserve"> why, it's supposed to know its own output no?</w:t>
       </w:r>
     </w:p>
     <w:p/>
@@ -1074,7 +2788,29 @@
           <w:szCs w:val="24"/>
           <w14:ligatures w14:val="none"/>
         </w:rPr>
-        <w:t>. The network receives a feature vector where the kinematics ($\mathbf{p\dot{R}}$) say the cable tensions were at level $A$, but the state label ($\lambda_{t-1}$) claims they were at level $B$.</w:t>
+        <w:t>. The network receives a feature vector where the kinematics ($\</w:t>
+      </w:r>
+      <w:proofErr w:type="spellStart"/>
+      <w:r>
+        <w:rPr>
+          <w:rFonts w:ascii="Times New Roman" w:eastAsia="Times New Roman" w:hAnsi="Times New Roman" w:cs="Times New Roman"/>
+          <w:kern w:val="0"/>
+          <w:sz w:val="24"/>
+          <w:szCs w:val="24"/>
+          <w14:ligatures w14:val="none"/>
+        </w:rPr>
+        <w:t>mathbf</w:t>
+      </w:r>
+      <w:proofErr w:type="spellEnd"/>
+      <w:r>
+        <w:rPr>
+          <w:rFonts w:ascii="Times New Roman" w:eastAsia="Times New Roman" w:hAnsi="Times New Roman" w:cs="Times New Roman"/>
+          <w:kern w:val="0"/>
+          <w:sz w:val="24"/>
+          <w:szCs w:val="24"/>
+          <w14:ligatures w14:val="none"/>
+        </w:rPr>
+        <w:t>{p\dot{R}}$) say the cable tensions were at level $A$, but the state label ($\lambda_{t-1}$) claims they were at level $B$.</w:t>
       </w:r>
     </w:p>
     <w:p>
@@ -1244,7 +2980,29 @@
           <w:szCs w:val="24"/>
           <w14:ligatures w14:val="none"/>
         </w:rPr>
-        <w:t xml:space="preserve">Because the true physical state of the drones and payload at step $t$ was generated by $\lambda_{\text{applied}, t-1}$, the observation $S_t$ must reflect what </w:t>
+        <w:t>Because the true physical state of the drones and payload at step $t$ was generated by $\lambda_{\text{applied}, t-1}$, the observation $</w:t>
+      </w:r>
+      <w:proofErr w:type="spellStart"/>
+      <w:r>
+        <w:rPr>
+          <w:rFonts w:ascii="Times New Roman" w:eastAsia="Times New Roman" w:hAnsi="Times New Roman" w:cs="Times New Roman"/>
+          <w:kern w:val="0"/>
+          <w:sz w:val="24"/>
+          <w:szCs w:val="24"/>
+          <w14:ligatures w14:val="none"/>
+        </w:rPr>
+        <w:t>S_t</w:t>
+      </w:r>
+      <w:proofErr w:type="spellEnd"/>
+      <w:r>
+        <w:rPr>
+          <w:rFonts w:ascii="Times New Roman" w:eastAsia="Times New Roman" w:hAnsi="Times New Roman" w:cs="Times New Roman"/>
+          <w:kern w:val="0"/>
+          <w:sz w:val="24"/>
+          <w:szCs w:val="24"/>
+          <w14:ligatures w14:val="none"/>
+        </w:rPr>
+        <w:t xml:space="preserve">$ must reflect what </w:t>
       </w:r>
       <w:r>
         <w:rPr>
@@ -1320,12 +3078,44 @@
     </w:p>
     <w:p>
       <w:r>
-        <w:t>Why not just t, well I was worried the network will use it to memorize actions vs time directly(in the beginning I was using just one trajectory)</w:t>
-      </w:r>
-    </w:p>
-    <w:p>
-      <w:r>
-        <w:t>Saw tooth time(mod t) didn’t occur to me because I was looking at lambda and lambda dot so using sin and cos was the obvious choice</w:t>
+        <w:t xml:space="preserve">Why not just t, well I was worried the network will use it to memorize actions </w:t>
+      </w:r>
+      <w:proofErr w:type="spellStart"/>
+      <w:r>
+        <w:t>vs</w:t>
+      </w:r>
+      <w:proofErr w:type="spellEnd"/>
+      <w:r>
+        <w:t xml:space="preserve"> time </w:t>
+      </w:r>
+      <w:proofErr w:type="gramStart"/>
+      <w:r>
+        <w:t>directly(</w:t>
+      </w:r>
+      <w:proofErr w:type="gramEnd"/>
+      <w:r>
+        <w:t>in the beginning I was using just one trajectory)</w:t>
+      </w:r>
+    </w:p>
+    <w:p>
+      <w:r>
+        <w:t xml:space="preserve">Saw tooth </w:t>
+      </w:r>
+      <w:proofErr w:type="gramStart"/>
+      <w:r>
+        <w:t>time(</w:t>
+      </w:r>
+      <w:proofErr w:type="gramEnd"/>
+      <w:r>
+        <w:t xml:space="preserve">mod t) didn’t occur to me because I was looking at lambda and lambda dot so using sin and </w:t>
+      </w:r>
+      <w:proofErr w:type="spellStart"/>
+      <w:r>
+        <w:t>cos</w:t>
+      </w:r>
+      <w:proofErr w:type="spellEnd"/>
+      <w:r>
+        <w:t xml:space="preserve"> was the obvious choice</w:t>
       </w:r>
     </w:p>
     <w:p/>
@@ -1365,7 +3155,23 @@
           <w:sz w:val="36"/>
           <w:szCs w:val="36"/>
         </w:rPr>
-        <w:t>1 – net is started from random weights, this is wasting a lot of epochs to relearn stuff that can already exist in the old net -&gt; warm starting</w:t>
+        <w:t xml:space="preserve">1 – </w:t>
+      </w:r>
+      <w:proofErr w:type="gramStart"/>
+      <w:r>
+        <w:rPr>
+          <w:sz w:val="36"/>
+          <w:szCs w:val="36"/>
+        </w:rPr>
+        <w:t>net</w:t>
+      </w:r>
+      <w:proofErr w:type="gramEnd"/>
+      <w:r>
+        <w:rPr>
+          <w:sz w:val="36"/>
+          <w:szCs w:val="36"/>
+        </w:rPr>
+        <w:t xml:space="preserve"> is started from random weights, this is wasting a lot of epochs to relearn stuff that can already exist in the old net -&gt; warm starting</w:t>
       </w:r>
     </w:p>
     <w:p>
@@ -1401,7 +3207,21 @@
         <w:rPr>
           <w:rStyle w:val="math-inline"/>
         </w:rPr>
-        <w:t>$\mu_k$</w:t>
+        <w:t>$\</w:t>
+      </w:r>
+      <w:proofErr w:type="spellStart"/>
+      <w:r>
+        <w:rPr>
+          <w:rStyle w:val="math-inline"/>
+        </w:rPr>
+        <w:t>mu_k</w:t>
+      </w:r>
+      <w:proofErr w:type="spellEnd"/>
+      <w:r>
+        <w:rPr>
+          <w:rStyle w:val="math-inline"/>
+        </w:rPr>
+        <w:t>$</w:t>
       </w:r>
       <w:r>
         <w:t>) and standard deviation (</w:t>
@@ -1410,7 +3230,21 @@
         <w:rPr>
           <w:rStyle w:val="math-inline"/>
         </w:rPr>
-        <w:t>$\sigma_k$</w:t>
+        <w:t>$\</w:t>
+      </w:r>
+      <w:proofErr w:type="spellStart"/>
+      <w:r>
+        <w:rPr>
+          <w:rStyle w:val="math-inline"/>
+        </w:rPr>
+        <w:t>sigma_k</w:t>
+      </w:r>
+      <w:proofErr w:type="spellEnd"/>
+      <w:r>
+        <w:rPr>
+          <w:rStyle w:val="math-inline"/>
+        </w:rPr>
+        <w:t>$</w:t>
       </w:r>
       <w:r>
         <w:t>) of the dataset:</w:t>
@@ -1418,7 +3252,44 @@
     </w:p>
     <w:p>
       <w:r>
-        <w:t>$$X_n^{(k)} = \frac{X - \mu_k}{\sigma_k + \epsilon}$$</w:t>
+        <w:t>$$</w:t>
+      </w:r>
+      <w:proofErr w:type="spellStart"/>
+      <w:r>
+        <w:t>X_n</w:t>
+      </w:r>
+      <w:proofErr w:type="spellEnd"/>
+      <w:proofErr w:type="gramStart"/>
+      <w:r>
+        <w:t>^{</w:t>
+      </w:r>
+      <w:proofErr w:type="gramEnd"/>
+      <w:r>
+        <w:t>(k)} = \</w:t>
+      </w:r>
+      <w:proofErr w:type="spellStart"/>
+      <w:r>
+        <w:t>frac</w:t>
+      </w:r>
+      <w:proofErr w:type="spellEnd"/>
+      <w:r>
+        <w:t>{X - \</w:t>
+      </w:r>
+      <w:proofErr w:type="spellStart"/>
+      <w:r>
+        <w:t>mu_k</w:t>
+      </w:r>
+      <w:proofErr w:type="spellEnd"/>
+      <w:r>
+        <w:t>}{\</w:t>
+      </w:r>
+      <w:proofErr w:type="spellStart"/>
+      <w:r>
+        <w:t>sigma_k</w:t>
+      </w:r>
+      <w:proofErr w:type="spellEnd"/>
+      <w:r>
+        <w:t xml:space="preserve"> + \epsilon}$$</w:t>
       </w:r>
     </w:p>
     <w:p>
@@ -1442,7 +3313,21 @@
         <w:rPr>
           <w:rStyle w:val="math-inline"/>
         </w:rPr>
-        <w:t>$(\mu_{k-1}, \sigma_{k-1})$</w:t>
+        <w:t>$(\mu</w:t>
+      </w:r>
+      <w:proofErr w:type="gramStart"/>
+      <w:r>
+        <w:rPr>
+          <w:rStyle w:val="math-inline"/>
+        </w:rPr>
+        <w:t>_{</w:t>
+      </w:r>
+      <w:proofErr w:type="gramEnd"/>
+      <w:r>
+        <w:rPr>
+          <w:rStyle w:val="math-inline"/>
+        </w:rPr>
+        <w:t>k-1}, \sigma_{k-1})$</w:t>
       </w:r>
       <w:r>
         <w:t>.</w:t>
@@ -1469,7 +3354,21 @@
         <w:rPr>
           <w:rStyle w:val="math-inline"/>
         </w:rPr>
-        <w:t>$W_{k-1}$</w:t>
+        <w:t>$W</w:t>
+      </w:r>
+      <w:proofErr w:type="gramStart"/>
+      <w:r>
+        <w:rPr>
+          <w:rStyle w:val="math-inline"/>
+        </w:rPr>
+        <w:t>_{</w:t>
+      </w:r>
+      <w:proofErr w:type="gramEnd"/>
+      <w:r>
+        <w:rPr>
+          <w:rStyle w:val="math-inline"/>
+        </w:rPr>
+        <w:t>k-1}$</w:t>
       </w:r>
       <w:r>
         <w:t>, those initial layers receive activations they were never calibrated for. Warm-starting on shifted inputs often leads to erratic gradient spikes during early fine-tuning epochs.</w:t>
@@ -1477,8 +3376,15 @@
     </w:p>
     <w:p>
       <w:r>
-        <w:t>The solution to this is to either eat the cost, whatever, train for an extra epoch or two, still better than random weights or scale the first layer weights using the old and new mean and std</w:t>
-      </w:r>
+        <w:t xml:space="preserve">The solution to this is to either eat the cost, whatever, train for an extra epoch or two, still better than random weights or scale the first layer weights using the old and new mean and </w:t>
+      </w:r>
+      <w:proofErr w:type="spellStart"/>
+      <w:proofErr w:type="gramStart"/>
+      <w:r>
+        <w:t>std</w:t>
+      </w:r>
+      <w:proofErr w:type="spellEnd"/>
+      <w:proofErr w:type="gramEnd"/>
     </w:p>
     <w:p>
       <w:pPr>
@@ -1499,7 +3405,21 @@
         <w:rPr>
           <w:rStyle w:val="math-inline"/>
         </w:rPr>
-        <w:t>$D_{\text{old}}$</w:t>
+        <w:t>$D</w:t>
+      </w:r>
+      <w:proofErr w:type="gramStart"/>
+      <w:r>
+        <w:rPr>
+          <w:rStyle w:val="math-inline"/>
+        </w:rPr>
+        <w:t>_{</w:t>
+      </w:r>
+      <w:proofErr w:type="gramEnd"/>
+      <w:r>
+        <w:rPr>
+          <w:rStyle w:val="math-inline"/>
+        </w:rPr>
+        <w:t>\text{old}}$</w:t>
       </w:r>
       <w:r>
         <w:t xml:space="preserve"> (e.g., 50,000 samples) heavily outweighs the newly added rollout data </w:t>
@@ -1516,7 +3436,23 @@
     </w:p>
     <w:p>
       <w:r>
-        <w:t>you don’t learn much from the new data, especially toward the latter DAgger iterations which matter the most, this still happens anyway when training from scratch but I guess warm starting makes it even worse(esp with a small learning rate, I get stuck in the same local minima. With a big learning rate I kinda destroy the features I already learnt and it becomes hard to fine tune anyway, so maybe a dynamic learning rate becomes needed)</w:t>
+        <w:t>you don’t learn much from the new data, especially toward the latter DAgger iterations which matter the most, this still happens anyway when training from scratch but I guess warm starting makes it even worse(</w:t>
+      </w:r>
+      <w:proofErr w:type="spellStart"/>
+      <w:r>
+        <w:t>esp</w:t>
+      </w:r>
+      <w:proofErr w:type="spellEnd"/>
+      <w:r>
+        <w:t xml:space="preserve"> with a small learning rate, I get stuck in the same local minima. With a big learning rate I </w:t>
+      </w:r>
+      <w:proofErr w:type="spellStart"/>
+      <w:r>
+        <w:t>kinda</w:t>
+      </w:r>
+      <w:proofErr w:type="spellEnd"/>
+      <w:r>
+        <w:t xml:space="preserve"> destroy the features I already learnt and it becomes hard to fine tune anyway, so maybe a dynamic learning rate becomes needed)</w:t>
       </w:r>
     </w:p>
     <w:p>
@@ -1570,11 +3506,16 @@
       </w:r>
     </w:p>
     <w:p>
+      <w:proofErr w:type="gramStart"/>
       <w:r>
         <w:t>t</w:t>
       </w:r>
       <w:r>
-        <w:t>he states that actually matter for fixing covariate shift are the ones near beta≈0, where the policy is driving and visiting states the original expert-only collection never saw. Those are exactly the hard, informative, off-manifold corrections DAgger exists to generate. Weighting all iterations equally means the redundant near-duplicate early data dilutes the training signal from the harder, more valuable late-round data.</w:t>
+        <w:t>he</w:t>
+      </w:r>
+      <w:proofErr w:type="gramEnd"/>
+      <w:r>
+        <w:t xml:space="preserve"> states that actually matter for fixing covariate shift are the ones near beta≈0, where the policy is driving and visiting states the original expert-only collection never saw. Those are exactly the hard, informative, off-manifold corrections DAgger exists to generate. Weighting all iterations equally means the redundant near-duplicate early data dilutes the training signal from the harder, more valuable late-round data.</w:t>
       </w:r>
     </w:p>
     <w:p/>
@@ -1696,21 +3637,59 @@
           <w:szCs w:val="24"/>
           <w14:ligatures w14:val="none"/>
         </w:rPr>
-        <w:t>Because the rollouts at $\beta = 0$ naturally contain nominal tracking states alongside its own micro-corrections, over-indexing on recent $\beta = 0$ data (like an 80/20 split or a aggressive rolling buffer) directly optimizes the policy on its actual deployment manifold.</w:t>
-      </w:r>
-    </w:p>
-    <w:p/>
-    <w:p>
-      <w:pPr>
-        <w:rPr>
-          <w:lang w:bidi="ar-EG"/>
-        </w:rPr>
-      </w:pPr>
-      <w:r>
-        <w:rPr>
-          <w:lang w:bidi="ar-EG"/>
-        </w:rPr>
-        <w:t>there's value to reducing the dataset size especially when generalizing, i don't care if the net forgets a bit the old data</w:t>
+        <w:t xml:space="preserve">Because the rollouts at $\beta = 0$ naturally contain nominal tracking states alongside its own micro-corrections, over-indexing on recent $\beta = 0$ data (like an 80/20 split or </w:t>
+      </w:r>
+      <w:proofErr w:type="spellStart"/>
+      <w:proofErr w:type="gramStart"/>
+      <w:r>
+        <w:rPr>
+          <w:rFonts w:ascii="Times New Roman" w:eastAsia="Times New Roman" w:hAnsi="Times New Roman" w:cs="Times New Roman"/>
+          <w:kern w:val="0"/>
+          <w:sz w:val="24"/>
+          <w:szCs w:val="24"/>
+          <w14:ligatures w14:val="none"/>
+        </w:rPr>
+        <w:t>a</w:t>
+      </w:r>
+      <w:proofErr w:type="spellEnd"/>
+      <w:proofErr w:type="gramEnd"/>
+      <w:r>
+        <w:rPr>
+          <w:rFonts w:ascii="Times New Roman" w:eastAsia="Times New Roman" w:hAnsi="Times New Roman" w:cs="Times New Roman"/>
+          <w:kern w:val="0"/>
+          <w:sz w:val="24"/>
+          <w:szCs w:val="24"/>
+          <w14:ligatures w14:val="none"/>
+        </w:rPr>
+        <w:t xml:space="preserve"> aggressive rolling buffer) directly optimizes the policy on its actual deployment manifold.</w:t>
+      </w:r>
+    </w:p>
+    <w:p/>
+    <w:p>
+      <w:pPr>
+        <w:rPr>
+          <w:lang w:bidi="ar-EG"/>
+        </w:rPr>
+      </w:pPr>
+      <w:r>
+        <w:rPr>
+          <w:lang w:bidi="ar-EG"/>
+        </w:rPr>
+        <w:t xml:space="preserve">there's value to reducing the dataset size especially when generalizing, </w:t>
+      </w:r>
+      <w:proofErr w:type="spellStart"/>
+      <w:r>
+        <w:rPr>
+          <w:lang w:bidi="ar-EG"/>
+        </w:rPr>
+        <w:t>i</w:t>
+      </w:r>
+      <w:proofErr w:type="spellEnd"/>
+      <w:r>
+        <w:rPr>
+          <w:lang w:bidi="ar-EG"/>
+        </w:rPr>
+        <w:t xml:space="preserve"> don't care if the net forgets a bit the old data</w:t>
       </w:r>
       <w:r>
         <w:rPr>
@@ -1734,13 +3713,41 @@
         <w:rPr>
           <w:lang w:bidi="ar-EG"/>
         </w:rPr>
-        <w:t>, it was generated with more help from the expert that won't exist in the future, as long as it does well on the new data then it's good, to clarify my point, the last two iterations are closed loop control of the policy on its own, if it does well there, then we don't need to worry about anything else, but even if, let's say we want to keep some some of the old data</w:t>
-      </w:r>
-      <w:r>
-        <w:rPr>
-          <w:lang w:bidi="ar-EG"/>
-        </w:rPr>
-        <w:t>. For reasons that it shows the net how to recover from really bad states that it won’t generate when it’s fully trained, If for some reason it visits them somehow, then it makes sense to only keep part of the old data for example 20% old data + 80% new data(all the new data but it will be 80% of the total dataset size)</w:t>
+        <w:t xml:space="preserve">, it was generated with more help from the expert that won't exist in the future, as long as it does well on the new data then it's good, to clarify my point, the last two iterations are closed loop control of the policy on its own, if it does well there, then we don't need to worry about anything else, but even if, let's say we want to keep some </w:t>
+      </w:r>
+      <w:proofErr w:type="spellStart"/>
+      <w:r>
+        <w:rPr>
+          <w:lang w:bidi="ar-EG"/>
+        </w:rPr>
+        <w:t>some</w:t>
+      </w:r>
+      <w:proofErr w:type="spellEnd"/>
+      <w:r>
+        <w:rPr>
+          <w:lang w:bidi="ar-EG"/>
+        </w:rPr>
+        <w:t xml:space="preserve"> of the old data</w:t>
+      </w:r>
+      <w:r>
+        <w:rPr>
+          <w:lang w:bidi="ar-EG"/>
+        </w:rPr>
+        <w:t xml:space="preserve">. For reasons that it shows the net how to recover from really bad states that it won’t generate when it’s fully trained, If for some reason it visits them somehow, then it makes sense to only keep part of the old data for example 20% old data + 80% new </w:t>
+      </w:r>
+      <w:proofErr w:type="gramStart"/>
+      <w:r>
+        <w:rPr>
+          <w:lang w:bidi="ar-EG"/>
+        </w:rPr>
+        <w:t>data(</w:t>
+      </w:r>
+      <w:proofErr w:type="gramEnd"/>
+      <w:r>
+        <w:rPr>
+          <w:lang w:bidi="ar-EG"/>
+        </w:rPr>
+        <w:t>all the new data but it will be 80% of the total dataset size)</w:t>
       </w:r>
     </w:p>
     <w:p>
@@ -1823,7 +3830,19 @@
         <w:rPr>
           <w:lang w:bidi="ar-EG"/>
         </w:rPr>
-        <w:t>Stratifying and binning: guarantee diversity by classifying points based on maneuver location (loitering, turning, moving in a straight line...etc.) and take a certain percentage from each bin, the percentage can be determined by a hardness score for the bin for example</w:t>
+        <w:t>Stratifying and binning: guarantee diversity by classifying points based on maneuver location (loitering, turning, moving in a straight line...etc.</w:t>
+      </w:r>
+      <w:r>
+        <w:rPr>
+          <w:lang w:bidi="ar-EG"/>
+        </w:rPr>
+        <w:t xml:space="preserve"> Done by reference velocity and acceleration</w:t>
+      </w:r>
+      <w:r>
+        <w:rPr>
+          <w:lang w:bidi="ar-EG"/>
+        </w:rPr>
+        <w:t>) and take a certain percentage from each bin, the percentage can be determined by a hardness score for the bin for example</w:t>
       </w:r>
     </w:p>
     <w:p>
@@ -1865,6 +3884,1120 @@
       </w:r>
       <w:r>
         <w:t xml:space="preserve">. </w:t>
+      </w:r>
+      <w:r>
+        <w:rPr>
+          <w:rFonts w:hint="cs"/>
+          <w:rtl/>
+          <w:lang w:bidi="ar-EG"/>
+        </w:rPr>
+        <w:t xml:space="preserve"> 0</w:t>
+      </w:r>
+    </w:p>
+    <w:p>
+      <w:pPr>
+        <w:rPr>
+          <w:lang w:bidi="ar-EG"/>
+        </w:rPr>
+      </w:pPr>
+    </w:p>
+    <w:p>
+      <w:pPr>
+        <w:rPr>
+          <w:lang w:bidi="ar-EG"/>
+        </w:rPr>
+      </w:pPr>
+    </w:p>
+    <w:p>
+      <w:pPr>
+        <w:rPr>
+          <w:lang w:bidi="ar-EG"/>
+        </w:rPr>
+      </w:pPr>
+      <w:r>
+        <w:rPr>
+          <w:lang w:bidi="ar-EG"/>
+        </w:rPr>
+        <w:t xml:space="preserve">Applying the filter without including it in the training is strange, like we try to minimize MSE in training and then we say ok we’re not </w:t>
+      </w:r>
+      <w:proofErr w:type="spellStart"/>
+      <w:r>
+        <w:rPr>
+          <w:lang w:bidi="ar-EG"/>
+        </w:rPr>
+        <w:t>gonna</w:t>
+      </w:r>
+      <w:proofErr w:type="spellEnd"/>
+      <w:r>
+        <w:rPr>
+          <w:lang w:bidi="ar-EG"/>
+        </w:rPr>
+        <w:t xml:space="preserve"> apply that actually we’re </w:t>
+      </w:r>
+      <w:proofErr w:type="spellStart"/>
+      <w:r>
+        <w:rPr>
+          <w:lang w:bidi="ar-EG"/>
+        </w:rPr>
+        <w:t>gonna</w:t>
+      </w:r>
+      <w:proofErr w:type="spellEnd"/>
+      <w:r>
+        <w:rPr>
+          <w:lang w:bidi="ar-EG"/>
+        </w:rPr>
+        <w:t xml:space="preserve"> filter it, in my mind MSE should be on the final output, which includes the filter. But yea it helps the net a lot. I would like to understand why and how it works</w:t>
+      </w:r>
+    </w:p>
+    <w:p>
+      <w:pPr>
+        <w:rPr>
+          <w:lang w:bidi="ar-EG"/>
+        </w:rPr>
+      </w:pPr>
+    </w:p>
+    <w:p>
+      <w:pPr>
+        <w:rPr>
+          <w:lang w:bidi="ar-EG"/>
+        </w:rPr>
+      </w:pPr>
+      <w:r>
+        <w:rPr>
+          <w:lang w:bidi="ar-EG"/>
+        </w:rPr>
+        <w:t xml:space="preserve">1 - A and </w:t>
+      </w:r>
+      <w:proofErr w:type="spellStart"/>
+      <w:r>
+        <w:rPr>
+          <w:lang w:bidi="ar-EG"/>
+        </w:rPr>
+        <w:t>ksi</w:t>
+      </w:r>
+      <w:proofErr w:type="spellEnd"/>
+      <w:r>
+        <w:rPr>
+          <w:lang w:bidi="ar-EG"/>
+        </w:rPr>
+        <w:t xml:space="preserve"> are </w:t>
+      </w:r>
+      <w:proofErr w:type="spellStart"/>
+      <w:r>
+        <w:rPr>
+          <w:lang w:bidi="ar-EG"/>
+        </w:rPr>
+        <w:t>non decreasing</w:t>
+      </w:r>
+      <w:proofErr w:type="spellEnd"/>
+      <w:r>
+        <w:rPr>
+          <w:lang w:bidi="ar-EG"/>
+        </w:rPr>
+        <w:t xml:space="preserve"> yes, that's intentional, but it's not true that every once in a while </w:t>
+      </w:r>
+      <w:proofErr w:type="spellStart"/>
+      <w:r>
+        <w:rPr>
+          <w:lang w:bidi="ar-EG"/>
+        </w:rPr>
+        <w:t>prdot</w:t>
+      </w:r>
+      <w:proofErr w:type="spellEnd"/>
+      <w:r>
+        <w:rPr>
+          <w:lang w:bidi="ar-EG"/>
+        </w:rPr>
+        <w:t xml:space="preserve"> hits 0 , not true at all, </w:t>
+      </w:r>
+      <w:proofErr w:type="spellStart"/>
+      <w:r>
+        <w:rPr>
+          <w:lang w:bidi="ar-EG"/>
+        </w:rPr>
+        <w:t>i</w:t>
+      </w:r>
+      <w:proofErr w:type="spellEnd"/>
+      <w:r>
+        <w:rPr>
+          <w:lang w:bidi="ar-EG"/>
+        </w:rPr>
+        <w:t xml:space="preserve"> can see their plots, in this graph they don't get close to 0 at all, they should only go up when it's needed, </w:t>
+      </w:r>
+      <w:proofErr w:type="spellStart"/>
+      <w:r>
+        <w:rPr>
+          <w:lang w:bidi="ar-EG"/>
+        </w:rPr>
+        <w:t>i</w:t>
+      </w:r>
+      <w:proofErr w:type="spellEnd"/>
+      <w:r>
+        <w:rPr>
+          <w:lang w:bidi="ar-EG"/>
+        </w:rPr>
+        <w:t xml:space="preserve"> see they're going up all the time</w:t>
+      </w:r>
+    </w:p>
+    <w:p>
+      <w:pPr>
+        <w:rPr>
+          <w:lang w:bidi="ar-EG"/>
+        </w:rPr>
+      </w:pPr>
+      <w:r>
+        <w:rPr>
+          <w:lang w:bidi="ar-EG"/>
+        </w:rPr>
+        <w:t xml:space="preserve">2 - </w:t>
+      </w:r>
+      <w:proofErr w:type="gramStart"/>
+      <w:r>
+        <w:rPr>
+          <w:lang w:bidi="ar-EG"/>
+        </w:rPr>
+        <w:t>the</w:t>
+      </w:r>
+      <w:proofErr w:type="gramEnd"/>
+      <w:r>
+        <w:rPr>
+          <w:lang w:bidi="ar-EG"/>
+        </w:rPr>
+        <w:t xml:space="preserve"> clock features are absolutely necessary , the load and drone velocity is not enough because during loitering we can have the same load position and drone </w:t>
+      </w:r>
+      <w:proofErr w:type="spellStart"/>
+      <w:r>
+        <w:rPr>
+          <w:lang w:bidi="ar-EG"/>
+        </w:rPr>
+        <w:t>vel</w:t>
+      </w:r>
+      <w:proofErr w:type="spellEnd"/>
+      <w:r>
+        <w:rPr>
+          <w:lang w:bidi="ar-EG"/>
+        </w:rPr>
+        <w:t xml:space="preserve"> but different lambda, it needs a way to access time / periodicity without learning to memorize </w:t>
+      </w:r>
+    </w:p>
+    <w:p>
+      <w:pPr>
+        <w:rPr>
+          <w:lang w:bidi="ar-EG"/>
+        </w:rPr>
+      </w:pPr>
+      <w:r>
+        <w:rPr>
+          <w:lang w:bidi="ar-EG"/>
+        </w:rPr>
+        <w:t xml:space="preserve"> </w:t>
+      </w:r>
+      <w:proofErr w:type="spellStart"/>
+      <w:r>
+        <w:rPr>
+          <w:lang w:bidi="ar-EG"/>
+        </w:rPr>
+        <w:t>i</w:t>
+      </w:r>
+      <w:proofErr w:type="spellEnd"/>
+      <w:r>
+        <w:rPr>
+          <w:lang w:bidi="ar-EG"/>
+        </w:rPr>
+        <w:t xml:space="preserve"> have many frequencies because </w:t>
+      </w:r>
+      <w:proofErr w:type="spellStart"/>
+      <w:r>
+        <w:rPr>
+          <w:lang w:bidi="ar-EG"/>
+        </w:rPr>
+        <w:t>ksi</w:t>
+      </w:r>
+      <w:proofErr w:type="spellEnd"/>
+      <w:r>
+        <w:rPr>
+          <w:lang w:bidi="ar-EG"/>
+        </w:rPr>
+        <w:t xml:space="preserve"> can change from trajectory to another and within the same trajectory so it needs to learn to switch to a higher frequency and time itself using it but only conditioned on </w:t>
+      </w:r>
+      <w:proofErr w:type="spellStart"/>
+      <w:r>
+        <w:rPr>
+          <w:lang w:bidi="ar-EG"/>
+        </w:rPr>
+        <w:t>prdot</w:t>
+      </w:r>
+      <w:proofErr w:type="spellEnd"/>
+      <w:r>
+        <w:rPr>
+          <w:lang w:bidi="ar-EG"/>
+        </w:rPr>
+        <w:t xml:space="preserve"> hitting epsilon, the idea was, if in some trajectories A and </w:t>
+      </w:r>
+      <w:proofErr w:type="spellStart"/>
+      <w:r>
+        <w:rPr>
+          <w:lang w:bidi="ar-EG"/>
+        </w:rPr>
+        <w:t>ksi</w:t>
+      </w:r>
+      <w:proofErr w:type="spellEnd"/>
+      <w:r>
+        <w:rPr>
+          <w:lang w:bidi="ar-EG"/>
+        </w:rPr>
+        <w:t xml:space="preserve"> change during the trajectory based on </w:t>
+      </w:r>
+      <w:proofErr w:type="spellStart"/>
+      <w:r>
+        <w:rPr>
+          <w:lang w:bidi="ar-EG"/>
+        </w:rPr>
+        <w:t>prdot</w:t>
+      </w:r>
+      <w:proofErr w:type="spellEnd"/>
+      <w:r>
+        <w:rPr>
+          <w:lang w:bidi="ar-EG"/>
+        </w:rPr>
+        <w:t xml:space="preserve">, it will learn to copy that, if in some other trajectories A and </w:t>
+      </w:r>
+      <w:proofErr w:type="spellStart"/>
+      <w:r>
+        <w:rPr>
+          <w:lang w:bidi="ar-EG"/>
+        </w:rPr>
+        <w:t>ksi</w:t>
+      </w:r>
+      <w:proofErr w:type="spellEnd"/>
+      <w:r>
+        <w:rPr>
+          <w:lang w:bidi="ar-EG"/>
+        </w:rPr>
+        <w:t xml:space="preserve"> remain constant, then it will be forced to learn the dependency on </w:t>
+      </w:r>
+      <w:proofErr w:type="spellStart"/>
+      <w:r>
+        <w:rPr>
+          <w:lang w:bidi="ar-EG"/>
+        </w:rPr>
+        <w:t>prdot</w:t>
+      </w:r>
+      <w:proofErr w:type="spellEnd"/>
+      <w:r>
+        <w:rPr>
+          <w:lang w:bidi="ar-EG"/>
+        </w:rPr>
+        <w:t xml:space="preserve"> not on time, to further protect, we might look into adding trajectories that extend beyond any time marking, </w:t>
+      </w:r>
+      <w:proofErr w:type="spellStart"/>
+      <w:r>
+        <w:rPr>
+          <w:lang w:bidi="ar-EG"/>
+        </w:rPr>
+        <w:t>i</w:t>
+      </w:r>
+      <w:proofErr w:type="spellEnd"/>
+      <w:r>
+        <w:rPr>
+          <w:lang w:bidi="ar-EG"/>
+        </w:rPr>
+        <w:t xml:space="preserve"> think currently we mark until t = 25? </w:t>
+      </w:r>
+      <w:proofErr w:type="gramStart"/>
+      <w:r>
+        <w:rPr>
+          <w:lang w:bidi="ar-EG"/>
+        </w:rPr>
+        <w:t>we</w:t>
+      </w:r>
+      <w:proofErr w:type="gramEnd"/>
+      <w:r>
+        <w:rPr>
+          <w:lang w:bidi="ar-EG"/>
+        </w:rPr>
+        <w:t xml:space="preserve"> can use episodes of 30 or 35 seconds</w:t>
+      </w:r>
+    </w:p>
+    <w:p>
+      <w:pPr>
+        <w:rPr>
+          <w:lang w:bidi="ar-EG"/>
+        </w:rPr>
+      </w:pPr>
+      <w:proofErr w:type="gramStart"/>
+      <w:r>
+        <w:rPr>
+          <w:lang w:bidi="ar-EG"/>
+        </w:rPr>
+        <w:t>need</w:t>
+      </w:r>
+      <w:proofErr w:type="gramEnd"/>
+      <w:r>
+        <w:rPr>
+          <w:lang w:bidi="ar-EG"/>
+        </w:rPr>
+        <w:t xml:space="preserve"> to show math here proving the 25 seconds</w:t>
+      </w:r>
+    </w:p>
+    <w:p>
+      <w:pPr>
+        <w:rPr>
+          <w:lang w:bidi="ar-EG"/>
+        </w:rPr>
+      </w:pPr>
+    </w:p>
+    <w:p>
+      <w:pPr>
+        <w:rPr>
+          <w:rtl/>
+          <w:lang w:bidi="ar-EG"/>
+        </w:rPr>
+      </w:pPr>
+      <w:r>
+        <w:rPr>
+          <w:lang w:bidi="ar-EG"/>
+        </w:rPr>
+        <w:t xml:space="preserve">ok so the plan now is to add a bunch of other trajectories that will engage the solver, maybe same ideas as this trajectory but movement in the y, z and combination of x y and z , the thing is, if it's one trajectory </w:t>
+      </w:r>
+      <w:proofErr w:type="spellStart"/>
+      <w:r>
+        <w:rPr>
+          <w:lang w:bidi="ar-EG"/>
+        </w:rPr>
+        <w:t>i'm</w:t>
+      </w:r>
+      <w:proofErr w:type="spellEnd"/>
+      <w:r>
+        <w:rPr>
+          <w:lang w:bidi="ar-EG"/>
+        </w:rPr>
+        <w:t xml:space="preserve"> scared it will drown between 50 trajectories , maybe having 5 of them would be ok, 5 out of 55(50+5) is significant to force the network to learn </w:t>
+      </w:r>
+      <w:proofErr w:type="spellStart"/>
+      <w:r>
+        <w:rPr>
+          <w:lang w:bidi="ar-EG"/>
+        </w:rPr>
+        <w:t>i</w:t>
+      </w:r>
+      <w:proofErr w:type="spellEnd"/>
+      <w:r>
+        <w:rPr>
+          <w:lang w:bidi="ar-EG"/>
+        </w:rPr>
+        <w:t xml:space="preserve"> guess , also we will save </w:t>
+      </w:r>
+      <w:proofErr w:type="spellStart"/>
+      <w:r>
+        <w:rPr>
+          <w:lang w:bidi="ar-EG"/>
+        </w:rPr>
+        <w:t>alot</w:t>
+      </w:r>
+      <w:proofErr w:type="spellEnd"/>
+      <w:r>
+        <w:rPr>
+          <w:lang w:bidi="ar-EG"/>
+        </w:rPr>
+        <w:t xml:space="preserve"> of time because we engage the optimizer so little (nice!) , but we will have to retrain, anyway, last thing, we need to make the episode length like 35 seconds, and we need to make sure that there is movement up to 35 seconds not just pure loitering </w:t>
+      </w:r>
+      <w:proofErr w:type="spellStart"/>
+      <w:r>
+        <w:rPr>
+          <w:lang w:bidi="ar-EG"/>
+        </w:rPr>
+        <w:t>everytime</w:t>
+      </w:r>
+      <w:proofErr w:type="spellEnd"/>
+      <w:r>
+        <w:rPr>
+          <w:lang w:bidi="ar-EG"/>
+        </w:rPr>
+        <w:t xml:space="preserve">, so in the 4/5 "custom(not </w:t>
+      </w:r>
+      <w:proofErr w:type="spellStart"/>
+      <w:r>
+        <w:rPr>
+          <w:lang w:bidi="ar-EG"/>
+        </w:rPr>
+        <w:t>quintic</w:t>
+      </w:r>
+      <w:proofErr w:type="spellEnd"/>
+      <w:r>
+        <w:rPr>
+          <w:lang w:bidi="ar-EG"/>
+        </w:rPr>
+        <w:t xml:space="preserve">)" trajectories we will add/have let's make the ramp up until t = 30? </w:t>
+      </w:r>
+      <w:proofErr w:type="gramStart"/>
+      <w:r>
+        <w:rPr>
+          <w:lang w:bidi="ar-EG"/>
+        </w:rPr>
+        <w:t>also</w:t>
+      </w:r>
+      <w:proofErr w:type="gramEnd"/>
+      <w:r>
+        <w:rPr>
+          <w:lang w:bidi="ar-EG"/>
+        </w:rPr>
+        <w:t xml:space="preserve"> we can increase the </w:t>
+      </w:r>
+      <w:proofErr w:type="spellStart"/>
+      <w:r>
+        <w:rPr>
+          <w:lang w:bidi="ar-EG"/>
+        </w:rPr>
+        <w:t>quintic</w:t>
+      </w:r>
+      <w:proofErr w:type="spellEnd"/>
+      <w:r>
+        <w:rPr>
+          <w:lang w:bidi="ar-EG"/>
+        </w:rPr>
+        <w:t xml:space="preserve"> trajectories position range, so that we have movement until more than 15s(also maybe up to 30 or so, or maybe make it random from 20 to 30, just to make sure it's not memorizing</w:t>
+      </w:r>
+    </w:p>
+    <w:p>
+      <w:pPr>
+        <w:rPr>
+          <w:rtl/>
+          <w:lang w:bidi="ar-EG"/>
+        </w:rPr>
+      </w:pPr>
+    </w:p>
+    <w:p>
+      <w:pPr>
+        <w:rPr>
+          <w:lang w:bidi="ar-EG"/>
+        </w:rPr>
+      </w:pPr>
+      <w:r>
+        <w:rPr>
+          <w:lang w:bidi="ar-EG"/>
+        </w:rPr>
+        <w:t>+5 custom (non-</w:t>
+      </w:r>
+      <w:proofErr w:type="spellStart"/>
+      <w:r>
+        <w:rPr>
+          <w:lang w:bidi="ar-EG"/>
+        </w:rPr>
+        <w:t>quintic</w:t>
+      </w:r>
+      <w:proofErr w:type="spellEnd"/>
+      <w:r>
+        <w:rPr>
+          <w:lang w:bidi="ar-EG"/>
+        </w:rPr>
+        <w:t>) solver-engaging trajectories — default-style straight moves but in y, z, and xyz combos; 5 of ~55 so they don't drown but force the net to learn adaptive A/ξ.</w:t>
+      </w:r>
+    </w:p>
+    <w:p>
+      <w:pPr>
+        <w:rPr>
+          <w:lang w:bidi="ar-EG"/>
+        </w:rPr>
+      </w:pPr>
+      <w:r>
+        <w:rPr>
+          <w:lang w:bidi="ar-EG"/>
+        </w:rPr>
+        <w:t>T_END 25 → 35 s, with movement lasting to ~t=30 on the custom ones (no pure-loiter tail to memorize).</w:t>
+      </w:r>
+    </w:p>
+    <w:p>
+      <w:pPr>
+        <w:rPr>
+          <w:lang w:bidi="ar-EG"/>
+        </w:rPr>
+      </w:pPr>
+      <w:proofErr w:type="spellStart"/>
+      <w:r>
+        <w:rPr>
+          <w:lang w:bidi="ar-EG"/>
+        </w:rPr>
+        <w:t>Quintics</w:t>
+      </w:r>
+      <w:proofErr w:type="spellEnd"/>
+      <w:r>
+        <w:rPr>
+          <w:lang w:bidi="ar-EG"/>
+        </w:rPr>
+        <w:t>: raise POS_RANGE and randomize move-end ~</w:t>
+      </w:r>
+      <w:proofErr w:type="gramStart"/>
+      <w:r>
+        <w:rPr>
+          <w:lang w:bidi="ar-EG"/>
+        </w:rPr>
+        <w:t>U(</w:t>
+      </w:r>
+      <w:proofErr w:type="gramEnd"/>
+      <w:r>
+        <w:rPr>
+          <w:lang w:bidi="ar-EG"/>
+        </w:rPr>
+        <w:t>20,30)s so there's no fixed "move ends at 15" marker.</w:t>
+      </w:r>
+    </w:p>
+    <w:p>
+      <w:pPr>
+        <w:rPr>
+          <w:lang w:bidi="ar-EG"/>
+        </w:rPr>
+      </w:pPr>
+      <w:r>
+        <w:rPr>
+          <w:lang w:bidi="ar-EG"/>
+        </w:rPr>
+        <w:lastRenderedPageBreak/>
+        <w:t xml:space="preserve">Retrain: re-collect (fast now via the </w:t>
+      </w:r>
+      <w:proofErr w:type="spellStart"/>
+      <w:r>
+        <w:rPr>
+          <w:lang w:bidi="ar-EG"/>
+        </w:rPr>
+        <w:t>deadband</w:t>
+      </w:r>
+      <w:proofErr w:type="spellEnd"/>
+      <w:r>
+        <w:rPr>
+          <w:lang w:bidi="ar-EG"/>
+        </w:rPr>
+        <w:t xml:space="preserve">) → BC → </w:t>
+      </w:r>
+      <w:proofErr w:type="gramStart"/>
+      <w:r>
+        <w:rPr>
+          <w:lang w:bidi="ar-EG"/>
+        </w:rPr>
+        <w:t>DAgger(</w:t>
+      </w:r>
+      <w:proofErr w:type="gramEnd"/>
+      <w:r>
+        <w:rPr>
+          <w:lang w:bidi="ar-EG"/>
+        </w:rPr>
+        <w:t>0.9→0, in-loop EMA).</w:t>
+      </w:r>
+    </w:p>
+    <w:p>
+      <w:pPr>
+        <w:rPr>
+          <w:lang w:bidi="ar-EG"/>
+        </w:rPr>
+      </w:pPr>
+    </w:p>
+    <w:p>
+      <w:pPr>
+        <w:rPr>
+          <w:lang w:bidi="ar-EG"/>
+        </w:rPr>
+      </w:pPr>
+      <w:r>
+        <w:rPr>
+          <w:lang w:bidi="ar-EG"/>
+        </w:rPr>
+        <w:t xml:space="preserve">-curate functions sucks for many reasons: </w:t>
+      </w:r>
+    </w:p>
+    <w:p>
+      <w:pPr>
+        <w:rPr>
+          <w:lang w:bidi="ar-EG"/>
+        </w:rPr>
+      </w:pPr>
+      <w:r>
+        <w:rPr>
+          <w:lang w:bidi="ar-EG"/>
+        </w:rPr>
+        <w:t>1- it's stochastic, meaning we can easily discard hard points and keep easy points, unlikely but still happens, not cool</w:t>
+      </w:r>
+    </w:p>
+    <w:p>
+      <w:pPr>
+        <w:rPr>
+          <w:lang w:bidi="ar-EG"/>
+        </w:rPr>
+      </w:pPr>
+      <w:r>
+        <w:rPr>
+          <w:lang w:bidi="ar-EG"/>
+        </w:rPr>
+        <w:t xml:space="preserve">2- </w:t>
+      </w:r>
+      <w:proofErr w:type="gramStart"/>
+      <w:r>
+        <w:rPr>
+          <w:lang w:bidi="ar-EG"/>
+        </w:rPr>
+        <w:t>more</w:t>
+      </w:r>
+      <w:proofErr w:type="gramEnd"/>
+      <w:r>
+        <w:rPr>
+          <w:lang w:bidi="ar-EG"/>
+        </w:rPr>
+        <w:t xml:space="preserve"> importantly, it assigns a survival probability per data point and each new </w:t>
+      </w:r>
+      <w:proofErr w:type="spellStart"/>
+      <w:r>
+        <w:rPr>
+          <w:lang w:bidi="ar-EG"/>
+        </w:rPr>
+        <w:t>iter</w:t>
+      </w:r>
+      <w:proofErr w:type="spellEnd"/>
+      <w:r>
+        <w:rPr>
+          <w:lang w:bidi="ar-EG"/>
+        </w:rPr>
+        <w:t xml:space="preserve"> we have a different data size  , that's now what </w:t>
+      </w:r>
+      <w:proofErr w:type="spellStart"/>
+      <w:r>
+        <w:rPr>
+          <w:lang w:bidi="ar-EG"/>
+        </w:rPr>
+        <w:t>i</w:t>
+      </w:r>
+      <w:proofErr w:type="spellEnd"/>
+      <w:r>
+        <w:rPr>
+          <w:lang w:bidi="ar-EG"/>
+        </w:rPr>
+        <w:t xml:space="preserve"> wanted at all. </w:t>
+      </w:r>
+      <w:proofErr w:type="spellStart"/>
+      <w:proofErr w:type="gramStart"/>
+      <w:r>
+        <w:rPr>
+          <w:lang w:bidi="ar-EG"/>
+        </w:rPr>
+        <w:t>i</w:t>
+      </w:r>
+      <w:proofErr w:type="spellEnd"/>
+      <w:proofErr w:type="gramEnd"/>
+      <w:r>
+        <w:rPr>
+          <w:lang w:bidi="ar-EG"/>
+        </w:rPr>
+        <w:t xml:space="preserve"> wanted to say ok, we're </w:t>
+      </w:r>
+      <w:proofErr w:type="spellStart"/>
+      <w:r>
+        <w:rPr>
+          <w:lang w:bidi="ar-EG"/>
+        </w:rPr>
+        <w:t>gonna</w:t>
+      </w:r>
+      <w:proofErr w:type="spellEnd"/>
+      <w:r>
+        <w:rPr>
+          <w:lang w:bidi="ar-EG"/>
+        </w:rPr>
+        <w:t xml:space="preserve"> use 100k points of old data for example + the new data gives us </w:t>
+      </w:r>
+      <w:proofErr w:type="spellStart"/>
+      <w:r>
+        <w:rPr>
+          <w:lang w:bidi="ar-EG"/>
+        </w:rPr>
+        <w:t>idk</w:t>
+      </w:r>
+      <w:proofErr w:type="spellEnd"/>
+      <w:r>
+        <w:rPr>
+          <w:lang w:bidi="ar-EG"/>
+        </w:rPr>
+        <w:t xml:space="preserve"> 50k points</w:t>
+      </w:r>
+    </w:p>
+    <w:p>
+      <w:pPr>
+        <w:rPr>
+          <w:lang w:bidi="ar-EG"/>
+        </w:rPr>
+      </w:pPr>
+      <w:r>
+        <w:rPr>
+          <w:lang w:bidi="ar-EG"/>
+        </w:rPr>
+        <w:t xml:space="preserve">for the old data we put it in bins, stratify the bins based on difficulty, then say we take 20% of the 100k points from bin 1, 50% from bin 2, 30% from bin 3, </w:t>
+      </w:r>
+    </w:p>
+    <w:p>
+      <w:pPr>
+        <w:rPr>
+          <w:lang w:bidi="ar-EG"/>
+        </w:rPr>
+      </w:pPr>
+      <w:proofErr w:type="gramStart"/>
+      <w:r>
+        <w:rPr>
+          <w:lang w:bidi="ar-EG"/>
+        </w:rPr>
+        <w:t>ok</w:t>
+      </w:r>
+      <w:proofErr w:type="gramEnd"/>
+      <w:r>
+        <w:rPr>
+          <w:lang w:bidi="ar-EG"/>
+        </w:rPr>
+        <w:t xml:space="preserve"> inside the bins we can assign probability of survival based on difficulty and </w:t>
+      </w:r>
+      <w:proofErr w:type="spellStart"/>
+      <w:r>
+        <w:rPr>
+          <w:lang w:bidi="ar-EG"/>
+        </w:rPr>
+        <w:t>recency</w:t>
+      </w:r>
+      <w:proofErr w:type="spellEnd"/>
+      <w:r>
+        <w:rPr>
+          <w:lang w:bidi="ar-EG"/>
+        </w:rPr>
+        <w:t xml:space="preserve">(but they should be separate filters!!) , what you do is mix and mush everything together , the bin, the hardness, the </w:t>
+      </w:r>
+      <w:proofErr w:type="spellStart"/>
+      <w:r>
+        <w:rPr>
+          <w:lang w:bidi="ar-EG"/>
+        </w:rPr>
+        <w:t>recency</w:t>
+      </w:r>
+      <w:proofErr w:type="spellEnd"/>
+      <w:r>
+        <w:rPr>
+          <w:lang w:bidi="ar-EG"/>
+        </w:rPr>
+        <w:t xml:space="preserve"> </w:t>
+      </w:r>
+    </w:p>
+    <w:p>
+      <w:pPr>
+        <w:rPr>
+          <w:lang w:bidi="ar-EG"/>
+        </w:rPr>
+      </w:pPr>
+      <w:proofErr w:type="gramStart"/>
+      <w:r>
+        <w:rPr>
+          <w:lang w:bidi="ar-EG"/>
+        </w:rPr>
+        <w:t>but</w:t>
+      </w:r>
+      <w:proofErr w:type="gramEnd"/>
+      <w:r>
+        <w:rPr>
+          <w:lang w:bidi="ar-EG"/>
+        </w:rPr>
+        <w:t xml:space="preserve"> they should be separate, </w:t>
+      </w:r>
+      <w:proofErr w:type="spellStart"/>
+      <w:r>
+        <w:rPr>
+          <w:lang w:bidi="ar-EG"/>
+        </w:rPr>
+        <w:t>i</w:t>
+      </w:r>
+      <w:proofErr w:type="spellEnd"/>
+      <w:r>
+        <w:rPr>
+          <w:lang w:bidi="ar-EG"/>
+        </w:rPr>
+        <w:t xml:space="preserve"> want a guaranteed 20% from this bin, </w:t>
+      </w:r>
+      <w:proofErr w:type="spellStart"/>
+      <w:r>
+        <w:rPr>
+          <w:lang w:bidi="ar-EG"/>
+        </w:rPr>
+        <w:t>i</w:t>
+      </w:r>
+      <w:proofErr w:type="spellEnd"/>
+      <w:r>
+        <w:rPr>
+          <w:lang w:bidi="ar-EG"/>
+        </w:rPr>
+        <w:t xml:space="preserve"> then want a </w:t>
+      </w:r>
+      <w:proofErr w:type="spellStart"/>
+      <w:r>
+        <w:rPr>
+          <w:lang w:bidi="ar-EG"/>
+        </w:rPr>
+        <w:t>guaranted</w:t>
+      </w:r>
+      <w:proofErr w:type="spellEnd"/>
+      <w:r>
+        <w:rPr>
+          <w:lang w:bidi="ar-EG"/>
+        </w:rPr>
+        <w:t xml:space="preserve"> 80% from the harder points in this bin, </w:t>
+      </w:r>
+      <w:proofErr w:type="spellStart"/>
+      <w:r>
+        <w:rPr>
+          <w:lang w:bidi="ar-EG"/>
+        </w:rPr>
+        <w:t>i</w:t>
+      </w:r>
+      <w:proofErr w:type="spellEnd"/>
+      <w:r>
+        <w:rPr>
+          <w:lang w:bidi="ar-EG"/>
+        </w:rPr>
+        <w:t xml:space="preserve"> then want a guaranteed 50% from more recent ones </w:t>
+      </w:r>
+    </w:p>
+    <w:p>
+      <w:pPr>
+        <w:rPr>
+          <w:lang w:bidi="ar-EG"/>
+        </w:rPr>
+      </w:pPr>
+      <w:proofErr w:type="spellStart"/>
+      <w:r>
+        <w:rPr>
+          <w:lang w:bidi="ar-EG"/>
+        </w:rPr>
+        <w:t>idk</w:t>
+      </w:r>
+      <w:proofErr w:type="spellEnd"/>
+      <w:r>
+        <w:rPr>
+          <w:lang w:bidi="ar-EG"/>
+        </w:rPr>
+        <w:t xml:space="preserve"> if your math leads to the same results on large numbers, but </w:t>
+      </w:r>
+      <w:proofErr w:type="spellStart"/>
+      <w:r>
+        <w:rPr>
+          <w:lang w:bidi="ar-EG"/>
+        </w:rPr>
+        <w:t>i</w:t>
+      </w:r>
+      <w:proofErr w:type="spellEnd"/>
+      <w:r>
+        <w:rPr>
+          <w:lang w:bidi="ar-EG"/>
+        </w:rPr>
+        <w:t xml:space="preserve"> don't like that we end up with a different number each iteration and we have no guarantees on the content, like a recent easy data point has the same </w:t>
+      </w:r>
+      <w:proofErr w:type="spellStart"/>
+      <w:r>
+        <w:rPr>
+          <w:lang w:bidi="ar-EG"/>
+        </w:rPr>
+        <w:t>probabilty</w:t>
+      </w:r>
+      <w:proofErr w:type="spellEnd"/>
+      <w:r>
+        <w:rPr>
+          <w:lang w:bidi="ar-EG"/>
+        </w:rPr>
+        <w:t xml:space="preserve"> like an old hard one, that shouldn't be the case, it should be : the hardest and most recent 100k points but with some guaranteed minimum diversity, anyway, no matter , we turned it off, but </w:t>
+      </w:r>
+      <w:proofErr w:type="spellStart"/>
+      <w:r>
+        <w:rPr>
+          <w:lang w:bidi="ar-EG"/>
+        </w:rPr>
+        <w:t>i</w:t>
+      </w:r>
+      <w:proofErr w:type="spellEnd"/>
+      <w:r>
+        <w:rPr>
+          <w:lang w:bidi="ar-EG"/>
+        </w:rPr>
+        <w:t xml:space="preserve"> still want to clean it and give it a go eventually, </w:t>
+      </w:r>
+    </w:p>
+    <w:p>
+      <w:pPr>
+        <w:rPr>
+          <w:lang w:bidi="ar-EG"/>
+        </w:rPr>
+      </w:pPr>
+      <w:proofErr w:type="gramStart"/>
+      <w:r>
+        <w:rPr>
+          <w:lang w:bidi="ar-EG"/>
+        </w:rPr>
+        <w:t>also</w:t>
+      </w:r>
+      <w:proofErr w:type="gramEnd"/>
+      <w:r>
+        <w:rPr>
+          <w:lang w:bidi="ar-EG"/>
+        </w:rPr>
+        <w:t xml:space="preserve"> cap with </w:t>
+      </w:r>
+      <w:proofErr w:type="spellStart"/>
+      <w:r>
+        <w:rPr>
+          <w:lang w:bidi="ar-EG"/>
+        </w:rPr>
+        <w:t>recency</w:t>
+      </w:r>
+      <w:proofErr w:type="spellEnd"/>
+      <w:r>
+        <w:rPr>
+          <w:lang w:bidi="ar-EG"/>
+        </w:rPr>
+        <w:t xml:space="preserve"> priority? </w:t>
+      </w:r>
+      <w:proofErr w:type="gramStart"/>
+      <w:r>
+        <w:rPr>
+          <w:lang w:bidi="ar-EG"/>
+        </w:rPr>
+        <w:t>absolutely</w:t>
+      </w:r>
+      <w:proofErr w:type="gramEnd"/>
+      <w:r>
+        <w:rPr>
+          <w:lang w:bidi="ar-EG"/>
+        </w:rPr>
+        <w:t xml:space="preserve"> not, hardest wins! </w:t>
+      </w:r>
+      <w:proofErr w:type="gramStart"/>
+      <w:r>
+        <w:rPr>
+          <w:lang w:bidi="ar-EG"/>
+        </w:rPr>
+        <w:t>that's</w:t>
+      </w:r>
+      <w:proofErr w:type="gramEnd"/>
+      <w:r>
+        <w:rPr>
+          <w:lang w:bidi="ar-EG"/>
+        </w:rPr>
+        <w:t xml:space="preserve"> why we struggled a lot with bad data, we were not training on the hard samples !         </w:t>
+      </w:r>
+      <w:proofErr w:type="spellStart"/>
+      <w:r>
+        <w:rPr>
+          <w:lang w:bidi="ar-EG"/>
+        </w:rPr>
+        <w:t>H_</w:t>
+      </w:r>
+      <w:proofErr w:type="gramStart"/>
+      <w:r>
+        <w:rPr>
+          <w:lang w:bidi="ar-EG"/>
+        </w:rPr>
+        <w:t>rows.append</w:t>
+      </w:r>
+      <w:proofErr w:type="spellEnd"/>
+      <w:r>
+        <w:rPr>
+          <w:lang w:bidi="ar-EG"/>
+        </w:rPr>
+        <w:t>(</w:t>
+      </w:r>
+      <w:proofErr w:type="gramEnd"/>
+      <w:r>
+        <w:rPr>
+          <w:lang w:bidi="ar-EG"/>
+        </w:rPr>
+        <w:t>float(</w:t>
+      </w:r>
+      <w:proofErr w:type="spellStart"/>
+      <w:r>
+        <w:rPr>
+          <w:lang w:bidi="ar-EG"/>
+        </w:rPr>
+        <w:t>np.linalg.norm</w:t>
+      </w:r>
+      <w:proofErr w:type="spellEnd"/>
+      <w:r>
+        <w:rPr>
+          <w:lang w:bidi="ar-EG"/>
+        </w:rPr>
+        <w:t xml:space="preserve">(lam - </w:t>
+      </w:r>
+      <w:proofErr w:type="spellStart"/>
+      <w:r>
+        <w:rPr>
+          <w:lang w:bidi="ar-EG"/>
+        </w:rPr>
+        <w:t>prev_lam</w:t>
+      </w:r>
+      <w:proofErr w:type="spellEnd"/>
+      <w:r>
+        <w:rPr>
+          <w:lang w:bidi="ar-EG"/>
+        </w:rPr>
+        <w:t xml:space="preserve">))) ?? </w:t>
+      </w:r>
+      <w:proofErr w:type="gramStart"/>
+      <w:r>
+        <w:rPr>
+          <w:lang w:bidi="ar-EG"/>
+        </w:rPr>
+        <w:t>lambda</w:t>
+      </w:r>
+      <w:proofErr w:type="gramEnd"/>
+      <w:r>
+        <w:rPr>
+          <w:lang w:bidi="ar-EG"/>
+        </w:rPr>
+        <w:t xml:space="preserve"> and previous lambda???</w:t>
+      </w:r>
+    </w:p>
+    <w:p>
+      <w:pPr>
+        <w:rPr>
+          <w:lang w:bidi="ar-EG"/>
+        </w:rPr>
+      </w:pPr>
+      <w:proofErr w:type="gramStart"/>
+      <w:r>
+        <w:rPr>
+          <w:lang w:bidi="ar-EG"/>
+        </w:rPr>
+        <w:t>why</w:t>
+      </w:r>
+      <w:proofErr w:type="gramEnd"/>
+      <w:r>
+        <w:rPr>
+          <w:lang w:bidi="ar-EG"/>
+        </w:rPr>
+        <w:t xml:space="preserve"> are you curating in train </w:t>
+      </w:r>
+      <w:proofErr w:type="spellStart"/>
+      <w:r>
+        <w:rPr>
+          <w:lang w:bidi="ar-EG"/>
+        </w:rPr>
+        <w:t>prdot</w:t>
+      </w:r>
+      <w:proofErr w:type="spellEnd"/>
+      <w:r>
+        <w:rPr>
+          <w:lang w:bidi="ar-EG"/>
+        </w:rPr>
+        <w:t xml:space="preserve">?? </w:t>
+      </w:r>
+      <w:proofErr w:type="gramStart"/>
+      <w:r>
+        <w:rPr>
+          <w:lang w:bidi="ar-EG"/>
+        </w:rPr>
+        <w:t>the</w:t>
+      </w:r>
+      <w:proofErr w:type="gramEnd"/>
+      <w:r>
+        <w:rPr>
+          <w:lang w:bidi="ar-EG"/>
+        </w:rPr>
+        <w:t xml:space="preserve"> point of curating is to prevent data explosion by choosing from the OLD data, this is the first dataset, no need to curate</w:t>
       </w:r>
       <w:bookmarkStart w:id="0" w:name="_GoBack"/>
       <w:bookmarkEnd w:id="0"/>
@@ -1875,6 +5008,113 @@
           <w:lang w:bidi="ar-EG"/>
         </w:rPr>
       </w:pPr>
+      <w:proofErr w:type="gramStart"/>
+      <w:r>
+        <w:rPr>
+          <w:lang w:bidi="ar-EG"/>
+        </w:rPr>
+        <w:t>one</w:t>
+      </w:r>
+      <w:proofErr w:type="gramEnd"/>
+      <w:r>
+        <w:rPr>
+          <w:lang w:bidi="ar-EG"/>
+        </w:rPr>
+        <w:t xml:space="preserve"> last thing, how many data points do we collect in a single iteration now? </w:t>
+      </w:r>
+      <w:proofErr w:type="gramStart"/>
+      <w:r>
+        <w:rPr>
+          <w:lang w:bidi="ar-EG"/>
+        </w:rPr>
+        <w:t>to</w:t>
+      </w:r>
+      <w:proofErr w:type="gramEnd"/>
+      <w:r>
+        <w:rPr>
+          <w:lang w:bidi="ar-EG"/>
+        </w:rPr>
+        <w:t xml:space="preserve"> make the cap realistic</w:t>
+      </w:r>
+    </w:p>
+    <w:p>
+      <w:pPr>
+        <w:rPr>
+          <w:rFonts w:hint="cs"/>
+          <w:rtl/>
+          <w:lang w:bidi="ar-EG"/>
+        </w:rPr>
+      </w:pPr>
+      <w:proofErr w:type="gramStart"/>
+      <w:r>
+        <w:rPr>
+          <w:lang w:bidi="ar-EG"/>
+        </w:rPr>
+        <w:t>another</w:t>
+      </w:r>
+      <w:proofErr w:type="gramEnd"/>
+      <w:r>
+        <w:rPr>
+          <w:lang w:bidi="ar-EG"/>
+        </w:rPr>
+        <w:t xml:space="preserve"> </w:t>
+      </w:r>
+      <w:proofErr w:type="spellStart"/>
+      <w:r>
+        <w:rPr>
+          <w:lang w:bidi="ar-EG"/>
+        </w:rPr>
+        <w:t>monestrosity</w:t>
+      </w:r>
+      <w:proofErr w:type="spellEnd"/>
+      <w:r>
+        <w:rPr>
+          <w:lang w:bidi="ar-EG"/>
+        </w:rPr>
+        <w:t xml:space="preserve"> that caused very </w:t>
+      </w:r>
+      <w:proofErr w:type="spellStart"/>
+      <w:r>
+        <w:rPr>
+          <w:lang w:bidi="ar-EG"/>
+        </w:rPr>
+        <w:t>very</w:t>
+      </w:r>
+      <w:proofErr w:type="spellEnd"/>
+      <w:r>
+        <w:rPr>
+          <w:lang w:bidi="ar-EG"/>
+        </w:rPr>
+        <w:t xml:space="preserve"> long training, we add the new data to the old data and then mask!!! </w:t>
+      </w:r>
+      <w:proofErr w:type="gramStart"/>
+      <w:r>
+        <w:rPr>
+          <w:lang w:bidi="ar-EG"/>
+        </w:rPr>
+        <w:t>no</w:t>
+      </w:r>
+      <w:proofErr w:type="gramEnd"/>
+      <w:r>
+        <w:rPr>
+          <w:lang w:bidi="ar-EG"/>
+        </w:rPr>
+        <w:t xml:space="preserve">! </w:t>
+      </w:r>
+      <w:proofErr w:type="gramStart"/>
+      <w:r>
+        <w:rPr>
+          <w:lang w:bidi="ar-EG"/>
+        </w:rPr>
+        <w:t>we</w:t>
+      </w:r>
+      <w:proofErr w:type="gramEnd"/>
+      <w:r>
+        <w:rPr>
+          <w:lang w:bidi="ar-EG"/>
+        </w:rPr>
+        <w:t xml:space="preserve"> need to train on the new data FULLY, and sample some of the old data to remain below the total allowed data</w:t>
+      </w:r>
     </w:p>
     <w:sectPr>
       <w:pgSz w:w="12240" w:h="15840"/>

</xml_diff>

<commit_message>
f2 generalizationadded reference and coord penalty on wrench
</commit_message>
<xml_diff>
--- a/documentation/thesis notes.docx
+++ b/documentation/thesis notes.docx
@@ -5508,52 +5508,324 @@
           <w:lang w:bidi="ar-EG"/>
           <w14:ligatures w14:val="none"/>
         </w:rPr>
-        <w:t xml:space="preserve"> (it might be not necessary in deployment actually since the net can understand the id from the relative position, but during training it makes life easier until the net knows</w:t>
+        <w:t xml:space="preserve"> (it might be not necessary in deployment actually since the net can understand the id from the relative position, but during training it makes life easier until the net knows)</w:t>
+      </w:r>
+      <w:r>
+        <w:rPr>
+          <w:rFonts w:ascii="Times New Roman" w:eastAsia="Times New Roman" w:hAnsi="Times New Roman" w:cs="Times New Roman"/>
+          <w:kern w:val="0"/>
+          <w:sz w:val="24"/>
+          <w:szCs w:val="24"/>
+          <w:lang w:bidi="ar-EG"/>
+          <w14:ligatures w14:val="none"/>
+        </w:rPr>
+        <w:t>.</w:t>
+      </w:r>
+      <w:r>
+        <w:rPr>
+          <w:rFonts w:ascii="Times New Roman" w:eastAsia="Times New Roman" w:hAnsi="Times New Roman" w:cs="Times New Roman"/>
+          <w:kern w:val="0"/>
+          <w:sz w:val="24"/>
+          <w:szCs w:val="24"/>
+          <w:lang w:bidi="ar-EG"/>
+          <w14:ligatures w14:val="none"/>
+        </w:rPr>
+        <w:t xml:space="preserve"> They also all need to know the attachment points geometry. </w:t>
+      </w:r>
+    </w:p>
+    <w:p>
+      <w:pPr>
+        <w:rPr>
+          <w:sz w:val="32"/>
+          <w:szCs w:val="32"/>
+          <w:lang w:bidi="ar-EG"/>
+        </w:rPr>
+      </w:pPr>
+    </w:p>
+    <w:p>
+      <w:pPr>
+        <w:rPr>
+          <w:sz w:val="32"/>
+          <w:szCs w:val="32"/>
+          <w:lang w:bidi="ar-EG"/>
+        </w:rPr>
+      </w:pPr>
+      <w:r>
+        <w:rPr>
+          <w:sz w:val="32"/>
+          <w:szCs w:val="32"/>
+          <w:lang w:bidi="ar-EG"/>
+        </w:rPr>
+        <w:t>Decomposition: desync hurts the base 0.013 → 1.102 (+1.089 m — a catastrophe), and the residual claws back +0.75 (69–72% of the gap).</w:t>
+      </w:r>
+    </w:p>
+    <w:p>
+      <w:pPr>
+        <w:rPr>
+          <w:sz w:val="32"/>
+          <w:szCs w:val="32"/>
+          <w:lang w:bidi="ar-EG"/>
+        </w:rPr>
+      </w:pPr>
+    </w:p>
+    <w:p>
+      <w:pPr>
+        <w:rPr>
+          <w:sz w:val="24"/>
+          <w:szCs w:val="24"/>
+          <w:lang w:bidi="ar-EG"/>
+        </w:rPr>
+      </w:pPr>
+      <w:r>
+        <w:rPr>
+          <w:sz w:val="24"/>
+          <w:szCs w:val="24"/>
+          <w:lang w:bidi="ar-EG"/>
+        </w:rPr>
+        <w:t>i don't understand why the load error gets hurt so much by our RL , even when i disable dw, still it gets hurt , however without any RL the load looks fine i don't understand how can the load remain so stable when the drones are losing their minds even tho the noise and the delay are in the load state why are the drones internal force distribution affected while the wrench is not?</w:t>
+      </w:r>
+    </w:p>
+    <w:p>
+      <w:pPr>
+        <w:rPr>
+          <w:sz w:val="24"/>
+          <w:szCs w:val="24"/>
+          <w:lang w:bidi="ar-EG"/>
+        </w:rPr>
+      </w:pPr>
+    </w:p>
+    <w:p>
+      <w:pPr>
+        <w:rPr>
+          <w:sz w:val="24"/>
+          <w:szCs w:val="24"/>
+          <w:lang w:bidi="ar-EG"/>
+        </w:rPr>
+      </w:pPr>
+      <w:r>
+        <w:rPr>
+          <w:sz w:val="24"/>
+          <w:szCs w:val="24"/>
+          <w:lang w:bidi="ar-EG"/>
+        </w:rPr>
+        <w:t xml:space="preserve">the f1 base is conditioned to output lambda based on last lambdas and the clock, it has a dependance on prdot but it's week and only gets activated once prdot hits the limit, otherwise it's gonna hold </w:t>
+      </w:r>
+    </w:p>
+    <w:p>
+      <w:pPr>
+        <w:rPr>
+          <w:sz w:val="24"/>
+          <w:szCs w:val="24"/>
+          <w:lang w:bidi="ar-EG"/>
+        </w:rPr>
+      </w:pPr>
+      <w:r>
+        <w:rPr>
+          <w:sz w:val="24"/>
+          <w:szCs w:val="24"/>
+          <w:lang w:bidi="ar-EG"/>
+        </w:rPr>
+        <w:t>now G is different from drone to drone , so there should be a leak, and there is, but it's only because G disagreement, what RL makes worse is it makes the lambdas themselves different and not balanced, it has no physical understanding of the lambda coordination that was happening by default because of the identical base that's gonna hold the s</w:t>
+      </w:r>
+      <w:r>
+        <w:rPr>
+          <w:sz w:val="24"/>
+          <w:szCs w:val="24"/>
+          <w:lang w:bidi="ar-EG"/>
+        </w:rPr>
+        <w:t>ame lambdas, now the reason the drone trajectories lose their mind is that over time, lambdas are gonna drift, and i see this in the plots, it actually starts okayish and over time loses its mind, this is because the lambdas desync, what i don't understand is how that buildup doesn't also hurt the load trajectory</w:t>
+      </w:r>
+    </w:p>
+    <w:p>
+      <w:pPr>
+        <w:rPr>
+          <w:sz w:val="24"/>
+          <w:szCs w:val="24"/>
+          <w:lang w:bidi="ar-EG"/>
+        </w:rPr>
+      </w:pPr>
+    </w:p>
+    <w:p>
+      <w:pPr>
+        <w:rPr>
+          <w:sz w:val="24"/>
+          <w:szCs w:val="24"/>
+          <w:lang w:bidi="ar-EG"/>
+        </w:rPr>
+      </w:pPr>
+      <w:r>
+        <w:rPr>
+          <w:sz w:val="24"/>
+          <w:szCs w:val="24"/>
+          <w:lang w:bidi="ar-EG"/>
+        </w:rPr>
+        <w:lastRenderedPageBreak/>
+        <w:t>The base runs the identical net on all drone</w:t>
+      </w:r>
+      <w:r>
+        <w:rPr>
+          <w:sz w:val="24"/>
+          <w:szCs w:val="24"/>
+          <w:lang w:bidi="ar-EG"/>
+        </w:rPr>
+        <w:t xml:space="preserve">s → they hold agreeing λ </w:t>
+      </w:r>
+      <w:r>
+        <w:rPr>
+          <w:sz w:val="24"/>
+          <w:szCs w:val="24"/>
+          <w:lang w:bidi="ar-EG"/>
+        </w:rPr>
+        <w:t>→ the nullspace forces nearly cancel → the base's only leak is G-disagreement (different load-pose estimates → different geometry). That's the 0.036.</w:t>
+      </w:r>
+    </w:p>
+    <w:p>
+      <w:pPr>
+        <w:rPr>
+          <w:sz w:val="24"/>
+          <w:szCs w:val="24"/>
+          <w:lang w:bidi="ar-EG"/>
+        </w:rPr>
+      </w:pPr>
+      <w:r>
+        <w:rPr>
+          <w:sz w:val="24"/>
+          <w:szCs w:val="24"/>
+          <w:lang w:bidi="ar-EG"/>
+        </w:rPr>
+        <w:t>RL doesn't push harder — it pushes misaligned. Per-drone dλ has no notion of the cross-drone λ-balance the identical base maintained for free, so it breaks the λ-agreement. The extra leak (0.036 → 0.086) is fro</w:t>
+      </w:r>
+      <w:r>
+        <w:rPr>
+          <w:sz w:val="24"/>
+          <w:szCs w:val="24"/>
+          <w:lang w:bidi="ar-EG"/>
+        </w:rPr>
+        <w:t xml:space="preserve">m </w:t>
+      </w:r>
+      <w:r>
+        <w:rPr>
+          <w:sz w:val="24"/>
+          <w:szCs w:val="24"/>
+          <w:lang w:bidi="ar-EG"/>
+        </w:rPr>
+        <w:t>misalignment</w:t>
+      </w:r>
+    </w:p>
+    <w:p>
+      <w:pPr>
+        <w:rPr>
+          <w:sz w:val="24"/>
+          <w:szCs w:val="24"/>
+          <w:lang w:bidi="ar-EG"/>
+        </w:rPr>
+      </w:pPr>
+      <w:r>
+        <w:rPr>
+          <w:sz w:val="24"/>
+          <w:szCs w:val="24"/>
+          <w:lang w:bidi="ar-EG"/>
+        </w:rPr>
+        <w:t>The load feels forces; the trajectories are the integrals of those forces. So:</w:t>
+      </w:r>
+    </w:p>
+    <w:p>
+      <w:pPr>
+        <w:rPr>
+          <w:sz w:val="24"/>
+          <w:szCs w:val="24"/>
+          <w:lang w:bidi="ar-EG"/>
+        </w:rPr>
+      </w:pPr>
+    </w:p>
+    <w:p>
+      <w:pPr>
+        <w:rPr>
+          <w:sz w:val="24"/>
+          <w:szCs w:val="24"/>
+          <w:lang w:bidi="ar-EG"/>
+        </w:rPr>
+      </w:pPr>
+      <w:r>
+        <w:rPr>
+          <w:sz w:val="24"/>
+          <w:szCs w:val="24"/>
+          <w:lang w:bidi="ar-EG"/>
+        </w:rPr>
+        <w:t>Load ← bounded (capped) leak, through a regulated PID loop → stays bounded (0.086).</w:t>
+      </w:r>
+    </w:p>
+    <w:p>
+      <w:pPr>
+        <w:rPr>
+          <w:sz w:val="24"/>
+          <w:szCs w:val="24"/>
+          <w:rtl/>
+          <w:lang w:bidi="ar-EG"/>
+        </w:rPr>
+      </w:pPr>
+      <w:r>
+        <w:rPr>
+          <w:sz w:val="24"/>
+          <w:szCs w:val="24"/>
+          <w:lang w:bidi="ar-EG"/>
+        </w:rPr>
+        <w:t>Trajectories ← unbounded integral of the (bounded) misalignment, through no loop → drift without limit.</w:t>
+      </w:r>
+    </w:p>
+    <w:p>
+      <w:pPr>
+        <w:rPr>
+          <w:sz w:val="24"/>
+          <w:szCs w:val="24"/>
+          <w:lang w:bidi="ar-EG"/>
+        </w:rPr>
+      </w:pPr>
+    </w:p>
+    <w:p>
+      <w:pPr>
+        <w:rPr>
+          <w:sz w:val="24"/>
+          <w:szCs w:val="24"/>
+          <w:lang w:bidi="ar-EG"/>
+        </w:rPr>
+      </w:pPr>
+      <w:r>
+        <w:rPr>
+          <w:sz w:val="24"/>
+          <w:szCs w:val="24"/>
+          <w:lang w:bidi="ar-EG"/>
+        </w:rPr>
+        <w:t xml:space="preserve">Paper by tu delft indicates </w:t>
+      </w:r>
+      <w:r>
+        <w:rPr>
+          <w:sz w:val="24"/>
+          <w:szCs w:val="24"/>
+          <w:lang w:bidi="ar-EG"/>
+        </w:rPr>
+        <w:t xml:space="preserve">history not very helpful(they still used stacked history obs), zero load desync and yet their tracking sucked </w:t>
+      </w:r>
+    </w:p>
+    <w:p>
+      <w:pPr>
+        <w:rPr>
+          <w:rFonts w:hint="cs"/>
+          <w:sz w:val="24"/>
+          <w:szCs w:val="24"/>
+          <w:lang w:bidi="ar-EG"/>
+        </w:rPr>
+      </w:pPr>
+      <w:r>
+        <w:rPr>
+          <w:sz w:val="24"/>
+          <w:szCs w:val="24"/>
+          <w:lang w:bidi="ar-EG"/>
+        </w:rPr>
+        <w:t>Crazy marl used relative positions of other drones in observation</w:t>
       </w:r>
       <w:bookmarkStart w:id="0" w:name="_GoBack"/>
       <w:bookmarkEnd w:id="0"/>
-      <w:r>
-        <w:rPr>
-          <w:rFonts w:ascii="Times New Roman" w:eastAsia="Times New Roman" w:hAnsi="Times New Roman" w:cs="Times New Roman"/>
-          <w:kern w:val="0"/>
-          <w:sz w:val="24"/>
-          <w:szCs w:val="24"/>
-          <w:lang w:bidi="ar-EG"/>
-          <w14:ligatures w14:val="none"/>
-        </w:rPr>
-        <w:t>)</w:t>
-      </w:r>
-      <w:r>
-        <w:rPr>
-          <w:rFonts w:ascii="Times New Roman" w:eastAsia="Times New Roman" w:hAnsi="Times New Roman" w:cs="Times New Roman"/>
-          <w:kern w:val="0"/>
-          <w:sz w:val="24"/>
-          <w:szCs w:val="24"/>
-          <w:lang w:bidi="ar-EG"/>
-          <w14:ligatures w14:val="none"/>
-        </w:rPr>
-        <w:t>.</w:t>
-      </w:r>
-      <w:r>
-        <w:rPr>
-          <w:rFonts w:ascii="Times New Roman" w:eastAsia="Times New Roman" w:hAnsi="Times New Roman" w:cs="Times New Roman"/>
-          <w:kern w:val="0"/>
-          <w:sz w:val="24"/>
-          <w:szCs w:val="24"/>
-          <w:lang w:bidi="ar-EG"/>
-          <w14:ligatures w14:val="none"/>
-        </w:rPr>
-        <w:t xml:space="preserve"> They also all need to know the attachment points geometry. </w:t>
-      </w:r>
-    </w:p>
-    <w:p>
-      <w:pPr>
-        <w:rPr>
-          <w:sz w:val="32"/>
-          <w:szCs w:val="32"/>
-          <w:lang w:bidi="ar-EG"/>
-        </w:rPr>
-      </w:pPr>
     </w:p>
     <w:sectPr>
       <w:pgSz w:w="12240" w:h="15840"/>

</xml_diff>

<commit_message>
f2 generalization, Regime 2 and 3 on og base
</commit_message>
<xml_diff>
--- a/documentation/thesis notes.docx
+++ b/documentation/thesis notes.docx
@@ -5810,7 +5810,6 @@
     <w:p>
       <w:pPr>
         <w:rPr>
-          <w:rFonts w:hint="cs"/>
           <w:sz w:val="24"/>
           <w:szCs w:val="24"/>
           <w:lang w:bidi="ar-EG"/>
@@ -5823,9 +5822,645 @@
           <w:lang w:bidi="ar-EG"/>
         </w:rPr>
         <w:t>Crazy marl used relative positions of other drones in observation</w:t>
+      </w:r>
+    </w:p>
+    <w:p>
+      <w:pPr>
+        <w:rPr>
+          <w:sz w:val="24"/>
+          <w:szCs w:val="24"/>
+          <w:lang w:bidi="ar-EG"/>
+        </w:rPr>
+      </w:pPr>
+    </w:p>
+    <w:p>
+      <w:pPr>
+        <w:rPr>
+          <w:sz w:val="24"/>
+          <w:szCs w:val="24"/>
+          <w:lang w:bidi="ar-EG"/>
+        </w:rPr>
+      </w:pPr>
+      <w:r>
+        <w:rPr>
+          <w:sz w:val="24"/>
+          <w:szCs w:val="24"/>
+          <w:lang w:bidi="ar-EG"/>
+        </w:rPr>
+        <w:t xml:space="preserve">Why Simulink not isaac gym or whatever </w:t>
+      </w:r>
+    </w:p>
+    <w:p>
+      <w:pPr>
+        <w:rPr>
+          <w:sz w:val="24"/>
+          <w:szCs w:val="24"/>
+          <w:lang w:bidi="ar-EG"/>
+        </w:rPr>
+      </w:pPr>
+      <w:r>
+        <w:rPr>
+          <w:sz w:val="24"/>
+          <w:szCs w:val="24"/>
+          <w:lang w:bidi="ar-EG"/>
+        </w:rPr>
+        <w:t>Cable-suspended multibody dynamics are easy to get subtly wrong hand-coded. Simulink models them correctly out of the box.</w:t>
+      </w:r>
+    </w:p>
+    <w:p>
+      <w:pPr>
+        <w:rPr>
+          <w:sz w:val="24"/>
+          <w:szCs w:val="24"/>
+          <w:lang w:bidi="ar-EG"/>
+        </w:rPr>
+      </w:pPr>
+      <w:r>
+        <w:rPr>
+          <w:sz w:val="24"/>
+          <w:szCs w:val="24"/>
+          <w:lang w:bidi="ar-EG"/>
+        </w:rPr>
+        <w:t>You needed a trustworthy ground-truth plant to validate the classical controller, the CasADi optimizer, F1 IL, DAgger — none of which needed speed, all of which needed a plant you could believe. A fast-but-unvalidated numpy sim early would have meant debugging your controller against a possibly-wrong plant.</w:t>
+      </w:r>
+    </w:p>
+    <w:p>
+      <w:pPr>
+        <w:rPr>
+          <w:sz w:val="24"/>
+          <w:szCs w:val="24"/>
+          <w:lang w:bidi="ar-EG"/>
+        </w:rPr>
+      </w:pPr>
+      <w:r>
+        <w:rPr>
+          <w:sz w:val="24"/>
+          <w:szCs w:val="24"/>
+          <w:lang w:bidi="ar-EG"/>
+        </w:rPr>
+        <w:t>It let you move fast on the actual research (control, IL, RL) instead of spending your first months debugging rigid-body dynamics. It probably accelerated 90% of the project.</w:t>
+      </w:r>
+    </w:p>
+    <w:p>
+      <w:pPr>
+        <w:rPr>
+          <w:sz w:val="24"/>
+          <w:szCs w:val="24"/>
+          <w:lang w:bidi="ar-EG"/>
+        </w:rPr>
+      </w:pPr>
+      <w:r>
+        <w:rPr>
+          <w:sz w:val="24"/>
+          <w:szCs w:val="24"/>
+          <w:lang w:bidi="ar-EG"/>
+        </w:rPr>
+        <w:t xml:space="preserve">IL (phase 1 and generalization) proved to be fully doable with the fmu, first phase RL on limited trajectories also turned out to be doable, so the bet kinda paid off because I was able to reach these results faster </w:t>
+      </w:r>
+    </w:p>
+    <w:p>
+      <w:pPr>
+        <w:rPr>
+          <w:sz w:val="24"/>
+          <w:szCs w:val="24"/>
+          <w:lang w:bidi="ar-EG"/>
+        </w:rPr>
+      </w:pPr>
+      <w:r>
+        <w:rPr>
+          <w:sz w:val="24"/>
+          <w:szCs w:val="24"/>
+          <w:lang w:bidi="ar-EG"/>
+        </w:rPr>
+        <w:t>methods insight for your thesis: high-fidelity sims are the right choice for validation, but RL-at-scale needs a fast path validated against them — ideally you build both, in that order.</w:t>
+      </w:r>
+    </w:p>
+    <w:p>
+      <w:pPr>
+        <w:rPr>
+          <w:sz w:val="24"/>
+          <w:szCs w:val="24"/>
+          <w:lang w:bidi="ar-EG"/>
+        </w:rPr>
+      </w:pPr>
+    </w:p>
+    <w:p>
+      <w:pPr>
+        <w:rPr>
+          <w:sz w:val="24"/>
+          <w:szCs w:val="24"/>
+          <w:lang w:bidi="ar-EG"/>
+        </w:rPr>
+      </w:pPr>
+      <w:r>
+        <w:rPr>
+          <w:sz w:val="24"/>
+          <w:szCs w:val="24"/>
+          <w:lang w:bidi="ar-EG"/>
+        </w:rPr>
+        <w:lastRenderedPageBreak/>
+        <w:t>Here's the move. The classical pipeline is KF (estimator) + decentralized controller. But we already established the decisive fact: the KF only recovers the observable range(G) load channel. The coordination failure lives in the unobservable null(G) nullspace, and once you're off the manifold a better load estimate doesn't fix it. So</w:t>
+      </w:r>
+    </w:p>
+    <w:p>
+      <w:pPr>
+        <w:rPr>
+          <w:sz w:val="24"/>
+          <w:szCs w:val="24"/>
+          <w:lang w:bidi="ar-EG"/>
+        </w:rPr>
+      </w:pPr>
+      <w:r>
+        <w:rPr>
+          <w:sz w:val="24"/>
+          <w:szCs w:val="24"/>
+          <w:lang w:bidi="ar-EG"/>
+        </w:rPr>
+        <w:t>The interesting, unsolved part — decentralized coordination under async partial observability, without comms — is not a filtering problem. It's a decentralized decision-under-uncertainty problem. That's inherently RL/MARL. A KF is the right tool only for the easy, observable sub-problem.</w:t>
+      </w:r>
+    </w:p>
+    <w:p>
+      <w:pPr>
+        <w:rPr>
+          <w:sz w:val="24"/>
+          <w:szCs w:val="24"/>
+          <w:lang w:bidi="ar-EG"/>
+        </w:rPr>
+      </w:pPr>
+      <w:r>
+        <w:rPr>
+          <w:sz w:val="24"/>
+          <w:szCs w:val="24"/>
+          <w:lang w:bidi="ar-EG"/>
+        </w:rPr>
+        <w:t>That's your thesis positioning, and it's bulletproof because it's true. When the committee asks "why not KF?", your answer is: "KF handles the observable load channel — a solved sub-problem orthogonal to our claim. The coordination failure is in the unobservable nullspace, a partial-observability decision problem KF does not address. That's the RL contribution." You're not dodging KF; you're scoping it out as the easy part. Respectful and keeps RL central.</w:t>
+      </w:r>
+    </w:p>
+    <w:p>
+      <w:pPr>
+        <w:rPr>
+          <w:sz w:val="24"/>
+          <w:szCs w:val="24"/>
+          <w:lang w:bidi="ar-EG"/>
+        </w:rPr>
+      </w:pPr>
+      <w:r>
+        <w:rPr>
+          <w:sz w:val="24"/>
+          <w:szCs w:val="24"/>
+          <w:lang w:bidi="ar-EG"/>
+        </w:rPr>
+        <w:t>find the decentralized policy that, under the shared desync uncertainty, is self-consistent and stays on the manifold, so the unobservable drift is never triggered</w:t>
+      </w:r>
+    </w:p>
+    <w:p>
+      <w:pPr>
+        <w:rPr>
+          <w:sz w:val="24"/>
+          <w:szCs w:val="24"/>
+          <w:lang w:bidi="ar-EG"/>
+        </w:rPr>
+      </w:pPr>
+      <w:r>
+        <w:rPr>
+          <w:sz w:val="24"/>
+          <w:szCs w:val="24"/>
+          <w:lang w:bidi="ar-EG"/>
+        </w:rPr>
+        <w:t>d</w:t>
+      </w:r>
+      <w:r>
+        <w:rPr>
+          <w:sz w:val="24"/>
+          <w:szCs w:val="24"/>
+          <w:lang w:bidi="ar-EG"/>
+        </w:rPr>
+        <w:t>ecentralized cooperative manipulation as a self-modeling / equilibrium problem under asynchronous partial observability — the agents exploit policy homogeneity to predict each other's observable contribution and learn a self-consistent strategy that avoids exciting the unobservable coordination drift, all without communication</w:t>
+      </w:r>
+    </w:p>
+    <w:p>
+      <w:pPr>
+        <w:rPr>
+          <w:sz w:val="24"/>
+          <w:szCs w:val="24"/>
+          <w:lang w:bidi="ar-EG"/>
+        </w:rPr>
+      </w:pPr>
+      <w:r>
+        <w:rPr>
+          <w:sz w:val="24"/>
+          <w:szCs w:val="24"/>
+          <w:lang w:bidi="ar-EG"/>
+        </w:rPr>
+        <w:t>The observability analysis (range(G) vs null(G)) becomes the justification for why it's a policy problem, not a filtering one.</w:t>
+      </w:r>
+    </w:p>
+    <w:p>
+      <w:pPr>
+        <w:rPr>
+          <w:sz w:val="24"/>
+          <w:szCs w:val="24"/>
+          <w:lang w:bidi="ar-EG"/>
+        </w:rPr>
+      </w:pPr>
+    </w:p>
+    <w:p>
+      <w:pPr>
+        <w:rPr>
+          <w:sz w:val="24"/>
+          <w:szCs w:val="24"/>
+          <w:lang w:bidi="ar-EG"/>
+        </w:rPr>
+      </w:pPr>
+      <w:r>
+        <w:rPr>
+          <w:sz w:val="24"/>
+          <w:szCs w:val="24"/>
+          <w:lang w:bidi="ar-EG"/>
+        </w:rPr>
+        <w:t>it's each drone's camera reading an AprilTag on a fast-moving load from its own viewpoint. That's why it's AR(1) with corr 0.995: a slowly-drifting, bias-like, viewpoint-dependent pose-estimation error, non-white and non-stationar</w:t>
+      </w:r>
+      <w:r>
+        <w:rPr>
+          <w:sz w:val="24"/>
+          <w:szCs w:val="24"/>
+          <w:lang w:bidi="ar-EG"/>
+        </w:rPr>
+        <w:t>y. Important to look if this is accurate representation of the reality</w:t>
+      </w:r>
+    </w:p>
+    <w:p>
+      <w:pPr>
+        <w:rPr>
+          <w:sz w:val="24"/>
+          <w:szCs w:val="24"/>
+          <w:lang w:bidi="ar-EG"/>
+        </w:rPr>
+      </w:pPr>
+    </w:p>
+    <w:p>
+      <w:pPr>
+        <w:numPr>
+          <w:ilvl w:val="0"/>
+          <w:numId w:val="3"/>
+        </w:numPr>
+        <w:spacing w:before="100" w:beforeAutospacing="1" w:after="100" w:afterAutospacing="1" w:line="240" w:lineRule="auto"/>
+        <w:rPr>
+          <w:rFonts w:ascii="Times New Roman" w:eastAsia="Times New Roman" w:hAnsi="Times New Roman" w:cs="Times New Roman"/>
+          <w:kern w:val="0"/>
+          <w:sz w:val="24"/>
+          <w:szCs w:val="24"/>
+          <w14:ligatures w14:val="none"/>
+        </w:rPr>
+      </w:pPr>
+      <w:r>
+        <w:rPr>
+          <w:rFonts w:ascii="Times New Roman" w:eastAsia="Times New Roman" w:hAnsi="Times New Roman" w:cs="Times New Roman"/>
+          <w:b/>
+          <w:bCs/>
+          <w:kern w:val="0"/>
+          <w:sz w:val="24"/>
+          <w:szCs w:val="24"/>
+          <w14:ligatures w14:val="none"/>
+        </w:rPr>
+        <w:t>Random delay</w:t>
+      </w:r>
+      <w:r>
+        <w:rPr>
+          <w:rFonts w:ascii="Times New Roman" w:eastAsia="Times New Roman" w:hAnsi="Times New Roman" w:cs="Times New Roman"/>
+          <w:kern w:val="0"/>
+          <w:sz w:val="24"/>
+          <w:szCs w:val="24"/>
+          <w14:ligatures w14:val="none"/>
+        </w:rPr>
+        <w:t xml:space="preserve"> → represents asynchronous measurements. Reasonable. </w:t>
+      </w:r>
+    </w:p>
+    <w:p>
+      <w:pPr>
+        <w:numPr>
+          <w:ilvl w:val="0"/>
+          <w:numId w:val="3"/>
+        </w:numPr>
+        <w:spacing w:before="100" w:beforeAutospacing="1" w:after="100" w:afterAutospacing="1" w:line="240" w:lineRule="auto"/>
+        <w:rPr>
+          <w:rFonts w:ascii="Times New Roman" w:eastAsia="Times New Roman" w:hAnsi="Times New Roman" w:cs="Times New Roman"/>
+          <w:kern w:val="0"/>
+          <w:sz w:val="24"/>
+          <w:szCs w:val="24"/>
+          <w14:ligatures w14:val="none"/>
+        </w:rPr>
+      </w:pPr>
+      <w:r>
+        <w:rPr>
+          <w:rFonts w:ascii="Times New Roman" w:eastAsia="Times New Roman" w:hAnsi="Times New Roman" w:cs="Times New Roman"/>
+          <w:b/>
+          <w:bCs/>
+          <w:kern w:val="0"/>
+          <w:sz w:val="24"/>
+          <w:szCs w:val="24"/>
+          <w14:ligatures w14:val="none"/>
+        </w:rPr>
+        <w:t>AR(1) Gaussian error</w:t>
+      </w:r>
+      <w:r>
+        <w:rPr>
+          <w:rFonts w:ascii="Times New Roman" w:eastAsia="Times New Roman" w:hAnsi="Times New Roman" w:cs="Times New Roman"/>
+          <w:kern w:val="0"/>
+          <w:sz w:val="24"/>
+          <w:szCs w:val="24"/>
+          <w14:ligatures w14:val="none"/>
+        </w:rPr>
+        <w:t xml:space="preserve"> → represents temporally correlated estimation error. Reasonable as a simplified stochastic model, but not a claim about the detailed physics of AprilTag detection. </w:t>
+      </w:r>
+    </w:p>
+    <w:p>
+      <w:pPr>
+        <w:spacing w:before="100" w:beforeAutospacing="1" w:after="100" w:afterAutospacing="1" w:line="240" w:lineRule="auto"/>
+        <w:rPr>
+          <w:rFonts w:ascii="Times New Roman" w:eastAsia="Times New Roman" w:hAnsi="Times New Roman" w:cs="Times New Roman"/>
+          <w:kern w:val="0"/>
+          <w:sz w:val="24"/>
+          <w:szCs w:val="24"/>
+          <w14:ligatures w14:val="none"/>
+        </w:rPr>
+      </w:pPr>
+      <w:r>
+        <w:rPr>
+          <w:rFonts w:ascii="Times New Roman" w:eastAsia="Times New Roman" w:hAnsi="Times New Roman" w:cs="Times New Roman"/>
+          <w:kern w:val="0"/>
+          <w:sz w:val="24"/>
+          <w:szCs w:val="24"/>
+          <w14:ligatures w14:val="none"/>
+        </w:rPr>
+        <w:t xml:space="preserve">The literature supports using correlated/Gauss–Markov measurement-error models rather than automatically assuming white noise. For example, work on measurement-noise modeling explicitly argues that white noise can fail to represent real measurements and treats </w:t>
+      </w:r>
+      <w:r>
+        <w:rPr>
+          <w:rFonts w:ascii="Times New Roman" w:eastAsia="Times New Roman" w:hAnsi="Times New Roman" w:cs="Times New Roman"/>
+          <w:b/>
+          <w:bCs/>
+          <w:kern w:val="0"/>
+          <w:sz w:val="24"/>
+          <w:szCs w:val="24"/>
+          <w14:ligatures w14:val="none"/>
+        </w:rPr>
+        <w:t>noise intensity and correlation time</w:t>
+      </w:r>
+      <w:r>
+        <w:rPr>
+          <w:rFonts w:ascii="Times New Roman" w:eastAsia="Times New Roman" w:hAnsi="Times New Roman" w:cs="Times New Roman"/>
+          <w:kern w:val="0"/>
+          <w:sz w:val="24"/>
+          <w:szCs w:val="24"/>
+          <w14:ligatures w14:val="none"/>
+        </w:rPr>
+        <w:t xml:space="preserve"> as model parameters. </w:t>
+      </w:r>
+    </w:p>
+    <w:p>
+      <w:pPr>
+        <w:spacing w:before="100" w:beforeAutospacing="1" w:after="100" w:afterAutospacing="1" w:line="240" w:lineRule="auto"/>
+        <w:rPr>
+          <w:rFonts w:ascii="Times New Roman" w:eastAsia="Times New Roman" w:hAnsi="Times New Roman" w:cs="Times New Roman"/>
+          <w:kern w:val="0"/>
+          <w:sz w:val="24"/>
+          <w:szCs w:val="24"/>
+          <w14:ligatures w14:val="none"/>
+        </w:rPr>
+      </w:pPr>
+      <w:r>
+        <w:lastRenderedPageBreak/>
+        <w:t>"We use a first-order Gauss–Markov process as a phenomenological approximation for temporally correlated measurement errors. The correlation time is treated as a simulation parameter rather than an experimentally identified property of the camera/AprilTag system.</w:t>
+      </w:r>
+    </w:p>
+    <w:p>
+      <w:pPr>
+        <w:spacing w:before="100" w:beforeAutospacing="1" w:after="100" w:afterAutospacing="1" w:line="240" w:lineRule="auto"/>
+        <w:rPr>
+          <w:rFonts w:ascii="Times New Roman" w:eastAsia="Times New Roman" w:hAnsi="Times New Roman" w:cs="Times New Roman"/>
+          <w:kern w:val="0"/>
+          <w:sz w:val="24"/>
+          <w:szCs w:val="24"/>
+          <w14:ligatures w14:val="none"/>
+        </w:rPr>
+      </w:pPr>
+      <w:r>
+        <w:rPr>
+          <w:rFonts w:ascii="Times New Roman" w:eastAsia="Times New Roman" w:hAnsi="Times New Roman" w:cs="Times New Roman"/>
+          <w:kern w:val="0"/>
+          <w:sz w:val="24"/>
+          <w:szCs w:val="24"/>
+          <w14:ligatures w14:val="none"/>
+        </w:rPr>
+        <w:t xml:space="preserve">And there is experimental evidence that fiducial-marker localization accuracy changes with </w:t>
+      </w:r>
+      <w:r>
+        <w:rPr>
+          <w:rFonts w:ascii="Times New Roman" w:eastAsia="Times New Roman" w:hAnsi="Times New Roman" w:cs="Times New Roman"/>
+          <w:b/>
+          <w:bCs/>
+          <w:kern w:val="0"/>
+          <w:sz w:val="24"/>
+          <w:szCs w:val="24"/>
+          <w14:ligatures w14:val="none"/>
+        </w:rPr>
+        <w:t>relative velocity, distance, and viewing angle</w:t>
+      </w:r>
+      <w:r>
+        <w:rPr>
+          <w:rFonts w:ascii="Times New Roman" w:eastAsia="Times New Roman" w:hAnsi="Times New Roman" w:cs="Times New Roman"/>
+          <w:kern w:val="0"/>
+          <w:sz w:val="24"/>
+          <w:szCs w:val="24"/>
+          <w14:ligatures w14:val="none"/>
+        </w:rPr>
+        <w:t>, rather than behaving as a fixed isotropic Gaussian error. In particular, a study evaluating AprilTags during motion found their localization accuracy varied under different relative-motion conditions</w:t>
+      </w:r>
+    </w:p>
+    <w:p>
+      <w:pPr>
+        <w:rPr>
+          <w:sz w:val="24"/>
+          <w:szCs w:val="24"/>
+          <w:lang w:bidi="ar-EG"/>
+        </w:rPr>
+      </w:pPr>
+      <w:r>
+        <w:t>We adopt a first-order Gauss–Markov measurement-error model as a tractable stochastic approximation of temporally correlated visual measurements</w:t>
+      </w:r>
+    </w:p>
+    <w:p>
+      <w:pPr>
+        <w:pStyle w:val="Heading1"/>
+        <w:shd w:val="clear" w:color="auto" w:fill="FFFFFF"/>
+        <w:spacing w:before="60" w:after="180" w:line="420" w:lineRule="atLeast"/>
+        <w:ind w:left="300"/>
+        <w:rPr>
+          <w:rFonts w:ascii="Helvetica" w:hAnsi="Helvetica" w:cs="Helvetica"/>
+          <w:color w:val="000000"/>
+        </w:rPr>
+      </w:pPr>
+      <w:r>
+        <w:rPr>
+          <w:rFonts w:ascii="Helvetica" w:hAnsi="Helvetica" w:cs="Helvetica"/>
+          <w:color w:val="000000"/>
+        </w:rPr>
+        <w:t xml:space="preserve">Paper: </w:t>
+      </w:r>
+      <w:r>
+        <w:rPr>
+          <w:rFonts w:ascii="Helvetica" w:hAnsi="Helvetica" w:cs="Helvetica"/>
+          <w:color w:val="000000"/>
+        </w:rPr>
+        <w:t>Split Covariance Intersection Filter Based Visual Localization With Accurate AprilTag Map For Warehouse Robot Navigation</w:t>
+      </w:r>
+    </w:p>
+    <w:p>
+      <w:r>
+        <w:t>The parameters are nominal, order-of-magnitude assumptions used to evaluate the robustness of the proposed method. Their calibration against real sensor data is outside the scope of this study</w:t>
+      </w:r>
+    </w:p>
+    <w:p>
+      <w:r>
+        <w:t>KF on the load state doesn’t help, it actually makes it worse</w:t>
+      </w:r>
+    </w:p>
+    <w:p>
+      <w:r>
+        <w:t>Feeding reference load instead of actual still fails, even when only fed to the lambda calculations</w:t>
+      </w:r>
+    </w:p>
+    <w:p>
+      <w:r>
+        <w:t>measured w_d → load tracks, but drones scatter</w:t>
+      </w:r>
+      <w:r>
+        <w:t>(how?</w:t>
+      </w:r>
+      <w:r>
+        <w:t xml:space="preserve"> Because sum of noises is unbiased, but single noise is biased, very crude unscientific but captures the idea</w:t>
       </w:r>
       <w:bookmarkStart w:id="0" w:name="_GoBack"/>
       <w:bookmarkEnd w:id="0"/>
+      <w:r>
+        <w:t>)</w:t>
+      </w:r>
+      <w:r>
+        <w:t xml:space="preserve"> → loop bad (this probe)</w:t>
+      </w:r>
+    </w:p>
+    <w:p>
+      <w:r>
+        <w:t>reference w_d → drones agree, but load runs open-loop → load blows up (previous probe)</w:t>
+      </w:r>
+      <w:r>
+        <w:t xml:space="preserve"> </w:t>
+      </w:r>
+    </w:p>
+    <w:p/>
+    <w:p>
+      <w:pPr>
+        <w:rPr>
+          <w:sz w:val="24"/>
+          <w:szCs w:val="24"/>
+          <w:lang w:bidi="ar-EG"/>
+        </w:rPr>
+      </w:pPr>
+      <w:r>
+        <w:rPr>
+          <w:sz w:val="24"/>
+          <w:szCs w:val="24"/>
+          <w:lang w:bidi="ar-EG"/>
+        </w:rPr>
+        <w:t>Here's the framing that survives all of it — and it's stronger, not weaker:</w:t>
+      </w:r>
+    </w:p>
+    <w:p>
+      <w:pPr>
+        <w:rPr>
+          <w:sz w:val="24"/>
+          <w:szCs w:val="24"/>
+          <w:lang w:bidi="ar-EG"/>
+        </w:rPr>
+      </w:pPr>
+      <w:r>
+        <w:rPr>
+          <w:sz w:val="24"/>
+          <w:szCs w:val="24"/>
+          <w:lang w:bidi="ar-EG"/>
+        </w:rPr>
+        <w:t>The sub-laws are individually classical but COUPLED and in mutual tension, over a distribution.</w:t>
+      </w:r>
+    </w:p>
+    <w:p>
+      <w:pPr>
+        <w:rPr>
+          <w:sz w:val="24"/>
+          <w:szCs w:val="24"/>
+          <w:lang w:bidi="ar-EG"/>
+        </w:rPr>
+      </w:pPr>
+      <w:r>
+        <w:rPr>
+          <w:sz w:val="24"/>
+          <w:szCs w:val="24"/>
+          <w:lang w:bidi="ar-EG"/>
+        </w:rPr>
+        <w:t>Loiter feedback regulates scatter → but pulls toward load-pose-dependent (noisy, divergent) targets → drones fight → reintroduces leak. Scatter-vs-leak, same wall, relocated.</w:t>
+      </w:r>
+    </w:p>
+    <w:p>
+      <w:pPr>
+        <w:rPr>
+          <w:sz w:val="24"/>
+          <w:szCs w:val="24"/>
+          <w:lang w:bidi="ar-EG"/>
+        </w:rPr>
+      </w:pPr>
+      <w:r>
+        <w:rPr>
+          <w:sz w:val="24"/>
+          <w:szCs w:val="24"/>
+          <w:lang w:bidi="ar-EG"/>
+        </w:rPr>
+        <w:t>Feedforward coordinates → loses tracking.</w:t>
+      </w:r>
+    </w:p>
+    <w:p>
+      <w:pPr>
+        <w:rPr>
+          <w:sz w:val="24"/>
+          <w:szCs w:val="24"/>
+          <w:lang w:bidi="ar-EG"/>
+        </w:rPr>
+      </w:pPr>
+      <w:r>
+        <w:rPr>
+          <w:sz w:val="24"/>
+          <w:szCs w:val="24"/>
+          <w:lang w:bidi="ar-EG"/>
+        </w:rPr>
+        <w:t>And the hard stall constraint (fixed-wing min airspeed) couples nastily to all of it — a classical law that regulates loiter can drive a drone below stall.</w:t>
+      </w:r>
+    </w:p>
+    <w:p>
+      <w:pPr>
+        <w:rPr>
+          <w:rFonts w:hint="cs"/>
+          <w:sz w:val="24"/>
+          <w:szCs w:val="24"/>
+          <w:lang w:bidi="ar-EG"/>
+        </w:rPr>
+      </w:pPr>
+      <w:r>
+        <w:rPr>
+          <w:sz w:val="24"/>
+          <w:szCs w:val="24"/>
+          <w:lang w:bidi="ar-EG"/>
+        </w:rPr>
+        <w:t>All of this across 56 trajectories × noise realizations, where fixed hand-tuned gains don't transfer.</w:t>
+      </w:r>
     </w:p>
     <w:sectPr>
       <w:pgSz w:w="12240" w:h="15840"/>
@@ -5840,6 +6475,119 @@
 <file path=word/numbering.xml><?xml version="1.0" encoding="utf-8"?>
 <w:numbering xmlns:wpc="http://schemas.microsoft.com/office/word/2010/wordprocessingCanvas" xmlns:mc="http://schemas.openxmlformats.org/markup-compatibility/2006" xmlns:o="urn:schemas-microsoft-com:office:office" xmlns:r="http://schemas.openxmlformats.org/officeDocument/2006/relationships" xmlns:m="http://schemas.openxmlformats.org/officeDocument/2006/math" xmlns:v="urn:schemas-microsoft-com:vml" xmlns:wp14="http://schemas.microsoft.com/office/word/2010/wordprocessingDrawing" xmlns:wp="http://schemas.openxmlformats.org/drawingml/2006/wordprocessingDrawing" xmlns:w10="urn:schemas-microsoft-com:office:word" xmlns:w="http://schemas.openxmlformats.org/wordprocessingml/2006/main" xmlns:w14="http://schemas.microsoft.com/office/word/2010/wordml" xmlns:w15="http://schemas.microsoft.com/office/word/2012/wordml" xmlns:wpg="http://schemas.microsoft.com/office/word/2010/wordprocessingGroup" xmlns:wpi="http://schemas.microsoft.com/office/word/2010/wordprocessingInk" xmlns:wne="http://schemas.microsoft.com/office/word/2006/wordml" xmlns:wps="http://schemas.microsoft.com/office/word/2010/wordprocessingShape" mc:Ignorable="w14 w15 wp14">
   <w:abstractNum w:abstractNumId="0">
+    <w:nsid w:val="0D330163"/>
+    <w:multiLevelType w:val="multilevel"/>
+    <w:tmpl w:val="BF468F66"/>
+    <w:lvl w:ilvl="0">
+      <w:start w:val="1"/>
+      <w:numFmt w:val="decimal"/>
+      <w:lvlText w:val="%1."/>
+      <w:lvlJc w:val="left"/>
+      <w:pPr>
+        <w:tabs>
+          <w:tab w:val="num" w:pos="720"/>
+        </w:tabs>
+        <w:ind w:left="720" w:hanging="360"/>
+      </w:pPr>
+    </w:lvl>
+    <w:lvl w:ilvl="1" w:tentative="1">
+      <w:start w:val="1"/>
+      <w:numFmt w:val="decimal"/>
+      <w:lvlText w:val="%2."/>
+      <w:lvlJc w:val="left"/>
+      <w:pPr>
+        <w:tabs>
+          <w:tab w:val="num" w:pos="1440"/>
+        </w:tabs>
+        <w:ind w:left="1440" w:hanging="360"/>
+      </w:pPr>
+    </w:lvl>
+    <w:lvl w:ilvl="2" w:tentative="1">
+      <w:start w:val="1"/>
+      <w:numFmt w:val="decimal"/>
+      <w:lvlText w:val="%3."/>
+      <w:lvlJc w:val="left"/>
+      <w:pPr>
+        <w:tabs>
+          <w:tab w:val="num" w:pos="2160"/>
+        </w:tabs>
+        <w:ind w:left="2160" w:hanging="360"/>
+      </w:pPr>
+    </w:lvl>
+    <w:lvl w:ilvl="3" w:tentative="1">
+      <w:start w:val="1"/>
+      <w:numFmt w:val="decimal"/>
+      <w:lvlText w:val="%4."/>
+      <w:lvlJc w:val="left"/>
+      <w:pPr>
+        <w:tabs>
+          <w:tab w:val="num" w:pos="2880"/>
+        </w:tabs>
+        <w:ind w:left="2880" w:hanging="360"/>
+      </w:pPr>
+    </w:lvl>
+    <w:lvl w:ilvl="4" w:tentative="1">
+      <w:start w:val="1"/>
+      <w:numFmt w:val="decimal"/>
+      <w:lvlText w:val="%5."/>
+      <w:lvlJc w:val="left"/>
+      <w:pPr>
+        <w:tabs>
+          <w:tab w:val="num" w:pos="3600"/>
+        </w:tabs>
+        <w:ind w:left="3600" w:hanging="360"/>
+      </w:pPr>
+    </w:lvl>
+    <w:lvl w:ilvl="5" w:tentative="1">
+      <w:start w:val="1"/>
+      <w:numFmt w:val="decimal"/>
+      <w:lvlText w:val="%6."/>
+      <w:lvlJc w:val="left"/>
+      <w:pPr>
+        <w:tabs>
+          <w:tab w:val="num" w:pos="4320"/>
+        </w:tabs>
+        <w:ind w:left="4320" w:hanging="360"/>
+      </w:pPr>
+    </w:lvl>
+    <w:lvl w:ilvl="6" w:tentative="1">
+      <w:start w:val="1"/>
+      <w:numFmt w:val="decimal"/>
+      <w:lvlText w:val="%7."/>
+      <w:lvlJc w:val="left"/>
+      <w:pPr>
+        <w:tabs>
+          <w:tab w:val="num" w:pos="5040"/>
+        </w:tabs>
+        <w:ind w:left="5040" w:hanging="360"/>
+      </w:pPr>
+    </w:lvl>
+    <w:lvl w:ilvl="7" w:tentative="1">
+      <w:start w:val="1"/>
+      <w:numFmt w:val="decimal"/>
+      <w:lvlText w:val="%8."/>
+      <w:lvlJc w:val="left"/>
+      <w:pPr>
+        <w:tabs>
+          <w:tab w:val="num" w:pos="5760"/>
+        </w:tabs>
+        <w:ind w:left="5760" w:hanging="360"/>
+      </w:pPr>
+    </w:lvl>
+    <w:lvl w:ilvl="8" w:tentative="1">
+      <w:start w:val="1"/>
+      <w:numFmt w:val="decimal"/>
+      <w:lvlText w:val="%9."/>
+      <w:lvlJc w:val="left"/>
+      <w:pPr>
+        <w:tabs>
+          <w:tab w:val="num" w:pos="6480"/>
+        </w:tabs>
+        <w:ind w:left="6480" w:hanging="360"/>
+      </w:pPr>
+    </w:lvl>
+  </w:abstractNum>
+  <w:abstractNum w:abstractNumId="1">
     <w:nsid w:val="5B5D3914"/>
     <w:multiLevelType w:val="multilevel"/>
     <w:tmpl w:val="0CA0B2CE"/>
@@ -5952,7 +6700,7 @@
       </w:pPr>
     </w:lvl>
   </w:abstractNum>
-  <w:abstractNum w:abstractNumId="1">
+  <w:abstractNum w:abstractNumId="2">
     <w:nsid w:val="61D74FDC"/>
     <w:multiLevelType w:val="multilevel"/>
     <w:tmpl w:val="E61A2A48"/>
@@ -6102,9 +6850,12 @@
     </w:lvl>
   </w:abstractNum>
   <w:num w:numId="1">
+    <w:abstractNumId w:val="2"/>
+  </w:num>
+  <w:num w:numId="2">
     <w:abstractNumId w:val="1"/>
   </w:num>
-  <w:num w:numId="2">
+  <w:num w:numId="3">
     <w:abstractNumId w:val="0"/>
   </w:num>
 </w:numbering>
@@ -6730,6 +7481,17 @@
     <w:basedOn w:val="DefaultParagraphFont"/>
     <w:rsid w:val="00DB76E5"/>
   </w:style>
+  <w:style w:type="character" w:styleId="Strong">
+    <w:name w:val="Strong"/>
+    <w:basedOn w:val="DefaultParagraphFont"/>
+    <w:uiPriority w:val="22"/>
+    <w:qFormat/>
+    <w:rsid w:val="00033E82"/>
+    <w:rPr>
+      <w:b/>
+      <w:bCs/>
+    </w:rPr>
+  </w:style>
 </w:styles>
 </file>
 

</xml_diff>

<commit_message>
ckeckpoint after penalize dlambda more than cap
</commit_message>
<xml_diff>
--- a/documentation/thesis notes.docx
+++ b/documentation/thesis notes.docx
@@ -12659,8 +12659,400 @@
         <w:t xml:space="preserve"> </w:t>
       </w:r>
     </w:p>
+    <w:p>
+      <w:r>
+        <w:t xml:space="preserve">Yes — the divergent </w:t>
+      </w:r>
+      <w:proofErr w:type="spellStart"/>
+      <w:r>
+        <w:t>G⁺w</w:t>
+      </w:r>
+      <w:proofErr w:type="spellEnd"/>
+      <w:r>
+        <w:t xml:space="preserve"> leaks into </w:t>
+      </w:r>
+      <w:proofErr w:type="gramStart"/>
+      <w:r>
+        <w:t>null(</w:t>
+      </w:r>
+      <w:proofErr w:type="gramEnd"/>
+      <w:r>
+        <w:t xml:space="preserve">G): each drone applies its own (G⁺ᵢ </w:t>
+      </w:r>
+      <w:proofErr w:type="spellStart"/>
+      <w:r>
+        <w:t>w_d,i</w:t>
+      </w:r>
+      <w:proofErr w:type="spellEnd"/>
+      <w:r>
+        <w:t xml:space="preserve">)ᵢ. If all four </w:t>
+      </w:r>
+      <w:proofErr w:type="spellStart"/>
+      <w:r>
+        <w:t>w_d</w:t>
+      </w:r>
+      <w:proofErr w:type="gramStart"/>
+      <w:r>
+        <w:t>,i</w:t>
+      </w:r>
+      <w:proofErr w:type="spellEnd"/>
+      <w:proofErr w:type="gramEnd"/>
+      <w:r>
+        <w:t xml:space="preserve"> agreed, the assembled 12-vector would be exactly </w:t>
+      </w:r>
+      <w:proofErr w:type="spellStart"/>
+      <w:r>
+        <w:t>G⁺w</w:t>
+      </w:r>
+      <w:proofErr w:type="spellEnd"/>
+      <w:r>
+        <w:t xml:space="preserve"> — which is pure range (orthogonal to null(G), zero null component). But because the </w:t>
+      </w:r>
+      <w:proofErr w:type="spellStart"/>
+      <w:r>
+        <w:t>w_d</w:t>
+      </w:r>
+      <w:proofErr w:type="gramStart"/>
+      <w:r>
+        <w:t>,i</w:t>
+      </w:r>
+      <w:proofErr w:type="spellEnd"/>
+      <w:proofErr w:type="gramEnd"/>
+      <w:r>
+        <w:t xml:space="preserve"> disagree, the assembled force is a patchwork that is not G⁺(anything) — so it has a nonzero null(G) component: </w:t>
+      </w:r>
+      <w:proofErr w:type="spellStart"/>
+      <w:r>
+        <w:t>F_null</w:t>
+      </w:r>
+      <w:proofErr w:type="spellEnd"/>
+      <w:r>
+        <w:t xml:space="preserve"> = (I − G⁺G)F ≠ 0. That null component is a real internal force that:</w:t>
+      </w:r>
+    </w:p>
     <w:p/>
     <w:p>
+      <w:proofErr w:type="gramStart"/>
+      <w:r>
+        <w:t>is</w:t>
+      </w:r>
+      <w:proofErr w:type="gramEnd"/>
+      <w:r>
+        <w:t xml:space="preserve"> invisible to the load (null(G)</w:t>
+      </w:r>
+      <w:r>
+        <w:t xml:space="preserve"> → zero wrench → load fine)</w:t>
+      </w:r>
+    </w:p>
+    <w:p>
+      <w:r>
+        <w:t xml:space="preserve">we were looking at the math at face value and forgetting this whole math falls apart once there's disagreement, lambda is not the whole </w:t>
+      </w:r>
+      <w:proofErr w:type="spellStart"/>
+      <w:r>
+        <w:t>nullspace</w:t>
+      </w:r>
+      <w:proofErr w:type="spellEnd"/>
+      <w:r>
+        <w:t xml:space="preserve"> anymore and the reason why the policy learnt to use </w:t>
+      </w:r>
+      <w:proofErr w:type="spellStart"/>
+      <w:r>
+        <w:t>dlambda</w:t>
+      </w:r>
+      <w:proofErr w:type="spellEnd"/>
+      <w:r>
+        <w:t xml:space="preserve"> is an attempt to cancel the forces that leaked into the </w:t>
+      </w:r>
+      <w:proofErr w:type="spellStart"/>
+      <w:r>
+        <w:t>nullspace</w:t>
+      </w:r>
+      <w:proofErr w:type="spellEnd"/>
+      <w:r>
+        <w:t xml:space="preserve"> using </w:t>
+      </w:r>
+      <w:proofErr w:type="gramStart"/>
+      <w:r>
+        <w:t>it ,</w:t>
+      </w:r>
+      <w:proofErr w:type="gramEnd"/>
+      <w:r>
+        <w:t xml:space="preserve"> and it learnt to use some </w:t>
+      </w:r>
+      <w:proofErr w:type="spellStart"/>
+      <w:r>
+        <w:t>dw</w:t>
+      </w:r>
+      <w:proofErr w:type="spellEnd"/>
+      <w:r>
+        <w:t xml:space="preserve"> </w:t>
+      </w:r>
+      <w:proofErr w:type="spellStart"/>
+      <w:r>
+        <w:t>i</w:t>
+      </w:r>
+      <w:proofErr w:type="spellEnd"/>
+      <w:r>
+        <w:t xml:space="preserve"> guess to attempt to learn some agreement</w:t>
+      </w:r>
+    </w:p>
+    <w:p>
+      <w:proofErr w:type="gramStart"/>
+      <w:r>
+        <w:t>still</w:t>
+      </w:r>
+      <w:proofErr w:type="gramEnd"/>
+      <w:r>
+        <w:t xml:space="preserve"> confused why did the RL not learn to use them properly but ok</w:t>
+      </w:r>
+    </w:p>
+    <w:p>
+      <w:proofErr w:type="gramStart"/>
+      <w:r>
+        <w:t>also</w:t>
+      </w:r>
+      <w:proofErr w:type="gramEnd"/>
+      <w:r>
+        <w:t xml:space="preserve"> big </w:t>
+      </w:r>
+      <w:proofErr w:type="spellStart"/>
+      <w:r>
+        <w:t>coord</w:t>
+      </w:r>
+      <w:proofErr w:type="spellEnd"/>
+      <w:r>
+        <w:t xml:space="preserve"> would be good then, because it's cancelling out the leak, but then it's not symmetrical across the drones so it's counter leaking into the load wrench subspace</w:t>
+      </w:r>
+    </w:p>
+    <w:p>
+      <w:proofErr w:type="spellStart"/>
+      <w:proofErr w:type="gramStart"/>
+      <w:r>
+        <w:lastRenderedPageBreak/>
+        <w:t>coord</w:t>
+      </w:r>
+      <w:proofErr w:type="spellEnd"/>
+      <w:proofErr w:type="gramEnd"/>
+      <w:r>
+        <w:t xml:space="preserve"> w and leak w are bad metrics, that’s why they are low but the drones are flying everywhere. They are much better at measuring counter leak in the load wrench space, but even then not perfect, because there are genuine null space forces being cancelled</w:t>
+      </w:r>
+    </w:p>
+    <w:p>
+      <w:proofErr w:type="gramStart"/>
+      <w:r>
+        <w:t>why</w:t>
+      </w:r>
+      <w:proofErr w:type="gramEnd"/>
+      <w:r>
+        <w:t xml:space="preserve"> RL alone has a hard time learning this </w:t>
+      </w:r>
+      <w:r>
+        <w:br/>
+      </w:r>
+      <w:r>
+        <w:t>Easier, more direct gradients capture the heads first. Gradient descent takes the steepest path, and there are two much steeper ones:</w:t>
+      </w:r>
+    </w:p>
+    <w:p/>
+    <w:p>
+      <w:proofErr w:type="spellStart"/>
+      <w:proofErr w:type="gramStart"/>
+      <w:r>
+        <w:t>dλ</w:t>
+      </w:r>
+      <w:proofErr w:type="spellEnd"/>
+      <w:proofErr w:type="gramEnd"/>
+      <w:r>
+        <w:t xml:space="preserve"> is a direct lever on loop. It moves drone position — which is the thing the loop error measures. So the "reduce loop" gradient flows most strongly into </w:t>
+      </w:r>
+      <w:proofErr w:type="spellStart"/>
+      <w:r>
+        <w:t>dλ</w:t>
+      </w:r>
+      <w:proofErr w:type="spellEnd"/>
+      <w:r>
+        <w:t xml:space="preserve"> (fix the symptom directly) rather than </w:t>
+      </w:r>
+      <w:proofErr w:type="spellStart"/>
+      <w:proofErr w:type="gramStart"/>
+      <w:r>
+        <w:t>dw</w:t>
+      </w:r>
+      <w:proofErr w:type="spellEnd"/>
+      <w:proofErr w:type="gramEnd"/>
+      <w:r>
+        <w:t xml:space="preserve"> (fix the cause indirectly). The reward can't tell "patched the symptom" from "fixed the cause" — both lower loop this step</w:t>
+      </w:r>
+      <w:r>
+        <w:t xml:space="preserve">, </w:t>
+      </w:r>
+      <w:r>
+        <w:t xml:space="preserve">and </w:t>
+      </w:r>
+      <w:proofErr w:type="spellStart"/>
+      <w:r>
+        <w:t>dλ</w:t>
+      </w:r>
+      <w:proofErr w:type="spellEnd"/>
+      <w:r>
+        <w:t xml:space="preserve"> has the stronger immediate gradient. So RL learns the whack-a-mole.</w:t>
+      </w:r>
+    </w:p>
+    <w:p>
+      <w:proofErr w:type="spellStart"/>
+      <w:proofErr w:type="gramStart"/>
+      <w:r>
+        <w:t>dw</w:t>
+      </w:r>
+      <w:proofErr w:type="spellEnd"/>
+      <w:proofErr w:type="gramEnd"/>
+      <w:r>
+        <w:t xml:space="preserve"> already has a clean local job: load-trim. </w:t>
+      </w:r>
+      <w:proofErr w:type="spellStart"/>
+      <w:proofErr w:type="gramStart"/>
+      <w:r>
+        <w:t>load_w</w:t>
+      </w:r>
+      <w:proofErr w:type="spellEnd"/>
+      <w:proofErr w:type="gramEnd"/>
+      <w:r>
+        <w:t xml:space="preserve"> directly rewards </w:t>
+      </w:r>
+      <w:proofErr w:type="spellStart"/>
+      <w:r>
+        <w:t>dw</w:t>
+      </w:r>
+      <w:proofErr w:type="spellEnd"/>
+      <w:r>
+        <w:t xml:space="preserve"> for reducing load error, a job </w:t>
+      </w:r>
+      <w:proofErr w:type="spellStart"/>
+      <w:r>
+        <w:t>dw</w:t>
+      </w:r>
+      <w:proofErr w:type="spellEnd"/>
+      <w:r>
+        <w:t xml:space="preserve"> can do alone with an observable, low-variance gradient. So </w:t>
+      </w:r>
+      <w:proofErr w:type="spellStart"/>
+      <w:proofErr w:type="gramStart"/>
+      <w:r>
+        <w:t>dw</w:t>
+      </w:r>
+      <w:proofErr w:type="spellEnd"/>
+      <w:proofErr w:type="gramEnd"/>
+      <w:r>
+        <w:t xml:space="preserve"> gets captured by the easy load-trim use, not the hard coordination use. (That's exactly what diagnose_f2 showed — </w:t>
+      </w:r>
+      <w:proofErr w:type="spellStart"/>
+      <w:proofErr w:type="gramStart"/>
+      <w:r>
+        <w:t>dw</w:t>
+      </w:r>
+      <w:proofErr w:type="spellEnd"/>
+      <w:proofErr w:type="gramEnd"/>
+      <w:r>
+        <w:t xml:space="preserve"> barely clipped, used for load, tracking carried by </w:t>
+      </w:r>
+      <w:proofErr w:type="spellStart"/>
+      <w:r>
+        <w:t>dλ</w:t>
+      </w:r>
+      <w:proofErr w:type="spellEnd"/>
+      <w:r>
+        <w:t>.)</w:t>
+      </w:r>
+    </w:p>
+    <w:p>
+      <w:r>
+        <w:t xml:space="preserve">Coordination-entanglement kills the per-agent gradient. This is the deep one, and it's why cooperative MARL is hard. Agreement is a joint action. If drone 1 alone shifts its </w:t>
+      </w:r>
+      <w:proofErr w:type="spellStart"/>
+      <w:r>
+        <w:t>w_d</w:t>
+      </w:r>
+      <w:proofErr w:type="spellEnd"/>
+      <w:r>
+        <w:t xml:space="preserve"> toward the truth while 2/3/4 stay noisy, that lone correction is asymmetric → it creates its own range/null imbalance → the loop barely improves (or worsens). So drone 1, holding the others fixed (which is what its policy gradient effectively assumes), sees ~no advantage for correcting → no gradient toward it. The un-coordinated state is a local equilibrium: the payoff only materializes if all four move together, </w:t>
+      </w:r>
+      <w:proofErr w:type="gramStart"/>
+      <w:r>
+        <w:t>and</w:t>
+      </w:r>
+      <w:r>
+        <w:t xml:space="preserve"> </w:t>
+      </w:r>
+      <w:r>
+        <w:t>,</w:t>
+      </w:r>
+      <w:proofErr w:type="gramEnd"/>
+      <w:r>
+        <w:t xml:space="preserve"> and independent policy gradients can't discover simultaneous-move </w:t>
+      </w:r>
+      <w:proofErr w:type="spellStart"/>
+      <w:r>
+        <w:t>equilibria</w:t>
+      </w:r>
+      <w:proofErr w:type="spellEnd"/>
+      <w:r>
+        <w:t>. Each agent greedily improving its own action doesn't get there.</w:t>
+      </w:r>
+    </w:p>
+    <w:p/>
+    <w:p>
+      <w:proofErr w:type="gramStart"/>
+      <w:r>
+        <w:t>what's</w:t>
+      </w:r>
+      <w:proofErr w:type="gramEnd"/>
+      <w:r>
+        <w:t xml:space="preserve"> the role of RL then, that no matter how good the estimate of </w:t>
+      </w:r>
+      <w:proofErr w:type="spellStart"/>
+      <w:r>
+        <w:t>wd</w:t>
+      </w:r>
+      <w:proofErr w:type="spellEnd"/>
+      <w:r>
+        <w:t xml:space="preserve">, it's not </w:t>
+      </w:r>
+      <w:proofErr w:type="spellStart"/>
+      <w:r>
+        <w:t>gonna</w:t>
+      </w:r>
+      <w:proofErr w:type="spellEnd"/>
+      <w:r>
+        <w:t xml:space="preserve"> be perfect, learn to find a good balance of these rewards given the </w:t>
+      </w:r>
+      <w:proofErr w:type="spellStart"/>
+      <w:r>
+        <w:t>uncertainity</w:t>
+      </w:r>
+      <w:proofErr w:type="spellEnd"/>
+      <w:r>
+        <w:t xml:space="preserve"> </w:t>
+      </w:r>
+    </w:p>
+    <w:p>
+      <w:proofErr w:type="gramStart"/>
+      <w:r>
+        <w:t>clean</w:t>
+      </w:r>
+      <w:proofErr w:type="gramEnd"/>
+    </w:p>
+    <w:p>
+      <w:proofErr w:type="gramStart"/>
+      <w:r>
+        <w:t>classical</w:t>
+      </w:r>
+      <w:proofErr w:type="gramEnd"/>
+      <w:r>
+        <w:t xml:space="preserve"> estimation hits a wall (KF dead-end), supervised consistency scaffolds the coordination that decentralized RL can't discover, and RL's unique contribution is the hedged control under the residual, unresolvable disagreement that neither estimation nor imitation can handle. RL isn't demoted here — it's finally pointed at the thing it's actually good at, instead of being asked to also solve a coordination-discovery problem it structurally can't.</w:t>
+      </w:r>
+    </w:p>
+    <w:p>
       <w:pPr>
         <w:rPr>
           <w:sz w:val="24"/>
@@ -12770,6 +13162,7 @@
           <w:szCs w:val="24"/>
           <w:lang w:bidi="ar-EG"/>
         </w:rPr>
+        <w:lastRenderedPageBreak/>
         <w:t>And the hard stall constraint (fixed-wing min airspeed) couples nastily to all of it — a classical law that regulates loiter can drive a drone below stall.</w:t>
       </w:r>
     </w:p>
@@ -12801,11 +13194,7 @@
     </w:p>
     <w:p>
       <w:r>
-        <w:t xml:space="preserve">An explicit state estimator was not employed to reconstruct the load state from the available observations. The load measurements are affected by an unknown but bounded delay and temporally </w:t>
-      </w:r>
-      <w:r>
-        <w:lastRenderedPageBreak/>
-        <w:t>correlated noise. Designing an explicit observer would therefore require additional assumptions and modeling of the observation process, including the delayed measurements and correlated noise. Instead, the proposed approach investigates whether the policy can learn to extract the information required for control directly from the observations, without requiring an intermediate estimate of the full system state.</w:t>
+        <w:t>An explicit state estimator was not employed to reconstruct the load state from the available observations. The load measurements are affected by an unknown but bounded delay and temporally correlated noise. Designing an explicit observer would therefore require additional assumptions and modeling of the observation process, including the delayed measurements and correlated noise. Instead, the proposed approach investigates whether the policy can learn to extract the information required for control directly from the observations, without requiring an intermediate estimate of the full system state.</w:t>
       </w:r>
     </w:p>
     <w:p>
@@ -12829,8 +13218,6 @@
       <w:r>
         <w:t>.</w:t>
       </w:r>
-      <w:bookmarkStart w:id="0" w:name="_GoBack"/>
-      <w:bookmarkEnd w:id="0"/>
     </w:p>
     <w:sectPr>
       <w:pgSz w:w="12240" w:h="15840"/>

</xml_diff>